<commit_message>
Update Relatório Final PIVIC
</commit_message>
<xml_diff>
--- a/Relatorio Final PIVIC - Alexandre Júnior.docx
+++ b/Relatorio Final PIVIC - Alexandre Júnior.docx
@@ -1,6 +1,6 @@
 
 <file path=word/document.xml><?xml version="1.0" encoding="utf-8"?>
-<w:document xmlns:ve="http://schemas.openxmlformats.org/markup-compatibility/2006" xmlns:o="urn:schemas-microsoft-com:office:office" xmlns:r="http://schemas.openxmlformats.org/officeDocument/2006/relationships" xmlns:m="http://schemas.openxmlformats.org/officeDocument/2006/math" xmlns:v="urn:schemas-microsoft-com:vml" xmlns:wp="http://schemas.openxmlformats.org/drawingml/2006/wordprocessingDrawing" xmlns:w10="urn:schemas-microsoft-com:office:word" xmlns:w="http://schemas.openxmlformats.org/wordprocessingml/2006/main" xmlns:wne="http://schemas.microsoft.com/office/word/2006/wordml">
+<w:document xmlns:wpc="http://schemas.microsoft.com/office/word/2010/wordprocessingCanvas" xmlns:cx="http://schemas.microsoft.com/office/drawing/2014/chartex" xmlns:cx1="http://schemas.microsoft.com/office/drawing/2015/9/8/chartex" xmlns:cx2="http://schemas.microsoft.com/office/drawing/2015/10/21/chartex" xmlns:cx3="http://schemas.microsoft.com/office/drawing/2016/5/9/chartex" xmlns:cx4="http://schemas.microsoft.com/office/drawing/2016/5/10/chartex" xmlns:cx5="http://schemas.microsoft.com/office/drawing/2016/5/11/chartex" xmlns:cx6="http://schemas.microsoft.com/office/drawing/2016/5/12/chartex" xmlns:cx7="http://schemas.microsoft.com/office/drawing/2016/5/13/chartex" xmlns:cx8="http://schemas.microsoft.com/office/drawing/2016/5/14/chartex" xmlns:mc="http://schemas.openxmlformats.org/markup-compatibility/2006" xmlns:aink="http://schemas.microsoft.com/office/drawing/2016/ink" xmlns:am3d="http://schemas.microsoft.com/office/drawing/2017/model3d" xmlns:o="urn:schemas-microsoft-com:office:office" xmlns:r="http://schemas.openxmlformats.org/officeDocument/2006/relationships" xmlns:m="http://schemas.openxmlformats.org/officeDocument/2006/math" xmlns:v="urn:schemas-microsoft-com:vml" xmlns:wp14="http://schemas.microsoft.com/office/word/2010/wordprocessingDrawing" xmlns:wp="http://schemas.openxmlformats.org/drawingml/2006/wordprocessingDrawing" xmlns:w10="urn:schemas-microsoft-com:office:word" xmlns:w="http://schemas.openxmlformats.org/wordprocessingml/2006/main" xmlns:w14="http://schemas.microsoft.com/office/word/2010/wordml" xmlns:w15="http://schemas.microsoft.com/office/word/2012/wordml" xmlns:w16cex="http://schemas.microsoft.com/office/word/2018/wordml/cex" xmlns:w16cid="http://schemas.microsoft.com/office/word/2016/wordml/cid" xmlns:w16="http://schemas.microsoft.com/office/word/2018/wordml" xmlns:w16sdtdh="http://schemas.microsoft.com/office/word/2020/wordml/sdtdatahash" xmlns:w16se="http://schemas.microsoft.com/office/word/2015/wordml/symex" xmlns:wpg="http://schemas.microsoft.com/office/word/2010/wordprocessingGroup" xmlns:wpi="http://schemas.microsoft.com/office/word/2010/wordprocessingInk" xmlns:wne="http://schemas.microsoft.com/office/word/2006/wordml" xmlns:wps="http://schemas.microsoft.com/office/word/2010/wordprocessingShape" mc:Ignorable="w14 w15 w16se w16cid w16 w16cex w16sdtdh wp14">
   <w:body>
     <w:p>
       <w:pPr>
@@ -12,7 +12,7 @@
           <w:lang w:eastAsia="pt-BR"/>
         </w:rPr>
         <w:drawing>
-          <wp:inline distT="0" distB="0" distL="0" distR="0">
+          <wp:inline distT="0" distB="0" distL="0" distR="0" wp14:anchorId="4160AE6B" wp14:editId="35101FAE">
             <wp:extent cx="2999238" cy="1219202"/>
             <wp:effectExtent l="0" t="0" r="0" b="0"/>
             <wp:docPr id="2" name="Imagem 1" descr="Logotipo&#10;&#10;Descrição gerada automaticamente"/>
@@ -30,7 +30,7 @@
                     <a:blip r:embed="rId7" cstate="print">
                       <a:extLst>
                         <a:ext uri="{28A0092B-C50C-407E-A947-70E740481C1C}">
-                          <a14:useLocalDpi xmlns:a14="http://schemas.microsoft.com/office/drawing/2010/main" xmlns:wps="http://schemas.microsoft.com/office/word/2010/wordprocessingShape" xmlns:wpi="http://schemas.microsoft.com/office/word/2010/wordprocessingInk" xmlns:wpg="http://schemas.microsoft.com/office/word/2010/wordprocessingGroup" xmlns:w16se="http://schemas.microsoft.com/office/word/2015/wordml/symex" xmlns:w16sdtfl="http://schemas.microsoft.com/office/word/2024/wordml/sdtformatlock" xmlns:w16sdtdh="http://schemas.microsoft.com/office/word/2020/wordml/sdtdatahash" xmlns:w16du="http://schemas.microsoft.com/office/word/2023/wordml/word16du" xmlns:w16="http://schemas.microsoft.com/office/word/2018/wordml" xmlns:w16cid="http://schemas.microsoft.com/office/word/2016/wordml/cid" xmlns:w16cex="http://schemas.microsoft.com/office/word/2018/wordml/cex" xmlns:w15="http://schemas.microsoft.com/office/word/2012/wordml" xmlns:w14="http://schemas.microsoft.com/office/word/2010/wordml" xmlns:w="http://schemas.openxmlformats.org/wordprocessingml/2006/main" xmlns:w10="urn:schemas-microsoft-com:office:word" xmlns:wp14="http://schemas.microsoft.com/office/word/2010/wordprocessingDrawing" xmlns:v="urn:schemas-microsoft-com:vml" xmlns:oel="http://schemas.microsoft.com/office/2019/extlst" xmlns:o="urn:schemas-microsoft-com:office:office" xmlns:am3d="http://schemas.microsoft.com/office/drawing/2017/model3d" xmlns:aink="http://schemas.microsoft.com/office/drawing/2016/ink" xmlns:mc="http://schemas.openxmlformats.org/markup-compatibility/2006" xmlns:cx8="http://schemas.microsoft.com/office/drawing/2016/5/14/chartex" xmlns:cx7="http://schemas.microsoft.com/office/drawing/2016/5/13/chartex" xmlns:cx6="http://schemas.microsoft.com/office/drawing/2016/5/12/chartex" xmlns:cx5="http://schemas.microsoft.com/office/drawing/2016/5/11/chartex" xmlns:cx4="http://schemas.microsoft.com/office/drawing/2016/5/10/chartex" xmlns:cx3="http://schemas.microsoft.com/office/drawing/2016/5/9/chartex" xmlns:cx2="http://schemas.microsoft.com/office/drawing/2015/10/21/chartex" xmlns:cx1="http://schemas.microsoft.com/office/drawing/2015/9/8/chartex" xmlns:cx="http://schemas.microsoft.com/office/drawing/2014/chartex" xmlns:wpc="http://schemas.microsoft.com/office/word/2010/wordprocessingCanvas" xmlns="" val="0"/>
+                          <a14:useLocalDpi xmlns:a14="http://schemas.microsoft.com/office/drawing/2010/main" val="0"/>
                         </a:ext>
                       </a:extLst>
                     </a:blip>
@@ -431,13 +431,7 @@
         <w:jc w:val="center"/>
       </w:pPr>
       <w:r>
-        <w:t>Março</w:t>
-      </w:r>
-      <w:r>
-        <w:t xml:space="preserve"> de </w:t>
-      </w:r>
-      <w:r>
-        <w:t>2026</w:t>
+        <w:t>Março de 2026</w:t>
       </w:r>
       <w:r>
         <w:br w:type="page"/>
@@ -500,6 +494,9 @@
             <w:pStyle w:val="Sumrio1"/>
             <w:rPr>
               <w:rFonts w:eastAsiaTheme="minorEastAsia" w:cstheme="minorBidi"/>
+              <w:b w:val="0"/>
+              <w:bCs w:val="0"/>
+              <w:caps w:val="0"/>
               <w:kern w:val="0"/>
               <w:sz w:val="22"/>
               <w:szCs w:val="22"/>
@@ -536,7 +533,7 @@
             </w:rPr>
             <w:fldChar w:fldCharType="separate"/>
           </w:r>
-          <w:hyperlink w:anchor="_Toc200029176" w:history="1">
+          <w:hyperlink w:anchor="_Toc224942094" w:history="1">
             <w:r>
               <w:rPr>
                 <w:rStyle w:val="Hyperlink"/>
@@ -546,6 +543,9 @@
             <w:r>
               <w:rPr>
                 <w:rFonts w:eastAsiaTheme="minorEastAsia" w:cstheme="minorBidi"/>
+                <w:b w:val="0"/>
+                <w:bCs w:val="0"/>
+                <w:caps w:val="0"/>
                 <w:kern w:val="0"/>
                 <w:sz w:val="22"/>
                 <w:szCs w:val="22"/>
@@ -575,7 +575,7 @@
               <w:rPr>
                 <w:webHidden/>
               </w:rPr>
-              <w:instrText xml:space="preserve"> PAGEREF _Toc200029176 \h </w:instrText>
+              <w:instrText xml:space="preserve"> PAGEREF _Toc224942094 \h </w:instrText>
             </w:r>
             <w:r>
               <w:rPr>
@@ -607,13 +607,16 @@
             <w:pStyle w:val="Sumrio1"/>
             <w:rPr>
               <w:rFonts w:eastAsiaTheme="minorEastAsia" w:cstheme="minorBidi"/>
+              <w:b w:val="0"/>
+              <w:bCs w:val="0"/>
+              <w:caps w:val="0"/>
               <w:kern w:val="0"/>
               <w:sz w:val="22"/>
               <w:szCs w:val="22"/>
               <w:lang w:eastAsia="pt-BR"/>
             </w:rPr>
           </w:pPr>
-          <w:hyperlink w:anchor="_Toc200029177" w:history="1">
+          <w:hyperlink w:anchor="_Toc224942095" w:history="1">
             <w:r>
               <w:rPr>
                 <w:rStyle w:val="Hyperlink"/>
@@ -623,6 +626,9 @@
             <w:r>
               <w:rPr>
                 <w:rFonts w:eastAsiaTheme="minorEastAsia" w:cstheme="minorBidi"/>
+                <w:b w:val="0"/>
+                <w:bCs w:val="0"/>
+                <w:caps w:val="0"/>
                 <w:kern w:val="0"/>
                 <w:sz w:val="22"/>
                 <w:szCs w:val="22"/>
@@ -652,7 +658,7 @@
               <w:rPr>
                 <w:webHidden/>
               </w:rPr>
-              <w:instrText xml:space="preserve"> PAGEREF _Toc200029177 \h </w:instrText>
+              <w:instrText xml:space="preserve"> PAGEREF _Toc224942095 \h </w:instrText>
             </w:r>
             <w:r>
               <w:rPr>
@@ -669,7 +675,7 @@
               <w:rPr>
                 <w:webHidden/>
               </w:rPr>
-              <w:t>6</w:t>
+              <w:t>4</w:t>
             </w:r>
             <w:r>
               <w:rPr>
@@ -684,13 +690,16 @@
             <w:pStyle w:val="Sumrio1"/>
             <w:rPr>
               <w:rFonts w:eastAsiaTheme="minorEastAsia" w:cstheme="minorBidi"/>
+              <w:b w:val="0"/>
+              <w:bCs w:val="0"/>
+              <w:caps w:val="0"/>
               <w:kern w:val="0"/>
               <w:sz w:val="22"/>
               <w:szCs w:val="22"/>
               <w:lang w:eastAsia="pt-BR"/>
             </w:rPr>
           </w:pPr>
-          <w:hyperlink w:anchor="_Toc200029178" w:history="1">
+          <w:hyperlink w:anchor="_Toc224942096" w:history="1">
             <w:r>
               <w:rPr>
                 <w:rStyle w:val="Hyperlink"/>
@@ -700,6 +709,9 @@
             <w:r>
               <w:rPr>
                 <w:rFonts w:eastAsiaTheme="minorEastAsia" w:cstheme="minorBidi"/>
+                <w:b w:val="0"/>
+                <w:bCs w:val="0"/>
+                <w:caps w:val="0"/>
                 <w:kern w:val="0"/>
                 <w:sz w:val="22"/>
                 <w:szCs w:val="22"/>
@@ -729,7 +741,7 @@
               <w:rPr>
                 <w:webHidden/>
               </w:rPr>
-              <w:instrText xml:space="preserve"> PAGEREF _Toc200029178 \h </w:instrText>
+              <w:instrText xml:space="preserve"> PAGEREF _Toc224942096 \h </w:instrText>
             </w:r>
             <w:r>
               <w:rPr>
@@ -746,7 +758,7 @@
               <w:rPr>
                 <w:webHidden/>
               </w:rPr>
-              <w:t>7</w:t>
+              <w:t>4</w:t>
             </w:r>
             <w:r>
               <w:rPr>
@@ -770,7 +782,7 @@
               <w:lang w:eastAsia="pt-BR"/>
             </w:rPr>
           </w:pPr>
-          <w:hyperlink w:anchor="_Toc200029208" w:history="1">
+          <w:hyperlink w:anchor="_Toc224942097" w:history="1">
             <w:r>
               <w:rPr>
                 <w:rStyle w:val="Hyperlink"/>
@@ -794,7 +806,19 @@
               <w:rPr>
                 <w:rStyle w:val="Hyperlink"/>
               </w:rPr>
-              <w:t>Instrumentação do sistema de medição de energia</w:t>
+              <w:t>Seleção do S</w:t>
+            </w:r>
+            <w:r>
+              <w:rPr>
+                <w:rStyle w:val="Hyperlink"/>
+              </w:rPr>
+              <w:t>e</w:t>
+            </w:r>
+            <w:r>
+              <w:rPr>
+                <w:rStyle w:val="Hyperlink"/>
+              </w:rPr>
+              <w:t>nsor de Corrente e Cálculo de Demanda</w:t>
             </w:r>
             <w:r>
               <w:rPr>
@@ -812,7 +836,7 @@
               <w:rPr>
                 <w:webHidden/>
               </w:rPr>
-              <w:instrText xml:space="preserve"> PAGEREF _Toc200029208 \h </w:instrText>
+              <w:instrText xml:space="preserve"> PAGEREF _Toc224942097 \h </w:instrText>
             </w:r>
             <w:r>
               <w:rPr>
@@ -829,7 +853,7 @@
               <w:rPr>
                 <w:webHidden/>
               </w:rPr>
-              <w:t>7</w:t>
+              <w:t>4</w:t>
             </w:r>
             <w:r>
               <w:rPr>
@@ -853,7 +877,7 @@
               <w:lang w:eastAsia="pt-BR"/>
             </w:rPr>
           </w:pPr>
-          <w:hyperlink w:anchor="_Toc200029209" w:history="1">
+          <w:hyperlink w:anchor="_Toc224942098" w:history="1">
             <w:r>
               <w:rPr>
                 <w:rStyle w:val="Hyperlink"/>
@@ -877,7 +901,19 @@
               <w:rPr>
                 <w:rStyle w:val="Hyperlink"/>
               </w:rPr>
-              <w:t>Desenvolvimento do sistema de estimação de consumo</w:t>
+              <w:t>Condicio</w:t>
+            </w:r>
+            <w:r>
+              <w:rPr>
+                <w:rStyle w:val="Hyperlink"/>
+              </w:rPr>
+              <w:t>n</w:t>
+            </w:r>
+            <w:r>
+              <w:rPr>
+                <w:rStyle w:val="Hyperlink"/>
+              </w:rPr>
+              <w:t>amento do Sinal de Corrente</w:t>
             </w:r>
             <w:r>
               <w:rPr>
@@ -895,7 +931,7 @@
               <w:rPr>
                 <w:webHidden/>
               </w:rPr>
-              <w:instrText xml:space="preserve"> PAGEREF _Toc200029209 \h </w:instrText>
+              <w:instrText xml:space="preserve"> PAGEREF _Toc224942098 \h </w:instrText>
             </w:r>
             <w:r>
               <w:rPr>
@@ -912,7 +948,7 @@
               <w:rPr>
                 <w:webHidden/>
               </w:rPr>
-              <w:t>7</w:t>
+              <w:t>5</w:t>
             </w:r>
             <w:r>
               <w:rPr>
@@ -936,7 +972,7 @@
               <w:lang w:eastAsia="pt-BR"/>
             </w:rPr>
           </w:pPr>
-          <w:hyperlink w:anchor="_Toc200029210" w:history="1">
+          <w:hyperlink w:anchor="_Toc224942099" w:history="1">
             <w:r>
               <w:rPr>
                 <w:rStyle w:val="Hyperlink"/>
@@ -960,7 +996,19 @@
               <w:rPr>
                 <w:rStyle w:val="Hyperlink"/>
               </w:rPr>
-              <w:t>Análise e modelagem da relação entre demanda e topologia da rota</w:t>
+              <w:t xml:space="preserve">Medição do </w:t>
+            </w:r>
+            <w:r>
+              <w:rPr>
+                <w:rStyle w:val="Hyperlink"/>
+              </w:rPr>
+              <w:t>N</w:t>
+            </w:r>
+            <w:r>
+              <w:rPr>
+                <w:rStyle w:val="Hyperlink"/>
+              </w:rPr>
+              <w:t>ível de Tensão da Bateria</w:t>
             </w:r>
             <w:r>
               <w:rPr>
@@ -978,7 +1026,7 @@
               <w:rPr>
                 <w:webHidden/>
               </w:rPr>
-              <w:instrText xml:space="preserve"> PAGEREF _Toc200029210 \h </w:instrText>
+              <w:instrText xml:space="preserve"> PAGEREF _Toc224942099 \h </w:instrText>
             </w:r>
             <w:r>
               <w:rPr>
@@ -995,7 +1043,7 @@
               <w:rPr>
                 <w:webHidden/>
               </w:rPr>
-              <w:t>8</w:t>
+              <w:t>7</w:t>
             </w:r>
             <w:r>
               <w:rPr>
@@ -1019,7 +1067,7 @@
               <w:lang w:eastAsia="pt-BR"/>
             </w:rPr>
           </w:pPr>
-          <w:hyperlink w:anchor="_Toc200029211" w:history="1">
+          <w:hyperlink w:anchor="_Toc224942100" w:history="1">
             <w:r>
               <w:rPr>
                 <w:rStyle w:val="Hyperlink"/>
@@ -1043,7 +1091,19 @@
               <w:rPr>
                 <w:rStyle w:val="Hyperlink"/>
               </w:rPr>
-              <w:t>Validação experimental e refinamento do modelo</w:t>
+              <w:t>Simulação e Des</w:t>
+            </w:r>
+            <w:r>
+              <w:rPr>
+                <w:rStyle w:val="Hyperlink"/>
+              </w:rPr>
+              <w:t>e</w:t>
+            </w:r>
+            <w:r>
+              <w:rPr>
+                <w:rStyle w:val="Hyperlink"/>
+              </w:rPr>
+              <w:t>nvolvimento de Software</w:t>
             </w:r>
             <w:r>
               <w:rPr>
@@ -1061,7 +1121,7 @@
               <w:rPr>
                 <w:webHidden/>
               </w:rPr>
-              <w:instrText xml:space="preserve"> PAGEREF _Toc200029211 \h </w:instrText>
+              <w:instrText xml:space="preserve"> PAGEREF _Toc224942100 \h </w:instrText>
             </w:r>
             <w:r>
               <w:rPr>
@@ -1078,173 +1138,7 @@
               <w:rPr>
                 <w:webHidden/>
               </w:rPr>
-              <w:t>8</w:t>
-            </w:r>
-            <w:r>
-              <w:rPr>
-                <w:webHidden/>
-              </w:rPr>
-              <w:fldChar w:fldCharType="end"/>
-            </w:r>
-          </w:hyperlink>
-        </w:p>
-        <w:p>
-          <w:pPr>
-            <w:pStyle w:val="Sumrio2"/>
-            <w:rPr>
-              <w:rFonts w:eastAsiaTheme="minorEastAsia" w:cstheme="minorBidi"/>
-              <w:b w:val="0"/>
-              <w:bCs w:val="0"/>
-              <w:smallCaps w:val="0"/>
-              <w:kern w:val="0"/>
-              <w:sz w:val="22"/>
-              <w:szCs w:val="22"/>
-              <w:lang w:eastAsia="pt-BR"/>
-            </w:rPr>
-          </w:pPr>
-          <w:hyperlink w:anchor="_Toc200029212" w:history="1">
-            <w:r>
-              <w:rPr>
-                <w:rStyle w:val="Hyperlink"/>
-              </w:rPr>
-              <w:t>3.5.</w:t>
-            </w:r>
-            <w:r>
-              <w:rPr>
-                <w:rFonts w:eastAsiaTheme="minorEastAsia" w:cstheme="minorBidi"/>
-                <w:b w:val="0"/>
-                <w:bCs w:val="0"/>
-                <w:smallCaps w:val="0"/>
-                <w:kern w:val="0"/>
-                <w:sz w:val="22"/>
-                <w:szCs w:val="22"/>
-                <w:lang w:eastAsia="pt-BR"/>
-              </w:rPr>
-              <w:tab/>
-            </w:r>
-            <w:r>
-              <w:rPr>
-                <w:rStyle w:val="Hyperlink"/>
-              </w:rPr>
-              <w:t>Integração dos dados de consumo energético com a interface gráfica</w:t>
-            </w:r>
-            <w:r>
-              <w:rPr>
-                <w:webHidden/>
-              </w:rPr>
-              <w:tab/>
-            </w:r>
-            <w:r>
-              <w:rPr>
-                <w:webHidden/>
-              </w:rPr>
-              <w:fldChar w:fldCharType="begin"/>
-            </w:r>
-            <w:r>
-              <w:rPr>
-                <w:webHidden/>
-              </w:rPr>
-              <w:instrText xml:space="preserve"> PAGEREF _Toc200029212 \h </w:instrText>
-            </w:r>
-            <w:r>
-              <w:rPr>
-                <w:webHidden/>
-              </w:rPr>
-            </w:r>
-            <w:r>
-              <w:rPr>
-                <w:webHidden/>
-              </w:rPr>
-              <w:fldChar w:fldCharType="separate"/>
-            </w:r>
-            <w:r>
-              <w:rPr>
-                <w:webHidden/>
-              </w:rPr>
-              <w:t>9</w:t>
-            </w:r>
-            <w:r>
-              <w:rPr>
-                <w:webHidden/>
-              </w:rPr>
-              <w:fldChar w:fldCharType="end"/>
-            </w:r>
-          </w:hyperlink>
-        </w:p>
-        <w:p>
-          <w:pPr>
-            <w:pStyle w:val="Sumrio2"/>
-            <w:rPr>
-              <w:rFonts w:eastAsiaTheme="minorEastAsia" w:cstheme="minorBidi"/>
-              <w:b w:val="0"/>
-              <w:bCs w:val="0"/>
-              <w:smallCaps w:val="0"/>
-              <w:kern w:val="0"/>
-              <w:sz w:val="22"/>
-              <w:szCs w:val="22"/>
-              <w:lang w:eastAsia="pt-BR"/>
-            </w:rPr>
-          </w:pPr>
-          <w:hyperlink w:anchor="_Toc200029213" w:history="1">
-            <w:r>
-              <w:rPr>
-                <w:rStyle w:val="Hyperlink"/>
-              </w:rPr>
-              <w:t>3.6.</w:t>
-            </w:r>
-            <w:r>
-              <w:rPr>
-                <w:rFonts w:eastAsiaTheme="minorEastAsia" w:cstheme="minorBidi"/>
-                <w:b w:val="0"/>
-                <w:bCs w:val="0"/>
-                <w:smallCaps w:val="0"/>
-                <w:kern w:val="0"/>
-                <w:sz w:val="22"/>
-                <w:szCs w:val="22"/>
-                <w:lang w:eastAsia="pt-BR"/>
-              </w:rPr>
-              <w:tab/>
-            </w:r>
-            <w:r>
-              <w:rPr>
-                <w:rStyle w:val="Hyperlink"/>
-              </w:rPr>
-              <w:t>Comparação com modelos de consumo da literatura</w:t>
-            </w:r>
-            <w:r>
-              <w:rPr>
-                <w:webHidden/>
-              </w:rPr>
-              <w:tab/>
-            </w:r>
-            <w:r>
-              <w:rPr>
-                <w:webHidden/>
-              </w:rPr>
-              <w:fldChar w:fldCharType="begin"/>
-            </w:r>
-            <w:r>
-              <w:rPr>
-                <w:webHidden/>
-              </w:rPr>
-              <w:instrText xml:space="preserve"> PAGEREF _Toc200029213 \h </w:instrText>
-            </w:r>
-            <w:r>
-              <w:rPr>
-                <w:webHidden/>
-              </w:rPr>
-            </w:r>
-            <w:r>
-              <w:rPr>
-                <w:webHidden/>
-              </w:rPr>
-              <w:fldChar w:fldCharType="separate"/>
-            </w:r>
-            <w:r>
-              <w:rPr>
-                <w:webHidden/>
-              </w:rPr>
-              <w:t>9</w:t>
+              <w:t>7</w:t>
             </w:r>
             <w:r>
               <w:rPr>
@@ -1259,13 +1153,16 @@
             <w:pStyle w:val="Sumrio1"/>
             <w:rPr>
               <w:rFonts w:eastAsiaTheme="minorEastAsia" w:cstheme="minorBidi"/>
+              <w:b w:val="0"/>
+              <w:bCs w:val="0"/>
+              <w:caps w:val="0"/>
               <w:kern w:val="0"/>
               <w:sz w:val="22"/>
               <w:szCs w:val="22"/>
               <w:lang w:eastAsia="pt-BR"/>
             </w:rPr>
           </w:pPr>
-          <w:hyperlink w:anchor="_Toc200029214" w:history="1">
+          <w:hyperlink w:anchor="_Toc224942101" w:history="1">
             <w:r>
               <w:rPr>
                 <w:rStyle w:val="Hyperlink"/>
@@ -1275,6 +1172,9 @@
             <w:r>
               <w:rPr>
                 <w:rFonts w:eastAsiaTheme="minorEastAsia" w:cstheme="minorBidi"/>
+                <w:b w:val="0"/>
+                <w:bCs w:val="0"/>
+                <w:caps w:val="0"/>
                 <w:kern w:val="0"/>
                 <w:sz w:val="22"/>
                 <w:szCs w:val="22"/>
@@ -1286,7 +1186,19 @@
               <w:rPr>
                 <w:rStyle w:val="Hyperlink"/>
               </w:rPr>
-              <w:t>Resultados e Discussões</w:t>
+              <w:t>Resultados e Discus</w:t>
+            </w:r>
+            <w:r>
+              <w:rPr>
+                <w:rStyle w:val="Hyperlink"/>
+              </w:rPr>
+              <w:t>s</w:t>
+            </w:r>
+            <w:r>
+              <w:rPr>
+                <w:rStyle w:val="Hyperlink"/>
+              </w:rPr>
+              <w:t>ões</w:t>
             </w:r>
             <w:r>
               <w:rPr>
@@ -1304,7 +1216,7 @@
               <w:rPr>
                 <w:webHidden/>
               </w:rPr>
-              <w:instrText xml:space="preserve"> PAGEREF _Toc200029214 \h </w:instrText>
+              <w:instrText xml:space="preserve"> PAGEREF _Toc224942101 \h </w:instrText>
             </w:r>
             <w:r>
               <w:rPr>
@@ -1321,7 +1233,7 @@
               <w:rPr>
                 <w:webHidden/>
               </w:rPr>
-              <w:t>10</w:t>
+              <w:t>9</w:t>
             </w:r>
             <w:r>
               <w:rPr>
@@ -1335,73 +1247,124 @@
           <w:pPr>
             <w:pStyle w:val="Sumrio1"/>
             <w:rPr>
-              <w:rStyle w:val="Hyperlink"/>
-              <w:color w:val="auto"/>
-              <w:u w:val="none"/>
+              <w:rFonts w:eastAsiaTheme="minorEastAsia" w:cstheme="minorBidi"/>
+              <w:b w:val="0"/>
+              <w:bCs w:val="0"/>
+              <w:caps w:val="0"/>
+              <w:kern w:val="0"/>
+              <w:sz w:val="22"/>
+              <w:szCs w:val="22"/>
+              <w:lang w:eastAsia="pt-BR"/>
             </w:rPr>
           </w:pPr>
-          <w:r>
-            <w:rPr>
-              <w:rStyle w:val="Hyperlink"/>
-              <w:color w:val="auto"/>
-              <w:u w:val="none"/>
-            </w:rPr>
-            <w:t xml:space="preserve">5. </w:t>
-          </w:r>
-          <w:r>
-            <w:rPr>
-              <w:rStyle w:val="Hyperlink"/>
-              <w:color w:val="auto"/>
-              <w:u w:val="none"/>
-            </w:rPr>
-            <w:tab/>
-          </w:r>
-          <w:r>
-            <w:rPr>
-              <w:rStyle w:val="Hyperlink"/>
-              <w:color w:val="auto"/>
-              <w:u w:val="none"/>
-            </w:rPr>
-            <w:t>Conclusão e trabalhos futuros.............................................................</w:t>
-          </w:r>
-          <w:r>
-            <w:rPr>
-              <w:rStyle w:val="Hyperlink"/>
-              <w:color w:val="auto"/>
-              <w:u w:val="none"/>
-            </w:rPr>
-            <w:t xml:space="preserve">.......................... </w:t>
-          </w:r>
-          <w:r>
-            <w:rPr>
-              <w:rStyle w:val="Hyperlink"/>
-              <w:color w:val="auto"/>
-              <w:u w:val="none"/>
-            </w:rPr>
-            <w:t>xx</w:t>
-          </w:r>
+          <w:hyperlink w:anchor="_Toc224942102" w:history="1">
+            <w:r>
+              <w:rPr>
+                <w:rStyle w:val="Hyperlink"/>
+              </w:rPr>
+              <w:t>5.</w:t>
+            </w:r>
+            <w:r>
+              <w:rPr>
+                <w:rFonts w:eastAsiaTheme="minorEastAsia" w:cstheme="minorBidi"/>
+                <w:b w:val="0"/>
+                <w:bCs w:val="0"/>
+                <w:caps w:val="0"/>
+                <w:kern w:val="0"/>
+                <w:sz w:val="22"/>
+                <w:szCs w:val="22"/>
+                <w:lang w:eastAsia="pt-BR"/>
+              </w:rPr>
+              <w:tab/>
+            </w:r>
+            <w:r>
+              <w:rPr>
+                <w:rStyle w:val="Hyperlink"/>
+              </w:rPr>
+              <w:t>Conclusão e T</w:t>
+            </w:r>
+            <w:r>
+              <w:rPr>
+                <w:rStyle w:val="Hyperlink"/>
+              </w:rPr>
+              <w:t>r</w:t>
+            </w:r>
+            <w:r>
+              <w:rPr>
+                <w:rStyle w:val="Hyperlink"/>
+              </w:rPr>
+              <w:t>abalhos Futuros</w:t>
+            </w:r>
+            <w:r>
+              <w:rPr>
+                <w:webHidden/>
+              </w:rPr>
+              <w:tab/>
+            </w:r>
+            <w:r>
+              <w:rPr>
+                <w:webHidden/>
+              </w:rPr>
+              <w:fldChar w:fldCharType="begin"/>
+            </w:r>
+            <w:r>
+              <w:rPr>
+                <w:webHidden/>
+              </w:rPr>
+              <w:instrText xml:space="preserve"> PAGEREF _Toc224942102 \h </w:instrText>
+            </w:r>
+            <w:r>
+              <w:rPr>
+                <w:webHidden/>
+              </w:rPr>
+            </w:r>
+            <w:r>
+              <w:rPr>
+                <w:webHidden/>
+              </w:rPr>
+              <w:fldChar w:fldCharType="separate"/>
+            </w:r>
+            <w:r>
+              <w:rPr>
+                <w:webHidden/>
+              </w:rPr>
+              <w:t>11</w:t>
+            </w:r>
+            <w:r>
+              <w:rPr>
+                <w:webHidden/>
+              </w:rPr>
+              <w:fldChar w:fldCharType="end"/>
+            </w:r>
+          </w:hyperlink>
         </w:p>
         <w:p>
           <w:pPr>
             <w:pStyle w:val="Sumrio1"/>
             <w:rPr>
               <w:rFonts w:eastAsiaTheme="minorEastAsia" w:cstheme="minorBidi"/>
+              <w:b w:val="0"/>
+              <w:bCs w:val="0"/>
+              <w:caps w:val="0"/>
               <w:kern w:val="0"/>
               <w:sz w:val="22"/>
               <w:szCs w:val="22"/>
               <w:lang w:eastAsia="pt-BR"/>
             </w:rPr>
           </w:pPr>
-          <w:hyperlink w:anchor="_Toc200029215" w:history="1">
+          <w:hyperlink w:anchor="_Toc224942103" w:history="1">
             <w:r>
               <w:rPr>
                 <w:rStyle w:val="Hyperlink"/>
               </w:rPr>
-              <w:t>5.</w:t>
+              <w:t>6.</w:t>
             </w:r>
             <w:r>
               <w:rPr>
                 <w:rFonts w:eastAsiaTheme="minorEastAsia" w:cstheme="minorBidi"/>
+                <w:b w:val="0"/>
+                <w:bCs w:val="0"/>
+                <w:caps w:val="0"/>
                 <w:kern w:val="0"/>
                 <w:sz w:val="22"/>
                 <w:szCs w:val="22"/>
@@ -1413,7 +1376,19 @@
               <w:rPr>
                 <w:rStyle w:val="Hyperlink"/>
               </w:rPr>
-              <w:t>Referências</w:t>
+              <w:t>Referên</w:t>
+            </w:r>
+            <w:r>
+              <w:rPr>
+                <w:rStyle w:val="Hyperlink"/>
+              </w:rPr>
+              <w:t>c</w:t>
+            </w:r>
+            <w:r>
+              <w:rPr>
+                <w:rStyle w:val="Hyperlink"/>
+              </w:rPr>
+              <w:t>ias</w:t>
             </w:r>
             <w:r>
               <w:rPr>
@@ -1431,7 +1406,7 @@
               <w:rPr>
                 <w:webHidden/>
               </w:rPr>
-              <w:instrText xml:space="preserve"> PAGEREF _Toc200029215 \h </w:instrText>
+              <w:instrText xml:space="preserve"> PAGEREF _Toc224942103 \h </w:instrText>
             </w:r>
             <w:r>
               <w:rPr>
@@ -1448,7 +1423,7 @@
               <w:rPr>
                 <w:webHidden/>
               </w:rPr>
-              <w:t>11</w:t>
+              <w:t>13</w:t>
             </w:r>
             <w:r>
               <w:rPr>
@@ -1494,7 +1469,6 @@
         </w:rPr>
       </w:pPr>
       <w:r>
-        <w:lastRenderedPageBreak/>
         <w:br w:type="page"/>
       </w:r>
     </w:p>
@@ -1506,7 +1480,7 @@
           <w:numId w:val="1"/>
         </w:numPr>
       </w:pPr>
-      <w:bookmarkStart w:id="0" w:name="_Toc200029176"/>
+      <w:bookmarkStart w:id="0" w:name="_Toc224942094"/>
       <w:r>
         <w:lastRenderedPageBreak/>
         <w:t>Introdução</w:t>
@@ -1566,6 +1540,7 @@
         </w:rPr>
         <w:t xml:space="preserve">Estudos recentes têm destacado a necessidade de sensores e sistemas integrados para mensuração do consumo energético durante a operação dos veículos. Sensores de tensão, corrente, temperatura e microcontroladores como Arduino ou ESP32 podem ser utilizados para criar sistemas de medição embarcados robustos [3]. Integrados a plataformas </w:t>
       </w:r>
+      <w:proofErr w:type="spellStart"/>
       <w:r>
         <w:rPr>
           <w:rFonts w:ascii="Arial" w:hAnsi="Arial" w:cs="Arial"/>
@@ -1574,6 +1549,7 @@
         </w:rPr>
         <w:t>IoT</w:t>
       </w:r>
+      <w:proofErr w:type="spellEnd"/>
       <w:r>
         <w:rPr>
           <w:rFonts w:ascii="Arial" w:hAnsi="Arial" w:cs="Arial"/>
@@ -1617,7 +1593,7 @@
           <w:numId w:val="1"/>
         </w:numPr>
       </w:pPr>
-      <w:bookmarkStart w:id="1" w:name="_Toc200029177"/>
+      <w:bookmarkStart w:id="1" w:name="_Toc224942095"/>
       <w:r>
         <w:t>Objetivos</w:t>
       </w:r>
@@ -1689,7 +1665,13 @@
         <w:t xml:space="preserve">de condicionamento de sinal para </w:t>
       </w:r>
       <w:r>
-        <w:t>adequar os leituras ao</w:t>
+        <w:t xml:space="preserve">adequar </w:t>
+      </w:r>
+      <w:r>
+        <w:t>a</w:t>
+      </w:r>
+      <w:r>
+        <w:t>s leituras ao</w:t>
       </w:r>
       <w:r>
         <w:t xml:space="preserve"> conversor analógico-digital (ADC) do microcontrolador;</w:t>
@@ -1749,7 +1731,7 @@
           <w:numId w:val="1"/>
         </w:numPr>
       </w:pPr>
-      <w:bookmarkStart w:id="2" w:name="_Toc200029178"/>
+      <w:bookmarkStart w:id="2" w:name="_Toc224942096"/>
       <w:r>
         <w:t>Metodologia</w:t>
       </w:r>
@@ -1829,6 +1811,7 @@
       <w:bookmarkStart w:id="30" w:name="_Toc200029205"/>
       <w:bookmarkStart w:id="31" w:name="_Toc200029206"/>
       <w:bookmarkStart w:id="32" w:name="_Toc200029207"/>
+      <w:bookmarkStart w:id="33" w:name="_Toc224942097"/>
       <w:bookmarkEnd w:id="3"/>
       <w:bookmarkEnd w:id="4"/>
       <w:bookmarkEnd w:id="5"/>
@@ -1865,6 +1848,7 @@
       <w:r>
         <w:t xml:space="preserve"> e Cálculo de Demanda</w:t>
       </w:r>
+      <w:bookmarkEnd w:id="33"/>
     </w:p>
     <w:p>
       <w:pPr>
@@ -1894,48 +1878,23 @@
         <w:rPr>
           <w:rFonts w:ascii="Arial" w:hAnsi="Arial" w:cs="Arial"/>
         </w:rPr>
-        <w:t>. O motor de tração da plataforma VIDA possui potência nominal de 1000W e opera com tensão nominal de 36V. Utilizando a equação de potência elétrica em corrente contínua (</w:t>
-      </w:r>
-      <w:r>
-        <w:rPr>
-          <w:rStyle w:val="mord"/>
-          <w:rFonts w:ascii="Arial" w:hAnsi="Arial" w:cs="Arial"/>
-        </w:rPr>
-        <w:t>P</w:t>
-      </w:r>
-      <w:r>
-        <w:rPr>
-          <w:rStyle w:val="mrel"/>
-          <w:rFonts w:ascii="Arial" w:hAnsi="Arial" w:cs="Arial"/>
-        </w:rPr>
-        <w:t>=</w:t>
-      </w:r>
-      <w:r>
-        <w:rPr>
-          <w:rStyle w:val="mord"/>
-          <w:rFonts w:ascii="Arial" w:hAnsi="Arial" w:cs="Arial"/>
-        </w:rPr>
-        <w:t>V</w:t>
-      </w:r>
-      <w:r>
-        <w:rPr>
-          <w:rStyle w:val="mbin"/>
-          <w:rFonts w:ascii="Cambria Math" w:hAnsi="Cambria Math" w:cs="Arial"/>
-        </w:rPr>
-        <w:t>⋅</w:t>
-      </w:r>
-      <w:r>
-        <w:rPr>
-          <w:rStyle w:val="mord"/>
-          <w:rFonts w:ascii="Arial" w:hAnsi="Arial" w:cs="Arial"/>
-        </w:rPr>
-        <w:t>I</w:t>
-      </w:r>
-      <w:r>
-        <w:rPr>
-          <w:rFonts w:ascii="Arial" w:hAnsi="Arial" w:cs="Arial"/>
-        </w:rPr>
-        <w:t xml:space="preserve">), a corrente nominal em regime de operação contínua é de aproximadamente 27,7A. No entanto, sabe-se que a corrente de partida para tirar o veículo do estado de inércia pode atingir elevados picos. </w:t>
+        <w:t xml:space="preserve">. O motor de tração da plataforma VIDA possui potência nominal de 1000W e opera com tensão nominal de 36V. Utilizando a equação de potência elétrica em corrente contínua </w:t>
+      </w:r>
+      <m:oMath>
+        <m:r>
+          <w:rPr>
+            <w:rFonts w:ascii="Cambria Math" w:hAnsi="Cambria Math" w:cs="Arial"/>
+            <w:sz w:val="28"/>
+            <w:szCs w:val="28"/>
+          </w:rPr>
+          <m:t>(P=V∙I)</m:t>
+        </m:r>
+      </m:oMath>
+      <w:r>
+        <w:rPr>
+          <w:rFonts w:ascii="Arial" w:hAnsi="Arial" w:cs="Arial"/>
+        </w:rPr>
+        <w:t xml:space="preserve">, a corrente nominal em regime de operação contínua é de aproximadamente 27,7A. No entanto, sabe-se que a corrente de partida para tirar o veículo do estado de inércia pode atingir elevados picos. </w:t>
       </w:r>
     </w:p>
     <w:p>
@@ -1965,6 +1924,8 @@
         <w:rPr>
           <w:rFonts w:eastAsia="Times New Roman"/>
           <w:kern w:val="0"/>
+          <w:sz w:val="28"/>
+          <w:szCs w:val="28"/>
           <w:lang w:eastAsia="pt-BR"/>
         </w:rPr>
       </w:pPr>
@@ -1974,9 +1935,11 @@
             <m:sSubPr>
               <m:ctrlPr>
                 <w:rPr>
-                  <w:rFonts w:ascii="Cambria Math" w:eastAsia="Times New Roman"/>
+                  <w:rFonts w:ascii="Cambria Math" w:eastAsia="Times New Roman" w:hAnsi="Cambria Math"/>
                   <w:i/>
                   <w:kern w:val="0"/>
+                  <w:sz w:val="28"/>
+                  <w:szCs w:val="28"/>
                   <w:lang w:eastAsia="pt-BR"/>
                 </w:rPr>
               </m:ctrlPr>
@@ -1986,6 +1949,8 @@
                 <w:rPr>
                   <w:rFonts w:ascii="Cambria Math" w:eastAsia="Times New Roman" w:hAnsi="Cambria Math"/>
                   <w:kern w:val="0"/>
+                  <w:sz w:val="28"/>
+                  <w:szCs w:val="28"/>
                   <w:lang w:eastAsia="pt-BR"/>
                 </w:rPr>
                 <m:t>I</m:t>
@@ -1996,6 +1961,8 @@
                 <w:rPr>
                   <w:rFonts w:ascii="Cambria Math" w:eastAsia="Times New Roman" w:hAnsi="Cambria Math"/>
                   <w:kern w:val="0"/>
+                  <w:sz w:val="28"/>
+                  <w:szCs w:val="28"/>
                   <w:lang w:eastAsia="pt-BR"/>
                 </w:rPr>
                 <m:t>a</m:t>
@@ -2009,6 +1976,8 @@
             <w:rPr>
               <w:rFonts w:ascii="Cambria Math" w:eastAsia="Times New Roman"/>
               <w:kern w:val="0"/>
+              <w:sz w:val="28"/>
+              <w:szCs w:val="28"/>
               <w:lang w:eastAsia="pt-BR"/>
             </w:rPr>
             <m:t>=</m:t>
@@ -2017,8 +1986,10 @@
             <m:fPr>
               <m:ctrlPr>
                 <w:rPr>
-                  <w:rFonts w:ascii="Cambria Math" w:eastAsia="Times New Roman"/>
+                  <w:rFonts w:ascii="Cambria Math" w:eastAsia="Times New Roman" w:hAnsi="Cambria Math"/>
                   <w:kern w:val="0"/>
+                  <w:sz w:val="28"/>
+                  <w:szCs w:val="28"/>
                   <w:lang w:eastAsia="pt-BR"/>
                 </w:rPr>
               </m:ctrlPr>
@@ -2028,9 +1999,11 @@
                 <m:sSubPr>
                   <m:ctrlPr>
                     <w:rPr>
-                      <w:rFonts w:ascii="Cambria Math" w:eastAsia="Times New Roman"/>
+                      <w:rFonts w:ascii="Cambria Math" w:eastAsia="Times New Roman" w:hAnsi="Cambria Math"/>
                       <w:i/>
                       <w:kern w:val="0"/>
+                      <w:sz w:val="28"/>
+                      <w:szCs w:val="28"/>
                       <w:lang w:eastAsia="pt-BR"/>
                     </w:rPr>
                   </m:ctrlPr>
@@ -2040,6 +2013,8 @@
                     <w:rPr>
                       <w:rFonts w:ascii="Cambria Math" w:eastAsia="Times New Roman" w:hAnsi="Cambria Math"/>
                       <w:kern w:val="0"/>
+                      <w:sz w:val="28"/>
+                      <w:szCs w:val="28"/>
                       <w:lang w:eastAsia="pt-BR"/>
                     </w:rPr>
                     <m:t>V</m:t>
@@ -2050,6 +2025,8 @@
                     <w:rPr>
                       <w:rFonts w:ascii="Cambria Math" w:eastAsia="Times New Roman" w:hAnsi="Cambria Math"/>
                       <w:kern w:val="0"/>
+                      <w:sz w:val="28"/>
+                      <w:szCs w:val="28"/>
                       <w:lang w:eastAsia="pt-BR"/>
                     </w:rPr>
                     <m:t>t</m:t>
@@ -2060,6 +2037,8 @@
                 <w:rPr>
                   <w:rFonts w:ascii="Cambria Math" w:eastAsia="Times New Roman" w:hAnsi="Cambria Math"/>
                   <w:kern w:val="0"/>
+                  <w:sz w:val="28"/>
+                  <w:szCs w:val="28"/>
                   <w:lang w:eastAsia="pt-BR"/>
                 </w:rPr>
                 <m:t>-</m:t>
@@ -2068,9 +2047,11 @@
                 <m:sSubPr>
                   <m:ctrlPr>
                     <w:rPr>
-                      <w:rFonts w:ascii="Cambria Math" w:eastAsia="Times New Roman"/>
+                      <w:rFonts w:ascii="Cambria Math" w:eastAsia="Times New Roman" w:hAnsi="Cambria Math"/>
                       <w:i/>
                       <w:kern w:val="0"/>
+                      <w:sz w:val="28"/>
+                      <w:szCs w:val="28"/>
                       <w:lang w:eastAsia="pt-BR"/>
                     </w:rPr>
                   </m:ctrlPr>
@@ -2080,6 +2061,8 @@
                     <w:rPr>
                       <w:rFonts w:ascii="Cambria Math" w:eastAsia="Times New Roman" w:hAnsi="Cambria Math"/>
                       <w:kern w:val="0"/>
+                      <w:sz w:val="28"/>
+                      <w:szCs w:val="28"/>
                       <w:lang w:eastAsia="pt-BR"/>
                     </w:rPr>
                     <m:t>E</m:t>
@@ -2090,6 +2073,8 @@
                     <w:rPr>
                       <w:rFonts w:ascii="Cambria Math" w:eastAsia="Times New Roman" w:hAnsi="Cambria Math"/>
                       <w:kern w:val="0"/>
+                      <w:sz w:val="28"/>
+                      <w:szCs w:val="28"/>
                       <w:lang w:eastAsia="pt-BR"/>
                     </w:rPr>
                     <m:t>a</m:t>
@@ -2102,8 +2087,10 @@
                 <m:sSubPr>
                   <m:ctrlPr>
                     <w:rPr>
-                      <w:rFonts w:ascii="Cambria Math" w:eastAsia="Times New Roman"/>
+                      <w:rFonts w:ascii="Cambria Math" w:eastAsia="Times New Roman" w:hAnsi="Cambria Math"/>
                       <w:kern w:val="0"/>
+                      <w:sz w:val="28"/>
+                      <w:szCs w:val="28"/>
                       <w:lang w:eastAsia="pt-BR"/>
                     </w:rPr>
                   </m:ctrlPr>
@@ -2116,6 +2103,8 @@
                     <w:rPr>
                       <w:rFonts w:ascii="Cambria Math" w:eastAsia="Times New Roman"/>
                       <w:kern w:val="0"/>
+                      <w:sz w:val="28"/>
+                      <w:szCs w:val="28"/>
                       <w:lang w:eastAsia="pt-BR"/>
                     </w:rPr>
                     <m:t>R</m:t>
@@ -2129,6 +2118,8 @@
                     <w:rPr>
                       <w:rFonts w:ascii="Cambria Math" w:eastAsia="Times New Roman"/>
                       <w:kern w:val="0"/>
+                      <w:sz w:val="28"/>
+                      <w:szCs w:val="28"/>
                       <w:lang w:eastAsia="pt-BR"/>
                     </w:rPr>
                     <m:t>a</m:t>
@@ -2157,7 +2148,189 @@
           <w:kern w:val="0"/>
           <w:lang w:eastAsia="pt-BR"/>
         </w:rPr>
-        <w:t>Onde Vt​ é a tensão aplicada aos terminais, Ea​ é a força contra-eletromotriz (FCEM) e Ra​ é a resistência interna da armadura. A FCEM é diretamente proporcional à velocidade de rotação do eixo do motor. No exato instante do arranque (inércia total, onde a velocidade é igual a zero), a FCEM (Ea​) também é nula.</w:t>
+        <w:t xml:space="preserve">Onde </w:t>
+      </w:r>
+      <m:oMath>
+        <m:sSub>
+          <m:sSubPr>
+            <m:ctrlPr>
+              <w:rPr>
+                <w:rFonts w:ascii="Cambria Math" w:eastAsia="Times New Roman" w:hAnsi="Cambria Math"/>
+                <w:i/>
+                <w:kern w:val="0"/>
+                <w:sz w:val="28"/>
+                <w:szCs w:val="28"/>
+                <w:lang w:eastAsia="pt-BR"/>
+              </w:rPr>
+            </m:ctrlPr>
+          </m:sSubPr>
+          <m:e>
+            <m:r>
+              <w:rPr>
+                <w:rFonts w:ascii="Cambria Math" w:eastAsia="Times New Roman" w:hAnsi="Cambria Math"/>
+                <w:kern w:val="0"/>
+                <w:sz w:val="28"/>
+                <w:szCs w:val="28"/>
+                <w:lang w:eastAsia="pt-BR"/>
+              </w:rPr>
+              <m:t>V</m:t>
+            </m:r>
+          </m:e>
+          <m:sub>
+            <m:r>
+              <w:rPr>
+                <w:rFonts w:ascii="Cambria Math" w:eastAsia="Times New Roman" w:hAnsi="Cambria Math"/>
+                <w:kern w:val="0"/>
+                <w:sz w:val="28"/>
+                <w:szCs w:val="28"/>
+                <w:lang w:eastAsia="pt-BR"/>
+              </w:rPr>
+              <m:t>t</m:t>
+            </m:r>
+          </m:sub>
+        </m:sSub>
+      </m:oMath>
+      <w:r>
+        <w:rPr>
+          <w:rFonts w:eastAsia="Times New Roman"/>
+          <w:kern w:val="0"/>
+          <w:lang w:eastAsia="pt-BR"/>
+        </w:rPr>
+        <w:t xml:space="preserve"> é a tensão aplicada aos terminais, </w:t>
+      </w:r>
+      <m:oMath>
+        <m:sSub>
+          <m:sSubPr>
+            <m:ctrlPr>
+              <w:rPr>
+                <w:rFonts w:ascii="Cambria Math" w:eastAsia="Times New Roman" w:hAnsi="Cambria Math"/>
+                <w:i/>
+                <w:kern w:val="0"/>
+                <w:sz w:val="28"/>
+                <w:szCs w:val="28"/>
+                <w:lang w:eastAsia="pt-BR"/>
+              </w:rPr>
+            </m:ctrlPr>
+          </m:sSubPr>
+          <m:e>
+            <m:r>
+              <w:rPr>
+                <w:rFonts w:ascii="Cambria Math" w:eastAsia="Times New Roman" w:hAnsi="Cambria Math"/>
+                <w:kern w:val="0"/>
+                <w:sz w:val="28"/>
+                <w:szCs w:val="28"/>
+                <w:lang w:eastAsia="pt-BR"/>
+              </w:rPr>
+              <m:t>E</m:t>
+            </m:r>
+          </m:e>
+          <m:sub>
+            <m:r>
+              <w:rPr>
+                <w:rFonts w:ascii="Cambria Math" w:eastAsia="Times New Roman" w:hAnsi="Cambria Math"/>
+                <w:kern w:val="0"/>
+                <w:sz w:val="28"/>
+                <w:szCs w:val="28"/>
+                <w:lang w:eastAsia="pt-BR"/>
+              </w:rPr>
+              <m:t>a</m:t>
+            </m:r>
+          </m:sub>
+        </m:sSub>
+      </m:oMath>
+      <w:r>
+        <w:rPr>
+          <w:rFonts w:eastAsia="Times New Roman"/>
+          <w:kern w:val="0"/>
+          <w:lang w:eastAsia="pt-BR"/>
+        </w:rPr>
+        <w:t xml:space="preserve">​ é a força </w:t>
+      </w:r>
+      <w:proofErr w:type="spellStart"/>
+      <w:r>
+        <w:rPr>
+          <w:rFonts w:eastAsia="Times New Roman"/>
+          <w:kern w:val="0"/>
+          <w:lang w:eastAsia="pt-BR"/>
+        </w:rPr>
+        <w:t>contra-eletromotriz</w:t>
+      </w:r>
+      <w:proofErr w:type="spellEnd"/>
+      <w:r>
+        <w:rPr>
+          <w:rFonts w:eastAsia="Times New Roman"/>
+          <w:kern w:val="0"/>
+          <w:lang w:eastAsia="pt-BR"/>
+        </w:rPr>
+        <w:t xml:space="preserve"> (FCEM) e Ra​ é a resistência interna da armadura. A FCEM é diretamente proporcional à velocidade de rotação do eixo do motor. No exato instante do arranque (inércia total, onde a velocidade é igual a zero), a FCEM </w:t>
+      </w:r>
+      <m:oMath>
+        <m:r>
+          <w:rPr>
+            <w:rFonts w:ascii="Cambria Math" w:eastAsia="Times New Roman" w:hAnsi="Cambria Math"/>
+            <w:kern w:val="0"/>
+            <w:sz w:val="28"/>
+            <w:szCs w:val="28"/>
+            <w:lang w:eastAsia="pt-BR"/>
+          </w:rPr>
+          <m:t>(</m:t>
+        </m:r>
+        <m:sSub>
+          <m:sSubPr>
+            <m:ctrlPr>
+              <w:rPr>
+                <w:rFonts w:ascii="Cambria Math" w:eastAsia="Times New Roman" w:hAnsi="Cambria Math"/>
+                <w:i/>
+                <w:kern w:val="0"/>
+                <w:sz w:val="28"/>
+                <w:szCs w:val="28"/>
+                <w:lang w:eastAsia="pt-BR"/>
+              </w:rPr>
+            </m:ctrlPr>
+          </m:sSubPr>
+          <m:e>
+            <m:r>
+              <w:rPr>
+                <w:rFonts w:ascii="Cambria Math" w:eastAsia="Times New Roman" w:hAnsi="Cambria Math"/>
+                <w:kern w:val="0"/>
+                <w:sz w:val="28"/>
+                <w:szCs w:val="28"/>
+                <w:lang w:eastAsia="pt-BR"/>
+              </w:rPr>
+              <m:t>E</m:t>
+            </m:r>
+          </m:e>
+          <m:sub>
+            <m:r>
+              <w:rPr>
+                <w:rFonts w:ascii="Cambria Math" w:eastAsia="Times New Roman" w:hAnsi="Cambria Math"/>
+                <w:kern w:val="0"/>
+                <w:sz w:val="28"/>
+                <w:szCs w:val="28"/>
+                <w:lang w:eastAsia="pt-BR"/>
+              </w:rPr>
+              <m:t>a</m:t>
+            </m:r>
+          </m:sub>
+        </m:sSub>
+        <m:r>
+          <w:rPr>
+            <w:rFonts w:ascii="Cambria Math" w:eastAsia="Times New Roman" w:hAnsi="Cambria Math"/>
+            <w:kern w:val="0"/>
+            <w:sz w:val="28"/>
+            <w:szCs w:val="28"/>
+            <w:lang w:eastAsia="pt-BR"/>
+          </w:rPr>
+          <m:t>)</m:t>
+        </m:r>
+      </m:oMath>
+      <w:r>
+        <w:rPr>
+          <w:rFonts w:eastAsia="Times New Roman"/>
+          <w:kern w:val="0"/>
+          <w:lang w:eastAsia="pt-BR"/>
+        </w:rPr>
+        <w:t xml:space="preserve"> também é nula.</w:t>
       </w:r>
     </w:p>
     <w:p>
@@ -2177,7 +2350,83 @@
           <w:kern w:val="0"/>
           <w:lang w:eastAsia="pt-BR"/>
         </w:rPr>
-        <w:t>Consequentemente, a corrente inicial é limitada unicamente pela resistência da armadura (Ra​), que, por razões de eficiência de construção e mitigação de perdas por efeito de Joule, possui um valor intrinsecamente muito baixo. É por este motivo que, no momento do arranque, para tirar o veículo do seu estado de inércia, a corrente exigida pelo motor atinge picos que podem ser de 5 a 10 vezes superiores à sua corrente nominal de funcionamento [6], decaindo apenas à medida que o motor ganha velocidade e a FCEM começa a opor-se à tensão de alimentação. Baseado neste princípio, estimou-se matematicamente que o pico de corrente transiente do motor poderia atingir a ordem dos 300 A.</w:t>
+        <w:t xml:space="preserve">Consequentemente, a corrente inicial é limitada unicamente pela resistência da armadura </w:t>
+      </w:r>
+      <m:oMath>
+        <m:sSub>
+          <m:sSubPr>
+            <m:ctrlPr>
+              <w:rPr>
+                <w:rFonts w:ascii="Cambria Math" w:eastAsia="Times New Roman" w:hAnsi="Cambria Math"/>
+                <w:kern w:val="0"/>
+                <w:sz w:val="28"/>
+                <w:szCs w:val="28"/>
+                <w:lang w:eastAsia="pt-BR"/>
+              </w:rPr>
+            </m:ctrlPr>
+          </m:sSubPr>
+          <m:e>
+            <m:r>
+              <m:rPr>
+                <m:sty m:val="p"/>
+              </m:rPr>
+              <w:rPr>
+                <w:rFonts w:ascii="Cambria Math" w:eastAsia="Times New Roman"/>
+                <w:kern w:val="0"/>
+                <w:sz w:val="28"/>
+                <w:szCs w:val="28"/>
+                <w:lang w:eastAsia="pt-BR"/>
+              </w:rPr>
+              <m:t>(</m:t>
+            </m:r>
+            <m:r>
+              <m:rPr>
+                <m:sty m:val="p"/>
+              </m:rPr>
+              <w:rPr>
+                <w:rFonts w:ascii="Cambria Math" w:eastAsia="Times New Roman"/>
+                <w:kern w:val="0"/>
+                <w:sz w:val="28"/>
+                <w:szCs w:val="28"/>
+                <w:lang w:eastAsia="pt-BR"/>
+              </w:rPr>
+              <m:t>R</m:t>
+            </m:r>
+          </m:e>
+          <m:sub>
+            <m:r>
+              <m:rPr>
+                <m:sty m:val="p"/>
+              </m:rPr>
+              <w:rPr>
+                <w:rFonts w:ascii="Cambria Math" w:eastAsia="Times New Roman"/>
+                <w:kern w:val="0"/>
+                <w:sz w:val="28"/>
+                <w:szCs w:val="28"/>
+                <w:lang w:eastAsia="pt-BR"/>
+              </w:rPr>
+              <m:t>a</m:t>
+            </m:r>
+          </m:sub>
+        </m:sSub>
+        <m:r>
+          <w:rPr>
+            <w:rFonts w:ascii="Cambria Math" w:eastAsia="Times New Roman" w:hAnsi="Cambria Math"/>
+            <w:kern w:val="0"/>
+            <w:sz w:val="28"/>
+            <w:szCs w:val="28"/>
+            <w:lang w:eastAsia="pt-BR"/>
+          </w:rPr>
+          <m:t>)</m:t>
+        </m:r>
+      </m:oMath>
+      <w:r>
+        <w:rPr>
+          <w:rFonts w:eastAsia="Times New Roman"/>
+          <w:kern w:val="0"/>
+          <w:lang w:eastAsia="pt-BR"/>
+        </w:rPr>
+        <w:t>, que, por razões de eficiência de construção e mitigação de perdas por efeito de Joule, possui um valor intrinsecamente muito baixo. É por este motivo que, no momento do arranque, para tirar o veículo do seu estado de inércia, a corrente exigida pelo motor atinge picos que podem ser de 5 a 10 vezes superiores à sua corrente nominal de funcionamento [6], decaindo apenas à medida que o motor ganha velocidade e a FCEM começa a opor-se à tensão de alimentação. Baseado neste princípio, estimou-se matematicamente que o pico de corrente transiente do motor poderia atingir a ordem dos 300 A.</w:t>
       </w:r>
     </w:p>
     <w:p>
@@ -2224,6 +2473,7 @@
         </w:rPr>
         <w:t xml:space="preserve"> foi posicionado e configurado em </w:t>
       </w:r>
+      <w:proofErr w:type="spellStart"/>
       <w:r>
         <w:rPr>
           <w:rFonts w:ascii="Arial" w:hAnsi="Arial" w:cs="Arial"/>
@@ -2232,6 +2482,7 @@
         </w:rPr>
         <w:t>low-side</w:t>
       </w:r>
+      <w:proofErr w:type="spellEnd"/>
       <w:r>
         <w:rPr>
           <w:rFonts w:ascii="Arial" w:hAnsi="Arial" w:cs="Arial"/>
@@ -2244,8 +2495,18 @@
           <w:i/>
           <w:iCs/>
         </w:rPr>
-        <w:t>high-side</w:t>
-      </w:r>
+        <w:t>high-</w:t>
+      </w:r>
+      <w:proofErr w:type="spellStart"/>
+      <w:r>
+        <w:rPr>
+          <w:rFonts w:ascii="Arial" w:hAnsi="Arial" w:cs="Arial"/>
+          <w:i/>
+          <w:iCs/>
+        </w:rPr>
+        <w:t>side</w:t>
+      </w:r>
+      <w:proofErr w:type="spellEnd"/>
       <w:r>
         <w:rPr>
           <w:rFonts w:ascii="Arial" w:hAnsi="Arial" w:cs="Arial"/>
@@ -2263,14 +2524,14 @@
       <w:pPr>
         <w:pStyle w:val="Ttulo2"/>
       </w:pPr>
-      <w:bookmarkStart w:id="33" w:name="_Toc200029209"/>
       <w:r>
         <w:t xml:space="preserve"> </w:t>
       </w:r>
+      <w:bookmarkStart w:id="34" w:name="_Toc224942098"/>
       <w:r>
         <w:t>Condicionamento do Sinal de Corrente</w:t>
       </w:r>
-      <w:bookmarkEnd w:id="33"/>
+      <w:bookmarkEnd w:id="34"/>
     </w:p>
     <w:p>
       <w:pPr>
@@ -2329,6 +2590,7 @@
         </w:rPr>
         <w:t xml:space="preserve">). Para que o ADC do Arduino possa ler esse sinal com boa resolução, essa pequena tensão precisou ser amplificada. Utilizou-se o componente OPA350, um amplificador operacional </w:t>
       </w:r>
+      <w:proofErr w:type="spellStart"/>
       <w:r>
         <w:rPr>
           <w:rFonts w:ascii="Arial" w:hAnsi="Arial" w:cs="Arial"/>
@@ -2337,6 +2599,7 @@
         </w:rPr>
         <w:t>rail-to-rail</w:t>
       </w:r>
+      <w:proofErr w:type="spellEnd"/>
       <w:r>
         <w:rPr>
           <w:rFonts w:ascii="Arial" w:hAnsi="Arial" w:cs="Arial"/>
@@ -2348,8 +2611,133 @@
           <w:rFonts w:ascii="Arial" w:hAnsi="Arial" w:cs="Arial"/>
         </w:rPr>
         <w:lastRenderedPageBreak/>
-        <w:t>amplificador subtrator para rejeitar ruídos de modo comum e aplicar o ganho necessário para a escala do microcontrolador.</w:t>
-      </w:r>
+        <w:t xml:space="preserve">amplificador </w:t>
+      </w:r>
+      <w:proofErr w:type="spellStart"/>
+      <w:r>
+        <w:rPr>
+          <w:rFonts w:ascii="Arial" w:hAnsi="Arial" w:cs="Arial"/>
+        </w:rPr>
+        <w:t>subtrator</w:t>
+      </w:r>
+      <w:proofErr w:type="spellEnd"/>
+      <w:r>
+        <w:rPr>
+          <w:rFonts w:ascii="Arial" w:hAnsi="Arial" w:cs="Arial"/>
+        </w:rPr>
+        <w:t xml:space="preserve"> para rejeitar ruídos de modo comum e aplicar o ganho necessário para a escala do microcontrolador</w:t>
+      </w:r>
+      <w:r>
+        <w:rPr>
+          <w:rFonts w:ascii="Arial" w:hAnsi="Arial" w:cs="Arial"/>
+        </w:rPr>
+        <w:t xml:space="preserve">, para ampliar a tensão de 75mV para aproximadamente 5V, foi usado um ganho de 66 no amplificador operacional que garante que o sinal de 75mV seja ampliado para </w:t>
+      </w:r>
+      <w:r>
+        <w:rPr>
+          <w:rFonts w:ascii="Arial" w:hAnsi="Arial" w:cs="Arial"/>
+        </w:rPr>
+        <w:t xml:space="preserve">aproximadamente </w:t>
+      </w:r>
+      <w:r>
+        <w:rPr>
+          <w:rFonts w:ascii="Arial" w:hAnsi="Arial" w:cs="Arial"/>
+        </w:rPr>
+        <w:t>4,95V</w:t>
+      </w:r>
+      <w:r>
+        <w:rPr>
+          <w:rFonts w:ascii="Arial" w:hAnsi="Arial" w:cs="Arial"/>
+        </w:rPr>
+        <w:t>.</w:t>
+      </w:r>
+    </w:p>
+    <w:p>
+      <w:pPr>
+        <w:pStyle w:val="NormalWeb"/>
+        <w:keepNext/>
+        <w:spacing w:line="360" w:lineRule="auto"/>
+        <w:ind w:firstLine="360"/>
+        <w:jc w:val="center"/>
+      </w:pPr>
+      <w:r>
+        <w:rPr>
+          <w:noProof/>
+        </w:rPr>
+        <w:drawing>
+          <wp:inline distT="0" distB="0" distL="0" distR="0" wp14:anchorId="3A08F751" wp14:editId="34C91D86">
+            <wp:extent cx="2381250" cy="1695450"/>
+            <wp:effectExtent l="0" t="0" r="0" b="0"/>
+            <wp:docPr id="6" name="Imagem 6" descr="Montagem Diferenca"/>
+            <wp:cNvGraphicFramePr>
+              <a:graphicFrameLocks xmlns:a="http://schemas.openxmlformats.org/drawingml/2006/main" noChangeAspect="1"/>
+            </wp:cNvGraphicFramePr>
+            <a:graphic xmlns:a="http://schemas.openxmlformats.org/drawingml/2006/main">
+              <a:graphicData uri="http://schemas.openxmlformats.org/drawingml/2006/picture">
+                <pic:pic xmlns:pic="http://schemas.openxmlformats.org/drawingml/2006/picture">
+                  <pic:nvPicPr>
+                    <pic:cNvPr id="0" name="Picture 3" descr="Montagem Diferenca"/>
+                    <pic:cNvPicPr>
+                      <a:picLocks noChangeAspect="1" noChangeArrowheads="1"/>
+                    </pic:cNvPicPr>
+                  </pic:nvPicPr>
+                  <pic:blipFill>
+                    <a:blip r:embed="rId8">
+                      <a:extLst>
+                        <a:ext uri="{28A0092B-C50C-407E-A947-70E740481C1C}">
+                          <a14:useLocalDpi xmlns:a14="http://schemas.microsoft.com/office/drawing/2010/main" val="0"/>
+                        </a:ext>
+                      </a:extLst>
+                    </a:blip>
+                    <a:srcRect/>
+                    <a:stretch>
+                      <a:fillRect/>
+                    </a:stretch>
+                  </pic:blipFill>
+                  <pic:spPr bwMode="auto">
+                    <a:xfrm>
+                      <a:off x="0" y="0"/>
+                      <a:ext cx="2381250" cy="1695450"/>
+                    </a:xfrm>
+                    <a:prstGeom prst="rect">
+                      <a:avLst/>
+                    </a:prstGeom>
+                    <a:noFill/>
+                    <a:ln>
+                      <a:noFill/>
+                    </a:ln>
+                  </pic:spPr>
+                </pic:pic>
+              </a:graphicData>
+            </a:graphic>
+          </wp:inline>
+        </w:drawing>
+      </w:r>
+    </w:p>
+    <w:p>
+      <w:pPr>
+        <w:pStyle w:val="Legenda"/>
+        <w:jc w:val="center"/>
+      </w:pPr>
+      <w:r>
+        <w:t xml:space="preserve">Figura </w:t>
+      </w:r>
+      <w:fldSimple w:instr=" SEQ Figura \* ARABIC ">
+        <w:r>
+          <w:rPr>
+            <w:noProof/>
+          </w:rPr>
+          <w:t>1</w:t>
+        </w:r>
+      </w:fldSimple>
+      <w:r>
+        <w:t xml:space="preserve">. Configuração de amplificador operacional </w:t>
+      </w:r>
+      <w:proofErr w:type="spellStart"/>
+      <w:r>
+        <w:t>subtrator</w:t>
+      </w:r>
+      <w:proofErr w:type="spellEnd"/>
     </w:p>
     <w:p>
       <w:pPr>
@@ -2363,16 +2751,546 @@
       <w:r>
         <w:rPr>
           <w:rFonts w:ascii="Arial" w:hAnsi="Arial" w:cs="Arial"/>
-          <w:i/>
-          <w:iCs/>
-        </w:rPr>
-        <w:t>(Insira aqui a IMAGEM DO CIRCUITO DE CORRENTE FEITO NO LTSPICE)</w:t>
-      </w:r>
+        </w:rPr>
+        <w:t xml:space="preserve">Para </w:t>
+      </w:r>
+      <m:oMath>
+        <m:sSub>
+          <m:sSubPr>
+            <m:ctrlPr>
+              <w:rPr>
+                <w:rFonts w:ascii="Cambria Math" w:hAnsi="Cambria Math"/>
+                <w:i/>
+                <w:sz w:val="28"/>
+                <w:szCs w:val="28"/>
+              </w:rPr>
+            </m:ctrlPr>
+          </m:sSubPr>
+          <m:e>
+            <m:r>
+              <w:rPr>
+                <w:rFonts w:ascii="Cambria Math" w:hAnsi="Cambria Math"/>
+                <w:sz w:val="28"/>
+                <w:szCs w:val="28"/>
+              </w:rPr>
+              <m:t>R</m:t>
+            </m:r>
+          </m:e>
+          <m:sub>
+            <m:r>
+              <w:rPr>
+                <w:rFonts w:ascii="Cambria Math" w:hAnsi="Cambria Math"/>
+                <w:sz w:val="28"/>
+                <w:szCs w:val="28"/>
+              </w:rPr>
+              <m:t>1</m:t>
+            </m:r>
+          </m:sub>
+        </m:sSub>
+        <m:r>
+          <w:rPr>
+            <w:rFonts w:ascii="Cambria Math" w:hAnsi="Cambria Math"/>
+            <w:sz w:val="28"/>
+            <w:szCs w:val="28"/>
+          </w:rPr>
+          <m:t>=</m:t>
+        </m:r>
+        <m:sSub>
+          <m:sSubPr>
+            <m:ctrlPr>
+              <w:rPr>
+                <w:rFonts w:ascii="Cambria Math" w:hAnsi="Cambria Math"/>
+                <w:i/>
+                <w:sz w:val="28"/>
+                <w:szCs w:val="28"/>
+              </w:rPr>
+            </m:ctrlPr>
+          </m:sSubPr>
+          <m:e>
+            <m:r>
+              <w:rPr>
+                <w:rFonts w:ascii="Cambria Math" w:hAnsi="Cambria Math"/>
+                <w:sz w:val="28"/>
+                <w:szCs w:val="28"/>
+              </w:rPr>
+              <m:t>R</m:t>
+            </m:r>
+          </m:e>
+          <m:sub>
+            <m:r>
+              <w:rPr>
+                <w:rFonts w:ascii="Cambria Math" w:hAnsi="Cambria Math"/>
+                <w:sz w:val="28"/>
+                <w:szCs w:val="28"/>
+              </w:rPr>
+              <m:t>3</m:t>
+            </m:r>
+          </m:sub>
+        </m:sSub>
+      </m:oMath>
+      <w:r>
+        <w:rPr>
+          <w:rFonts w:ascii="Arial" w:hAnsi="Arial" w:cs="Arial"/>
+          <w:sz w:val="28"/>
+          <w:szCs w:val="28"/>
+        </w:rPr>
+        <w:t xml:space="preserve"> </w:t>
+      </w:r>
+      <w:r>
+        <w:rPr>
+          <w:rFonts w:ascii="Arial" w:hAnsi="Arial" w:cs="Arial"/>
+        </w:rPr>
+        <w:t xml:space="preserve">e </w:t>
+      </w:r>
+      <m:oMath>
+        <m:sSub>
+          <m:sSubPr>
+            <m:ctrlPr>
+              <w:rPr>
+                <w:rFonts w:ascii="Cambria Math" w:hAnsi="Cambria Math"/>
+                <w:i/>
+                <w:sz w:val="28"/>
+                <w:szCs w:val="28"/>
+              </w:rPr>
+            </m:ctrlPr>
+          </m:sSubPr>
+          <m:e>
+            <m:r>
+              <w:rPr>
+                <w:rFonts w:ascii="Cambria Math" w:hAnsi="Cambria Math"/>
+                <w:sz w:val="28"/>
+                <w:szCs w:val="28"/>
+              </w:rPr>
+              <m:t>R</m:t>
+            </m:r>
+          </m:e>
+          <m:sub>
+            <m:r>
+              <w:rPr>
+                <w:rFonts w:ascii="Cambria Math" w:hAnsi="Cambria Math"/>
+                <w:sz w:val="28"/>
+                <w:szCs w:val="28"/>
+              </w:rPr>
+              <m:t>2</m:t>
+            </m:r>
+          </m:sub>
+        </m:sSub>
+        <m:r>
+          <w:rPr>
+            <w:rFonts w:ascii="Cambria Math" w:hAnsi="Cambria Math"/>
+            <w:sz w:val="28"/>
+            <w:szCs w:val="28"/>
+          </w:rPr>
+          <m:t>=</m:t>
+        </m:r>
+        <m:sSub>
+          <m:sSubPr>
+            <m:ctrlPr>
+              <w:rPr>
+                <w:rFonts w:ascii="Cambria Math" w:hAnsi="Cambria Math"/>
+                <w:i/>
+                <w:sz w:val="28"/>
+                <w:szCs w:val="28"/>
+              </w:rPr>
+            </m:ctrlPr>
+          </m:sSubPr>
+          <m:e>
+            <m:r>
+              <w:rPr>
+                <w:rFonts w:ascii="Cambria Math" w:hAnsi="Cambria Math"/>
+                <w:sz w:val="28"/>
+                <w:szCs w:val="28"/>
+              </w:rPr>
+              <m:t>R</m:t>
+            </m:r>
+          </m:e>
+          <m:sub>
+            <m:r>
+              <w:rPr>
+                <w:rFonts w:ascii="Cambria Math" w:hAnsi="Cambria Math"/>
+                <w:sz w:val="28"/>
+                <w:szCs w:val="28"/>
+              </w:rPr>
+              <m:t>4</m:t>
+            </m:r>
+          </m:sub>
+        </m:sSub>
+      </m:oMath>
+      <w:r>
+        <w:rPr>
+          <w:rFonts w:ascii="Arial" w:hAnsi="Arial" w:cs="Arial"/>
+          <w:sz w:val="28"/>
+          <w:szCs w:val="28"/>
+        </w:rPr>
+        <w:t xml:space="preserve"> </w:t>
+      </w:r>
+      <w:r>
+        <w:rPr>
+          <w:rFonts w:ascii="Arial" w:hAnsi="Arial" w:cs="Arial"/>
+        </w:rPr>
+        <w:t xml:space="preserve">, o ganho do amplificador operacional </w:t>
+      </w:r>
+      <w:proofErr w:type="spellStart"/>
+      <w:r>
+        <w:rPr>
+          <w:rFonts w:ascii="Arial" w:hAnsi="Arial" w:cs="Arial"/>
+        </w:rPr>
+        <w:t>subtrator</w:t>
+      </w:r>
+      <w:proofErr w:type="spellEnd"/>
+      <w:r>
+        <w:rPr>
+          <w:rFonts w:ascii="Arial" w:hAnsi="Arial" w:cs="Arial"/>
+        </w:rPr>
+        <w:t xml:space="preserve"> é dado por:</w:t>
+      </w:r>
+    </w:p>
+    <w:p>
+      <w:pPr>
+        <w:pStyle w:val="NormalWeb"/>
+        <w:spacing w:line="360" w:lineRule="auto"/>
+        <w:jc w:val="center"/>
+        <w:rPr>
+          <w:rFonts w:ascii="Arial" w:hAnsi="Arial" w:cs="Arial"/>
+        </w:rPr>
+      </w:pPr>
+      <m:oMath>
+        <m:sSub>
+          <m:sSubPr>
+            <m:ctrlPr>
+              <w:rPr>
+                <w:rFonts w:ascii="Cambria Math" w:hAnsi="Cambria Math"/>
+                <w:i/>
+                <w:sz w:val="28"/>
+                <w:szCs w:val="28"/>
+              </w:rPr>
+            </m:ctrlPr>
+          </m:sSubPr>
+          <m:e>
+            <m:r>
+              <w:rPr>
+                <w:rFonts w:ascii="Cambria Math" w:hAnsi="Cambria Math"/>
+                <w:sz w:val="28"/>
+                <w:szCs w:val="28"/>
+              </w:rPr>
+              <m:t>G</m:t>
+            </m:r>
+          </m:e>
+          <m:sub>
+            <m:r>
+              <w:rPr>
+                <w:rFonts w:ascii="Cambria Math" w:hAnsi="Cambria Math"/>
+                <w:sz w:val="28"/>
+                <w:szCs w:val="28"/>
+              </w:rPr>
+              <m:t>ampop</m:t>
+            </m:r>
+          </m:sub>
+        </m:sSub>
+        <m:r>
+          <w:rPr>
+            <w:rFonts w:ascii="Cambria Math" w:hAnsi="Cambria Math"/>
+            <w:sz w:val="28"/>
+            <w:szCs w:val="28"/>
+          </w:rPr>
+          <m:t>=</m:t>
+        </m:r>
+        <m:f>
+          <m:fPr>
+            <m:ctrlPr>
+              <w:rPr>
+                <w:rFonts w:ascii="Cambria Math" w:hAnsi="Cambria Math"/>
+                <w:i/>
+                <w:sz w:val="28"/>
+                <w:szCs w:val="28"/>
+              </w:rPr>
+            </m:ctrlPr>
+          </m:fPr>
+          <m:num>
+            <m:sSub>
+              <m:sSubPr>
+                <m:ctrlPr>
+                  <w:rPr>
+                    <w:rFonts w:ascii="Cambria Math" w:hAnsi="Cambria Math"/>
+                    <w:i/>
+                    <w:sz w:val="28"/>
+                    <w:szCs w:val="28"/>
+                  </w:rPr>
+                </m:ctrlPr>
+              </m:sSubPr>
+              <m:e>
+                <m:r>
+                  <w:rPr>
+                    <w:rFonts w:ascii="Cambria Math" w:hAnsi="Cambria Math"/>
+                    <w:sz w:val="28"/>
+                    <w:szCs w:val="28"/>
+                  </w:rPr>
+                  <m:t>R</m:t>
+                </m:r>
+              </m:e>
+              <m:sub>
+                <m:r>
+                  <w:rPr>
+                    <w:rFonts w:ascii="Cambria Math" w:hAnsi="Cambria Math"/>
+                    <w:sz w:val="28"/>
+                    <w:szCs w:val="28"/>
+                  </w:rPr>
+                  <m:t>2</m:t>
+                </m:r>
+              </m:sub>
+            </m:sSub>
+          </m:num>
+          <m:den>
+            <m:sSub>
+              <m:sSubPr>
+                <m:ctrlPr>
+                  <w:rPr>
+                    <w:rFonts w:ascii="Cambria Math" w:hAnsi="Cambria Math"/>
+                    <w:i/>
+                    <w:sz w:val="28"/>
+                    <w:szCs w:val="28"/>
+                  </w:rPr>
+                </m:ctrlPr>
+              </m:sSubPr>
+              <m:e>
+                <m:r>
+                  <w:rPr>
+                    <w:rFonts w:ascii="Cambria Math" w:hAnsi="Cambria Math"/>
+                    <w:sz w:val="28"/>
+                    <w:szCs w:val="28"/>
+                  </w:rPr>
+                  <m:t>R</m:t>
+                </m:r>
+              </m:e>
+              <m:sub>
+                <m:r>
+                  <w:rPr>
+                    <w:rFonts w:ascii="Cambria Math" w:hAnsi="Cambria Math"/>
+                    <w:sz w:val="28"/>
+                    <w:szCs w:val="28"/>
+                  </w:rPr>
+                  <m:t>1</m:t>
+                </m:r>
+              </m:sub>
+            </m:sSub>
+          </m:den>
+        </m:f>
+      </m:oMath>
+      <w:r>
+        <w:rPr>
+          <w:rFonts w:ascii="Arial" w:hAnsi="Arial" w:cs="Arial"/>
+          <w:sz w:val="28"/>
+          <w:szCs w:val="28"/>
+        </w:rPr>
+        <w:t xml:space="preserve"> </w:t>
+      </w:r>
+      <m:oMath>
+        <m:r>
+          <w:rPr>
+            <w:rFonts w:ascii="Cambria Math" w:hAnsi="Cambria Math"/>
+            <w:sz w:val="28"/>
+            <w:szCs w:val="28"/>
+          </w:rPr>
+          <w:br/>
+        </m:r>
+      </m:oMath>
+      <m:oMathPara>
+        <m:oMath>
+          <m:sSub>
+            <m:sSubPr>
+              <m:ctrlPr>
+                <w:rPr>
+                  <w:rFonts w:ascii="Cambria Math" w:hAnsi="Cambria Math"/>
+                  <w:i/>
+                  <w:sz w:val="28"/>
+                  <w:szCs w:val="28"/>
+                </w:rPr>
+              </m:ctrlPr>
+            </m:sSubPr>
+            <m:e>
+              <m:r>
+                <w:rPr>
+                  <w:rFonts w:ascii="Cambria Math" w:hAnsi="Cambria Math"/>
+                  <w:sz w:val="28"/>
+                  <w:szCs w:val="28"/>
+                </w:rPr>
+                <m:t>V</m:t>
+              </m:r>
+            </m:e>
+            <m:sub>
+              <m:r>
+                <w:rPr>
+                  <w:rFonts w:ascii="Cambria Math" w:hAnsi="Cambria Math"/>
+                  <w:sz w:val="28"/>
+                  <w:szCs w:val="28"/>
+                </w:rPr>
+                <m:t>out</m:t>
+              </m:r>
+            </m:sub>
+          </m:sSub>
+          <m:r>
+            <w:rPr>
+              <w:rFonts w:ascii="Cambria Math" w:hAnsi="Cambria Math"/>
+              <w:sz w:val="28"/>
+              <w:szCs w:val="28"/>
+            </w:rPr>
+            <m:t>=</m:t>
+          </m:r>
+          <m:sSub>
+            <m:sSubPr>
+              <m:ctrlPr>
+                <w:rPr>
+                  <w:rFonts w:ascii="Cambria Math" w:hAnsi="Cambria Math"/>
+                  <w:i/>
+                  <w:sz w:val="28"/>
+                  <w:szCs w:val="28"/>
+                </w:rPr>
+              </m:ctrlPr>
+            </m:sSubPr>
+            <m:e>
+              <m:r>
+                <w:rPr>
+                  <w:rFonts w:ascii="Cambria Math" w:hAnsi="Cambria Math"/>
+                  <w:sz w:val="28"/>
+                  <w:szCs w:val="28"/>
+                </w:rPr>
+                <m:t>G</m:t>
+              </m:r>
+            </m:e>
+            <m:sub>
+              <m:r>
+                <w:rPr>
+                  <w:rFonts w:ascii="Cambria Math" w:hAnsi="Cambria Math"/>
+                  <w:sz w:val="28"/>
+                  <w:szCs w:val="28"/>
+                </w:rPr>
+                <m:t>ampop</m:t>
+              </m:r>
+            </m:sub>
+          </m:sSub>
+          <m:r>
+            <w:rPr>
+              <w:rFonts w:ascii="Cambria Math" w:hAnsi="Cambria Math"/>
+              <w:sz w:val="28"/>
+              <w:szCs w:val="28"/>
+            </w:rPr>
+            <m:t>∙</m:t>
+          </m:r>
+          <m:sSub>
+            <m:sSubPr>
+              <m:ctrlPr>
+                <w:rPr>
+                  <w:rFonts w:ascii="Cambria Math" w:hAnsi="Cambria Math"/>
+                  <w:i/>
+                  <w:sz w:val="28"/>
+                  <w:szCs w:val="28"/>
+                </w:rPr>
+              </m:ctrlPr>
+            </m:sSubPr>
+            <m:e>
+              <m:r>
+                <w:rPr>
+                  <w:rFonts w:ascii="Cambria Math" w:hAnsi="Cambria Math"/>
+                  <w:sz w:val="28"/>
+                  <w:szCs w:val="28"/>
+                </w:rPr>
+                <m:t>V</m:t>
+              </m:r>
+            </m:e>
+            <m:sub>
+              <m:r>
+                <w:rPr>
+                  <w:rFonts w:ascii="Cambria Math" w:hAnsi="Cambria Math"/>
+                  <w:sz w:val="28"/>
+                  <w:szCs w:val="28"/>
+                </w:rPr>
+                <m:t>in</m:t>
+              </m:r>
+            </m:sub>
+          </m:sSub>
+        </m:oMath>
+      </m:oMathPara>
+    </w:p>
+    <w:p>
+      <w:pPr>
+        <w:pStyle w:val="NormalWeb"/>
+        <w:spacing w:line="360" w:lineRule="auto"/>
+        <w:jc w:val="center"/>
+        <w:rPr>
+          <w:rFonts w:ascii="Arial" w:hAnsi="Arial" w:cs="Arial"/>
+        </w:rPr>
+      </w:pPr>
     </w:p>
     <w:p>
       <w:pPr>
         <w:pStyle w:val="SemEspaamento"/>
-        <w:ind w:firstLine="360"/>
+        <w:keepNext/>
+        <w:ind w:firstLine="0"/>
+        <w:jc w:val="center"/>
+      </w:pPr>
+      <w:r>
+        <w:drawing>
+          <wp:inline distT="0" distB="0" distL="0" distR="0" wp14:anchorId="48906CC5" wp14:editId="2CEB843E">
+            <wp:extent cx="5400040" cy="2643505"/>
+            <wp:effectExtent l="0" t="0" r="0" b="0"/>
+            <wp:docPr id="1" name="Imagem 1"/>
+            <wp:cNvGraphicFramePr>
+              <a:graphicFrameLocks xmlns:a="http://schemas.openxmlformats.org/drawingml/2006/main" noChangeAspect="1"/>
+            </wp:cNvGraphicFramePr>
+            <a:graphic xmlns:a="http://schemas.openxmlformats.org/drawingml/2006/main">
+              <a:graphicData uri="http://schemas.openxmlformats.org/drawingml/2006/picture">
+                <pic:pic xmlns:pic="http://schemas.openxmlformats.org/drawingml/2006/picture">
+                  <pic:nvPicPr>
+                    <pic:cNvPr id="1" name=""/>
+                    <pic:cNvPicPr/>
+                  </pic:nvPicPr>
+                  <pic:blipFill>
+                    <a:blip r:embed="rId9"/>
+                    <a:stretch>
+                      <a:fillRect/>
+                    </a:stretch>
+                  </pic:blipFill>
+                  <pic:spPr>
+                    <a:xfrm>
+                      <a:off x="0" y="0"/>
+                      <a:ext cx="5400040" cy="2643505"/>
+                    </a:xfrm>
+                    <a:prstGeom prst="rect">
+                      <a:avLst/>
+                    </a:prstGeom>
+                  </pic:spPr>
+                </pic:pic>
+              </a:graphicData>
+            </a:graphic>
+          </wp:inline>
+        </w:drawing>
+      </w:r>
+    </w:p>
+    <w:p>
+      <w:pPr>
+        <w:pStyle w:val="Legenda"/>
+        <w:jc w:val="center"/>
+      </w:pPr>
+      <w:r>
+        <w:t xml:space="preserve">Figura </w:t>
+      </w:r>
+      <w:fldSimple w:instr=" SEQ Figura \* ARABIC ">
+        <w:r>
+          <w:rPr>
+            <w:noProof/>
+          </w:rPr>
+          <w:t>2</w:t>
+        </w:r>
+      </w:fldSimple>
+      <w:r>
+        <w:t>. Circuito do medidor de corrente</w:t>
+      </w:r>
+    </w:p>
+    <w:p>
+      <w:pPr>
+        <w:pStyle w:val="SemEspaamento"/>
+        <w:ind w:firstLine="0"/>
+        <w:jc w:val="center"/>
       </w:pPr>
     </w:p>
     <w:p>
@@ -2382,6 +3300,7 @@
       <w:r>
         <w:t xml:space="preserve"> </w:t>
       </w:r>
+      <w:bookmarkStart w:id="35" w:name="_Toc224942099"/>
       <w:r>
         <w:t xml:space="preserve">Medição do Nível </w:t>
       </w:r>
@@ -2391,6 +3310,7 @@
       <w:r>
         <w:t>da Bateria</w:t>
       </w:r>
+      <w:bookmarkEnd w:id="35"/>
     </w:p>
     <w:p>
       <w:pPr>
@@ -2406,104 +3326,274 @@
         <w:rPr>
           <w:rFonts w:ascii="Arial" w:hAnsi="Arial" w:cs="Arial"/>
         </w:rPr>
-        <w:t>O banco de baterias do veículo é composto por três unidades de 12V associadas em série, resultando em 36V de tensão nominal. O ADC do Arduino, entretanto, suporta tensões apenas na faixa de 0V a 5V. Para proteger o microcontrolador e viabilizar a leitura, projetou-se um circuito divisor de tensão. Utilizando a equação fundamental do divisor resistivo (</w:t>
-      </w:r>
-      <w:r>
-        <w:rPr>
-          <w:rStyle w:val="mord"/>
-          <w:rFonts w:ascii="Arial" w:hAnsi="Arial" w:cs="Arial"/>
-        </w:rPr>
-        <w:t>Vout</w:t>
-      </w:r>
-      <w:r>
-        <w:rPr>
-          <w:rStyle w:val="vlist-s"/>
-          <w:rFonts w:ascii="Arial" w:hAnsi="Arial" w:cs="Arial"/>
-        </w:rPr>
-        <w:t>​</w:t>
-      </w:r>
-      <w:r>
-        <w:rPr>
-          <w:rStyle w:val="mrel"/>
-          <w:rFonts w:ascii="Arial" w:hAnsi="Arial" w:cs="Arial"/>
-        </w:rPr>
-        <w:t>=</w:t>
-      </w:r>
-      <w:r>
-        <w:rPr>
-          <w:rStyle w:val="mord"/>
-          <w:rFonts w:ascii="Arial" w:hAnsi="Arial" w:cs="Arial"/>
-        </w:rPr>
-        <w:t>Vin</w:t>
-      </w:r>
-      <w:r>
-        <w:rPr>
-          <w:rStyle w:val="vlist-s"/>
-          <w:rFonts w:ascii="Arial" w:hAnsi="Arial" w:cs="Arial"/>
-        </w:rPr>
-        <w:t>​</w:t>
-      </w:r>
-      <w:r>
-        <w:rPr>
-          <w:rStyle w:val="mbin"/>
-          <w:rFonts w:ascii="Cambria Math" w:hAnsi="Cambria Math" w:cs="Arial"/>
-        </w:rPr>
-        <w:t>⋅</w:t>
-      </w:r>
-      <w:r>
-        <w:rPr>
-          <w:rStyle w:val="mord"/>
-          <w:rFonts w:ascii="Arial" w:hAnsi="Arial" w:cs="Arial"/>
-        </w:rPr>
-        <w:t>R1</w:t>
-      </w:r>
-      <w:r>
-        <w:rPr>
-          <w:rStyle w:val="vlist-s"/>
-          <w:rFonts w:ascii="Arial" w:hAnsi="Arial" w:cs="Arial"/>
-        </w:rPr>
-        <w:t>​</w:t>
-      </w:r>
-      <w:r>
-        <w:rPr>
-          <w:rStyle w:val="mbin"/>
-          <w:rFonts w:ascii="Arial" w:hAnsi="Arial" w:cs="Arial"/>
-        </w:rPr>
-        <w:t>+</w:t>
-      </w:r>
-      <w:r>
-        <w:rPr>
-          <w:rStyle w:val="mord"/>
-          <w:rFonts w:ascii="Arial" w:hAnsi="Arial" w:cs="Arial"/>
-        </w:rPr>
-        <w:t>R2</w:t>
-      </w:r>
-      <w:r>
-        <w:rPr>
-          <w:rStyle w:val="vlist-s"/>
-          <w:rFonts w:ascii="Arial" w:hAnsi="Arial" w:cs="Arial"/>
-        </w:rPr>
-        <w:t>​</w:t>
-      </w:r>
-      <w:r>
-        <w:rPr>
-          <w:rStyle w:val="mord"/>
-          <w:rFonts w:ascii="Arial" w:hAnsi="Arial" w:cs="Arial"/>
-        </w:rPr>
-        <w:t>R2</w:t>
-      </w:r>
-      <w:r>
-        <w:rPr>
-          <w:rStyle w:val="vlist-s"/>
-          <w:rFonts w:ascii="Arial" w:hAnsi="Arial" w:cs="Arial"/>
-        </w:rPr>
-        <w:t>​​</w:t>
-      </w:r>
-      <w:r>
-        <w:rPr>
-          <w:rFonts w:ascii="Arial" w:hAnsi="Arial" w:cs="Arial"/>
-        </w:rPr>
-        <w:t>), os resistores foram dimensionados para atenuar a tensão máxima de 36V para os 5V seguros.</w:t>
+        <w:t>O banco de baterias do veículo é composto por três unidades de 12V associadas em série, resultando em 36V de tensão nominal</w:t>
+      </w:r>
+      <w:r>
+        <w:rPr>
+          <w:rFonts w:ascii="Arial" w:hAnsi="Arial" w:cs="Arial"/>
+        </w:rPr>
+        <w:t>, atingindo até 43,2V</w:t>
+      </w:r>
+      <w:r>
+        <w:rPr>
+          <w:rFonts w:ascii="Arial" w:hAnsi="Arial" w:cs="Arial"/>
+        </w:rPr>
+        <w:t xml:space="preserve">. O ADC do Arduino, entretanto, suporta tensões apenas na faixa de 0V a 5V. Para proteger o microcontrolador e viabilizar a leitura, projetou-se um circuito divisor de tensão. Utilizando a equação fundamental do divisor resistivo </w:t>
+      </w:r>
+    </w:p>
+    <w:p>
+      <w:pPr>
+        <w:pStyle w:val="NormalWeb"/>
+        <w:spacing w:line="360" w:lineRule="auto"/>
+        <w:ind w:firstLine="360"/>
+        <w:jc w:val="center"/>
+        <w:rPr>
+          <w:rFonts w:ascii="Arial" w:hAnsi="Arial" w:cs="Arial"/>
+        </w:rPr>
+      </w:pPr>
+      <m:oMathPara>
+        <m:oMath>
+          <m:sSub>
+            <m:sSubPr>
+              <m:ctrlPr>
+                <w:rPr>
+                  <w:rFonts w:ascii="Cambria Math" w:hAnsi="Cambria Math"/>
+                  <w:i/>
+                  <w:sz w:val="28"/>
+                  <w:szCs w:val="28"/>
+                </w:rPr>
+              </m:ctrlPr>
+            </m:sSubPr>
+            <m:e>
+              <m:r>
+                <w:rPr>
+                  <w:rFonts w:ascii="Cambria Math" w:hAnsi="Cambria Math"/>
+                  <w:sz w:val="28"/>
+                  <w:szCs w:val="28"/>
+                </w:rPr>
+                <m:t>V</m:t>
+              </m:r>
+            </m:e>
+            <m:sub>
+              <m:r>
+                <w:rPr>
+                  <w:rFonts w:ascii="Cambria Math" w:hAnsi="Cambria Math"/>
+                  <w:sz w:val="28"/>
+                  <w:szCs w:val="28"/>
+                </w:rPr>
+                <m:t>out</m:t>
+              </m:r>
+            </m:sub>
+          </m:sSub>
+          <m:r>
+            <w:rPr>
+              <w:rFonts w:ascii="Cambria Math" w:hAnsi="Cambria Math"/>
+              <w:sz w:val="28"/>
+              <w:szCs w:val="28"/>
+            </w:rPr>
+            <m:t>=</m:t>
+          </m:r>
+          <m:sSub>
+            <m:sSubPr>
+              <m:ctrlPr>
+                <w:rPr>
+                  <w:rFonts w:ascii="Cambria Math" w:hAnsi="Cambria Math"/>
+                  <w:i/>
+                  <w:sz w:val="28"/>
+                  <w:szCs w:val="28"/>
+                </w:rPr>
+              </m:ctrlPr>
+            </m:sSubPr>
+            <m:e>
+              <m:r>
+                <w:rPr>
+                  <w:rFonts w:ascii="Cambria Math" w:hAnsi="Cambria Math"/>
+                  <w:sz w:val="28"/>
+                  <w:szCs w:val="28"/>
+                </w:rPr>
+                <m:t>V</m:t>
+              </m:r>
+            </m:e>
+            <m:sub>
+              <m:r>
+                <w:rPr>
+                  <w:rFonts w:ascii="Cambria Math" w:hAnsi="Cambria Math"/>
+                  <w:sz w:val="28"/>
+                  <w:szCs w:val="28"/>
+                </w:rPr>
+                <m:t>in</m:t>
+              </m:r>
+            </m:sub>
+          </m:sSub>
+          <m:r>
+            <w:rPr>
+              <w:rFonts w:ascii="Cambria Math" w:hAnsi="Cambria Math"/>
+              <w:sz w:val="28"/>
+              <w:szCs w:val="28"/>
+            </w:rPr>
+            <m:t>∙</m:t>
+          </m:r>
+          <m:f>
+            <m:fPr>
+              <m:ctrlPr>
+                <w:rPr>
+                  <w:rFonts w:ascii="Cambria Math" w:hAnsi="Cambria Math"/>
+                  <w:i/>
+                  <w:sz w:val="28"/>
+                  <w:szCs w:val="28"/>
+                </w:rPr>
+              </m:ctrlPr>
+            </m:fPr>
+            <m:num>
+              <m:sSub>
+                <m:sSubPr>
+                  <m:ctrlPr>
+                    <w:rPr>
+                      <w:rFonts w:ascii="Cambria Math" w:hAnsi="Cambria Math"/>
+                      <w:i/>
+                      <w:sz w:val="28"/>
+                      <w:szCs w:val="28"/>
+                    </w:rPr>
+                  </m:ctrlPr>
+                </m:sSubPr>
+                <m:e>
+                  <m:r>
+                    <w:rPr>
+                      <w:rFonts w:ascii="Cambria Math" w:hAnsi="Cambria Math"/>
+                      <w:sz w:val="28"/>
+                      <w:szCs w:val="28"/>
+                    </w:rPr>
+                    <m:t>R</m:t>
+                  </m:r>
+                </m:e>
+                <m:sub>
+                  <m:r>
+                    <w:rPr>
+                      <w:rFonts w:ascii="Cambria Math" w:hAnsi="Cambria Math"/>
+                      <w:sz w:val="28"/>
+                      <w:szCs w:val="28"/>
+                    </w:rPr>
+                    <m:t>2</m:t>
+                  </m:r>
+                </m:sub>
+              </m:sSub>
+            </m:num>
+            <m:den>
+              <m:sSub>
+                <m:sSubPr>
+                  <m:ctrlPr>
+                    <w:rPr>
+                      <w:rFonts w:ascii="Cambria Math" w:hAnsi="Cambria Math"/>
+                      <w:i/>
+                      <w:sz w:val="28"/>
+                      <w:szCs w:val="28"/>
+                    </w:rPr>
+                  </m:ctrlPr>
+                </m:sSubPr>
+                <m:e>
+                  <m:r>
+                    <w:rPr>
+                      <w:rFonts w:ascii="Cambria Math" w:hAnsi="Cambria Math"/>
+                      <w:sz w:val="28"/>
+                      <w:szCs w:val="28"/>
+                    </w:rPr>
+                    <m:t>R</m:t>
+                  </m:r>
+                </m:e>
+                <m:sub>
+                  <m:r>
+                    <w:rPr>
+                      <w:rFonts w:ascii="Cambria Math" w:hAnsi="Cambria Math"/>
+                      <w:sz w:val="28"/>
+                      <w:szCs w:val="28"/>
+                    </w:rPr>
+                    <m:t>1</m:t>
+                  </m:r>
+                </m:sub>
+              </m:sSub>
+              <m:r>
+                <w:rPr>
+                  <w:rFonts w:ascii="Cambria Math" w:hAnsi="Cambria Math"/>
+                  <w:sz w:val="28"/>
+                  <w:szCs w:val="28"/>
+                </w:rPr>
+                <m:t>+</m:t>
+              </m:r>
+              <m:sSub>
+                <m:sSubPr>
+                  <m:ctrlPr>
+                    <w:rPr>
+                      <w:rFonts w:ascii="Cambria Math" w:hAnsi="Cambria Math"/>
+                      <w:i/>
+                      <w:sz w:val="28"/>
+                      <w:szCs w:val="28"/>
+                    </w:rPr>
+                  </m:ctrlPr>
+                </m:sSubPr>
+                <m:e>
+                  <m:r>
+                    <w:rPr>
+                      <w:rFonts w:ascii="Cambria Math" w:hAnsi="Cambria Math"/>
+                      <w:sz w:val="28"/>
+                      <w:szCs w:val="28"/>
+                    </w:rPr>
+                    <m:t>R</m:t>
+                  </m:r>
+                </m:e>
+                <m:sub>
+                  <m:r>
+                    <w:rPr>
+                      <w:rFonts w:ascii="Cambria Math" w:hAnsi="Cambria Math"/>
+                      <w:sz w:val="28"/>
+                      <w:szCs w:val="28"/>
+                    </w:rPr>
+                    <m:t>2</m:t>
+                  </m:r>
+                </m:sub>
+              </m:sSub>
+            </m:den>
+          </m:f>
+        </m:oMath>
+      </m:oMathPara>
+    </w:p>
+    <w:p>
+      <w:pPr>
+        <w:pStyle w:val="NormalWeb"/>
+        <w:spacing w:line="360" w:lineRule="auto"/>
+        <w:jc w:val="both"/>
+        <w:rPr>
+          <w:rFonts w:ascii="Arial" w:hAnsi="Arial" w:cs="Arial"/>
+        </w:rPr>
+      </w:pPr>
+      <w:r>
+        <w:rPr>
+          <w:rFonts w:ascii="Arial" w:hAnsi="Arial" w:cs="Arial"/>
+        </w:rPr>
+        <w:t xml:space="preserve">os resistores foram dimensionados para atenuar a tensão máxima de </w:t>
+      </w:r>
+      <w:r>
+        <w:rPr>
+          <w:rFonts w:ascii="Arial" w:hAnsi="Arial" w:cs="Arial"/>
+        </w:rPr>
+        <w:t>43,2</w:t>
+      </w:r>
+      <w:r>
+        <w:rPr>
+          <w:rFonts w:ascii="Arial" w:hAnsi="Arial" w:cs="Arial"/>
+        </w:rPr>
+        <w:t xml:space="preserve">V para </w:t>
+      </w:r>
+      <w:r>
+        <w:rPr>
+          <w:rFonts w:ascii="Arial" w:hAnsi="Arial" w:cs="Arial"/>
+        </w:rPr>
+        <w:t>próximo d</w:t>
+      </w:r>
+      <w:r>
+        <w:rPr>
+          <w:rFonts w:ascii="Arial" w:hAnsi="Arial" w:cs="Arial"/>
+        </w:rPr>
+        <w:t>os 5V seguros.</w:t>
       </w:r>
     </w:p>
     <w:p>
@@ -2520,31 +3610,107 @@
         <w:rPr>
           <w:rFonts w:ascii="Arial" w:hAnsi="Arial" w:cs="Arial"/>
         </w:rPr>
-        <w:t>O sinal atenuado foi então direcionado a um segundo amplificador OPA350 (também configurado como subtrator) para o devido referenciamento de terra. Foram incluídos capacitores para filtragem de ruídos de alta frequência e diodos Zener em paralelo com a entrada do ADC, atuando como proteção contra surtos de tensão transientes.</w:t>
-      </w:r>
-    </w:p>
-    <w:p>
-      <w:pPr>
-        <w:pStyle w:val="NormalWeb"/>
-        <w:spacing w:line="360" w:lineRule="auto"/>
-        <w:jc w:val="both"/>
-        <w:rPr>
-          <w:rFonts w:ascii="Arial" w:hAnsi="Arial" w:cs="Arial"/>
-        </w:rPr>
-      </w:pPr>
-      <w:r>
-        <w:rPr>
-          <w:rFonts w:ascii="Arial" w:hAnsi="Arial" w:cs="Arial"/>
-          <w:i/>
-          <w:iCs/>
-        </w:rPr>
-        <w:t>(Insira aqui a IMAGEM DO CIRCUITO DE TENSÃO FEITO NO LTSPICE)</w:t>
+        <w:t xml:space="preserve">O sinal atenuado foi então direcionado a um segundo amplificador OPA350 (também configurado como </w:t>
+      </w:r>
+      <w:proofErr w:type="spellStart"/>
+      <w:r>
+        <w:rPr>
+          <w:rFonts w:ascii="Arial" w:hAnsi="Arial" w:cs="Arial"/>
+        </w:rPr>
+        <w:t>subtrator</w:t>
+      </w:r>
+      <w:proofErr w:type="spellEnd"/>
+      <w:r>
+        <w:rPr>
+          <w:rFonts w:ascii="Arial" w:hAnsi="Arial" w:cs="Arial"/>
+        </w:rPr>
+        <w:t xml:space="preserve">) para o devido referenciamento de terra. Foram incluídos capacitores para filtragem de ruídos de alta frequência e diodos </w:t>
+      </w:r>
+      <w:proofErr w:type="spellStart"/>
+      <w:r>
+        <w:rPr>
+          <w:rFonts w:ascii="Arial" w:hAnsi="Arial" w:cs="Arial"/>
+        </w:rPr>
+        <w:t>Zener</w:t>
+      </w:r>
+      <w:proofErr w:type="spellEnd"/>
+      <w:r>
+        <w:rPr>
+          <w:rFonts w:ascii="Arial" w:hAnsi="Arial" w:cs="Arial"/>
+        </w:rPr>
+        <w:t xml:space="preserve"> em paralelo com a entrada do ADC, atuando como proteção contra surtos de tensão transientes.</w:t>
       </w:r>
     </w:p>
     <w:p>
       <w:pPr>
         <w:pStyle w:val="SemEspaamento"/>
-        <w:ind w:firstLine="360"/>
+        <w:keepNext/>
+        <w:ind w:firstLine="0"/>
+        <w:jc w:val="center"/>
+      </w:pPr>
+      <w:r>
+        <w:drawing>
+          <wp:inline distT="0" distB="0" distL="0" distR="0" wp14:anchorId="21EA89F7" wp14:editId="160982F1">
+            <wp:extent cx="5400040" cy="2266950"/>
+            <wp:effectExtent l="0" t="0" r="0" b="0"/>
+            <wp:docPr id="10" name="Imagem 10"/>
+            <wp:cNvGraphicFramePr>
+              <a:graphicFrameLocks xmlns:a="http://schemas.openxmlformats.org/drawingml/2006/main" noChangeAspect="1"/>
+            </wp:cNvGraphicFramePr>
+            <a:graphic xmlns:a="http://schemas.openxmlformats.org/drawingml/2006/main">
+              <a:graphicData uri="http://schemas.openxmlformats.org/drawingml/2006/picture">
+                <pic:pic xmlns:pic="http://schemas.openxmlformats.org/drawingml/2006/picture">
+                  <pic:nvPicPr>
+                    <pic:cNvPr id="1" name=""/>
+                    <pic:cNvPicPr/>
+                  </pic:nvPicPr>
+                  <pic:blipFill>
+                    <a:blip r:embed="rId10"/>
+                    <a:stretch>
+                      <a:fillRect/>
+                    </a:stretch>
+                  </pic:blipFill>
+                  <pic:spPr>
+                    <a:xfrm>
+                      <a:off x="0" y="0"/>
+                      <a:ext cx="5400040" cy="2266950"/>
+                    </a:xfrm>
+                    <a:prstGeom prst="rect">
+                      <a:avLst/>
+                    </a:prstGeom>
+                  </pic:spPr>
+                </pic:pic>
+              </a:graphicData>
+            </a:graphic>
+          </wp:inline>
+        </w:drawing>
+      </w:r>
+    </w:p>
+    <w:p>
+      <w:pPr>
+        <w:pStyle w:val="Legenda"/>
+        <w:jc w:val="center"/>
+      </w:pPr>
+      <w:r>
+        <w:t xml:space="preserve">Figura </w:t>
+      </w:r>
+      <w:fldSimple w:instr=" SEQ Figura \* ARABIC ">
+        <w:r>
+          <w:rPr>
+            <w:noProof/>
+          </w:rPr>
+          <w:t>3</w:t>
+        </w:r>
+      </w:fldSimple>
+      <w:r>
+        <w:t>. Circuito do medidor de nível de tensão na bateria</w:t>
+      </w:r>
+    </w:p>
+    <w:p>
+      <w:pPr>
+        <w:pStyle w:val="SemEspaamento"/>
+        <w:ind w:firstLine="0"/>
+        <w:jc w:val="center"/>
       </w:pPr>
     </w:p>
     <w:p>
@@ -2554,14 +3720,14 @@
       <w:r>
         <w:t xml:space="preserve"> </w:t>
       </w:r>
-      <w:bookmarkStart w:id="34" w:name="_Toc200029211"/>
+      <w:bookmarkStart w:id="36" w:name="_Toc224942100"/>
       <w:r>
         <w:t xml:space="preserve">Simulação e </w:t>
       </w:r>
-      <w:bookmarkEnd w:id="34"/>
       <w:r>
         <w:t>Desenvolvimento de Software</w:t>
       </w:r>
+      <w:bookmarkEnd w:id="36"/>
     </w:p>
     <w:p>
       <w:pPr>
@@ -2577,33 +3743,153 @@
         <w:rPr>
           <w:rFonts w:ascii="Arial" w:hAnsi="Arial" w:cs="Arial"/>
         </w:rPr>
-        <w:t>Antes da montagem física, todos os circuitos foram validados e ajustados no software de simulação LTSpice. Paralelamente, desenvolveu-se o código embarcado em C++ na IDE do Arduino. A lógica implementada realiza a leitura analógica dos pinos (valores de 0 a 1023), aplica os fatores de conversão matemáticos inversos referentes ao divisor de tensão e ao ganho do amplificador, e converte os valores digitais para as grandezas reais de Tensão (V) e Corrente (A).</w:t>
-      </w:r>
-    </w:p>
-    <w:p>
-      <w:pPr>
-        <w:pStyle w:val="NormalWeb"/>
-        <w:spacing w:line="360" w:lineRule="auto"/>
-        <w:jc w:val="both"/>
-        <w:rPr>
-          <w:rFonts w:ascii="Arial" w:hAnsi="Arial" w:cs="Arial"/>
-        </w:rPr>
-      </w:pPr>
-      <w:r>
-        <w:rPr>
-          <w:rFonts w:ascii="Arial" w:hAnsi="Arial" w:cs="Arial"/>
+        <w:t xml:space="preserve">Antes da montagem física, todos os circuitos foram validados e ajustados no software de simulação </w:t>
+      </w:r>
+      <w:proofErr w:type="spellStart"/>
+      <w:r>
+        <w:rPr>
+          <w:rFonts w:ascii="Arial" w:hAnsi="Arial" w:cs="Arial"/>
+        </w:rPr>
+        <w:t>LTSpice</w:t>
+      </w:r>
+      <w:proofErr w:type="spellEnd"/>
+      <w:r>
+        <w:rPr>
+          <w:rFonts w:ascii="Arial" w:hAnsi="Arial" w:cs="Arial"/>
+        </w:rPr>
+        <w:t xml:space="preserve">. Paralelamente, desenvolveu-se o código </w:t>
+      </w:r>
+      <w:r>
+        <w:rPr>
+          <w:rFonts w:ascii="Arial" w:hAnsi="Arial" w:cs="Arial"/>
+        </w:rPr>
+        <w:lastRenderedPageBreak/>
+        <w:t xml:space="preserve">embarcado em C++ </w:t>
+      </w:r>
+      <w:proofErr w:type="spellStart"/>
+      <w:r>
+        <w:rPr>
+          <w:rFonts w:ascii="Arial" w:hAnsi="Arial" w:cs="Arial"/>
+        </w:rPr>
+        <w:t>na</w:t>
+      </w:r>
+      <w:proofErr w:type="spellEnd"/>
+      <w:r>
+        <w:rPr>
+          <w:rFonts w:ascii="Arial" w:hAnsi="Arial" w:cs="Arial"/>
+        </w:rPr>
+        <w:t xml:space="preserve"> IDE do Arduino. A lógica implementada realiza a leitura analógica dos pinos (valores de 0 a 1023), aplica os fatores de conversão matemáticos inversos referentes ao divisor de tensão e ao ganho do amplificador, e converte os valores digitais para as grandezas reais de Tensão (V)</w:t>
+      </w:r>
+      <w:r>
+        <w:rPr>
+          <w:rFonts w:ascii="Arial" w:hAnsi="Arial" w:cs="Arial"/>
+        </w:rPr>
+        <w:t>,</w:t>
+      </w:r>
+      <w:r>
+        <w:rPr>
+          <w:rFonts w:ascii="Arial" w:hAnsi="Arial" w:cs="Arial"/>
+        </w:rPr>
+        <w:t xml:space="preserve"> Corrente (A)</w:t>
+      </w:r>
+      <w:r>
+        <w:rPr>
+          <w:rFonts w:ascii="Arial" w:hAnsi="Arial" w:cs="Arial"/>
+        </w:rPr>
+        <w:t xml:space="preserve"> e calcula a Potência entregue (W)</w:t>
+      </w:r>
+      <w:r>
+        <w:rPr>
+          <w:rFonts w:ascii="Arial" w:hAnsi="Arial" w:cs="Arial"/>
+        </w:rPr>
+        <w:t>.</w:t>
+      </w:r>
+    </w:p>
+    <w:p>
+      <w:pPr>
+        <w:pStyle w:val="SemEspaamento"/>
+        <w:keepNext/>
+        <w:ind w:firstLine="360"/>
+        <w:jc w:val="center"/>
+      </w:pPr>
+      <w:r>
+        <w:rPr>
+          <w:rFonts w:eastAsia="Times New Roman"/>
           <w:i/>
           <w:iCs/>
-        </w:rPr>
-        <w:lastRenderedPageBreak/>
-        <w:t>(Insira aqui o DIAGRAMA DE BLOCOS/ FLUXOGRAMA DO CÓDIGO PARA ARDUINO)</w:t>
-      </w:r>
-    </w:p>
-    <w:p>
-      <w:pPr>
-        <w:pStyle w:val="SemEspaamento"/>
-        <w:ind w:firstLine="360"/>
-      </w:pPr>
+          <w:noProof/>
+          <w:kern w:val="0"/>
+          <w:lang w:eastAsia="pt-BR"/>
+        </w:rPr>
+        <w:drawing>
+          <wp:inline distT="0" distB="0" distL="0" distR="0" wp14:anchorId="2AE3FE08" wp14:editId="79D982AE">
+            <wp:extent cx="5391150" cy="2819400"/>
+            <wp:effectExtent l="0" t="0" r="0" b="0"/>
+            <wp:docPr id="5" name="Imagem 5"/>
+            <wp:cNvGraphicFramePr>
+              <a:graphicFrameLocks xmlns:a="http://schemas.openxmlformats.org/drawingml/2006/main" noChangeAspect="1"/>
+            </wp:cNvGraphicFramePr>
+            <a:graphic xmlns:a="http://schemas.openxmlformats.org/drawingml/2006/main">
+              <a:graphicData uri="http://schemas.openxmlformats.org/drawingml/2006/picture">
+                <pic:pic xmlns:pic="http://schemas.openxmlformats.org/drawingml/2006/picture">
+                  <pic:nvPicPr>
+                    <pic:cNvPr id="0" name="Picture 2"/>
+                    <pic:cNvPicPr>
+                      <a:picLocks noChangeAspect="1" noChangeArrowheads="1"/>
+                    </pic:cNvPicPr>
+                  </pic:nvPicPr>
+                  <pic:blipFill>
+                    <a:blip r:embed="rId11">
+                      <a:extLst>
+                        <a:ext uri="{28A0092B-C50C-407E-A947-70E740481C1C}">
+                          <a14:useLocalDpi xmlns:a14="http://schemas.microsoft.com/office/drawing/2010/main" val="0"/>
+                        </a:ext>
+                      </a:extLst>
+                    </a:blip>
+                    <a:srcRect/>
+                    <a:stretch>
+                      <a:fillRect/>
+                    </a:stretch>
+                  </pic:blipFill>
+                  <pic:spPr bwMode="auto">
+                    <a:xfrm>
+                      <a:off x="0" y="0"/>
+                      <a:ext cx="5391150" cy="2819400"/>
+                    </a:xfrm>
+                    <a:prstGeom prst="rect">
+                      <a:avLst/>
+                    </a:prstGeom>
+                    <a:noFill/>
+                    <a:ln>
+                      <a:noFill/>
+                    </a:ln>
+                  </pic:spPr>
+                </pic:pic>
+              </a:graphicData>
+            </a:graphic>
+          </wp:inline>
+        </w:drawing>
+      </w:r>
+    </w:p>
+    <w:p>
+      <w:pPr>
+        <w:pStyle w:val="Legenda"/>
+        <w:jc w:val="center"/>
+      </w:pPr>
+      <w:r>
+        <w:t xml:space="preserve">Figura </w:t>
+      </w:r>
+      <w:fldSimple w:instr=" SEQ Figura \* ARABIC ">
+        <w:r>
+          <w:rPr>
+            <w:noProof/>
+          </w:rPr>
+          <w:t>4</w:t>
+        </w:r>
+      </w:fldSimple>
+      <w:r>
+        <w:t>. Fluxograma do código implementado no Arduíno</w:t>
+      </w:r>
     </w:p>
     <w:p>
       <w:pPr>
@@ -2627,10 +3913,12 @@
           <w:numId w:val="1"/>
         </w:numPr>
       </w:pPr>
+      <w:bookmarkStart w:id="37" w:name="_Toc224942101"/>
       <w:r>
         <w:lastRenderedPageBreak/>
         <w:t>Resultados e Discussões</w:t>
       </w:r>
+      <w:bookmarkEnd w:id="37"/>
     </w:p>
     <w:p>
       <w:pPr>
@@ -2646,7 +3934,21 @@
         <w:rPr>
           <w:rFonts w:ascii="Arial" w:hAnsi="Arial" w:cs="Arial"/>
         </w:rPr>
-        <w:t xml:space="preserve">As simulações computacionais no LTSpice apresentaram resultados plenamente consistentes. Observou-se que as topologias propostas funcionavam corretamente na teoria: o ganho sobre os 75mV do </w:t>
+        <w:t xml:space="preserve">As simulações computacionais no </w:t>
+      </w:r>
+      <w:proofErr w:type="spellStart"/>
+      <w:r>
+        <w:rPr>
+          <w:rFonts w:ascii="Arial" w:hAnsi="Arial" w:cs="Arial"/>
+        </w:rPr>
+        <w:t>LTSpice</w:t>
+      </w:r>
+      <w:proofErr w:type="spellEnd"/>
+      <w:r>
+        <w:rPr>
+          <w:rFonts w:ascii="Arial" w:hAnsi="Arial" w:cs="Arial"/>
+        </w:rPr>
+        <w:t xml:space="preserve"> apresentaram resultados plenamente consistentes. Observou-se que as topologias propostas funcionavam corretamente na teoria: o ganho sobre os 75mV do </w:t>
       </w:r>
       <w:r>
         <w:rPr>
@@ -2660,7 +3962,150 @@
         <w:rPr>
           <w:rFonts w:ascii="Arial" w:hAnsi="Arial" w:cs="Arial"/>
         </w:rPr>
-        <w:t xml:space="preserve"> e a atenuação dos 36V da bateria geraram saídas lineares e restritas à faixa segura de 0V a 5V exigida pelo Arduino.</w:t>
+        <w:t xml:space="preserve"> e a atenuação dos </w:t>
+      </w:r>
+      <w:r>
+        <w:rPr>
+          <w:rFonts w:ascii="Arial" w:hAnsi="Arial" w:cs="Arial"/>
+        </w:rPr>
+        <w:t>43,2</w:t>
+      </w:r>
+      <w:r>
+        <w:rPr>
+          <w:rFonts w:ascii="Arial" w:hAnsi="Arial" w:cs="Arial"/>
+        </w:rPr>
+        <w:t>V da bateria geraram saídas lineares e restritas à faixa segura de 0V a 5V exigida pelo Arduino.</w:t>
+      </w:r>
+    </w:p>
+    <w:p>
+      <w:pPr>
+        <w:pStyle w:val="NormalWeb"/>
+        <w:keepNext/>
+        <w:spacing w:line="360" w:lineRule="auto"/>
+        <w:jc w:val="center"/>
+      </w:pPr>
+      <w:r>
+        <w:drawing>
+          <wp:inline distT="0" distB="0" distL="0" distR="0" wp14:anchorId="1340BF35" wp14:editId="44077329">
+            <wp:extent cx="5400040" cy="2807970"/>
+            <wp:effectExtent l="0" t="0" r="0" b="0"/>
+            <wp:docPr id="11" name="Imagem 11"/>
+            <wp:cNvGraphicFramePr>
+              <a:graphicFrameLocks xmlns:a="http://schemas.openxmlformats.org/drawingml/2006/main" noChangeAspect="1"/>
+            </wp:cNvGraphicFramePr>
+            <a:graphic xmlns:a="http://schemas.openxmlformats.org/drawingml/2006/main">
+              <a:graphicData uri="http://schemas.openxmlformats.org/drawingml/2006/picture">
+                <pic:pic xmlns:pic="http://schemas.openxmlformats.org/drawingml/2006/picture">
+                  <pic:nvPicPr>
+                    <pic:cNvPr id="1" name=""/>
+                    <pic:cNvPicPr/>
+                  </pic:nvPicPr>
+                  <pic:blipFill>
+                    <a:blip r:embed="rId12"/>
+                    <a:stretch>
+                      <a:fillRect/>
+                    </a:stretch>
+                  </pic:blipFill>
+                  <pic:spPr>
+                    <a:xfrm>
+                      <a:off x="0" y="0"/>
+                      <a:ext cx="5400040" cy="2807970"/>
+                    </a:xfrm>
+                    <a:prstGeom prst="rect">
+                      <a:avLst/>
+                    </a:prstGeom>
+                  </pic:spPr>
+                </pic:pic>
+              </a:graphicData>
+            </a:graphic>
+          </wp:inline>
+        </w:drawing>
+      </w:r>
+    </w:p>
+    <w:p>
+      <w:pPr>
+        <w:pStyle w:val="Legenda"/>
+        <w:jc w:val="center"/>
+      </w:pPr>
+      <w:r>
+        <w:t xml:space="preserve">Figura </w:t>
+      </w:r>
+      <w:fldSimple w:instr=" SEQ Figura \* ARABIC ">
+        <w:r>
+          <w:rPr>
+            <w:noProof/>
+          </w:rPr>
+          <w:t>5</w:t>
+        </w:r>
+      </w:fldSimple>
+      <w:r>
+        <w:t>. Medidores de nível de tensão da bateria e corrente</w:t>
+      </w:r>
+    </w:p>
+    <w:p>
+      <w:pPr>
+        <w:pStyle w:val="NormalWeb"/>
+        <w:keepNext/>
+        <w:spacing w:line="360" w:lineRule="auto"/>
+        <w:jc w:val="center"/>
+      </w:pPr>
+      <w:r>
+        <w:lastRenderedPageBreak/>
+        <w:drawing>
+          <wp:inline distT="0" distB="0" distL="0" distR="0" wp14:anchorId="680287B5" wp14:editId="4B083749">
+            <wp:extent cx="5400040" cy="7539990"/>
+            <wp:effectExtent l="0" t="0" r="0" b="0"/>
+            <wp:docPr id="9" name="Imagem 9"/>
+            <wp:cNvGraphicFramePr>
+              <a:graphicFrameLocks xmlns:a="http://schemas.openxmlformats.org/drawingml/2006/main" noChangeAspect="1"/>
+            </wp:cNvGraphicFramePr>
+            <a:graphic xmlns:a="http://schemas.openxmlformats.org/drawingml/2006/main">
+              <a:graphicData uri="http://schemas.openxmlformats.org/drawingml/2006/picture">
+                <pic:pic xmlns:pic="http://schemas.openxmlformats.org/drawingml/2006/picture">
+                  <pic:nvPicPr>
+                    <pic:cNvPr id="1" name=""/>
+                    <pic:cNvPicPr/>
+                  </pic:nvPicPr>
+                  <pic:blipFill>
+                    <a:blip r:embed="rId13"/>
+                    <a:stretch>
+                      <a:fillRect/>
+                    </a:stretch>
+                  </pic:blipFill>
+                  <pic:spPr>
+                    <a:xfrm>
+                      <a:off x="0" y="0"/>
+                      <a:ext cx="5400040" cy="7539990"/>
+                    </a:xfrm>
+                    <a:prstGeom prst="rect">
+                      <a:avLst/>
+                    </a:prstGeom>
+                  </pic:spPr>
+                </pic:pic>
+              </a:graphicData>
+            </a:graphic>
+          </wp:inline>
+        </w:drawing>
+      </w:r>
+    </w:p>
+    <w:p>
+      <w:pPr>
+        <w:pStyle w:val="Legenda"/>
+        <w:jc w:val="center"/>
+      </w:pPr>
+      <w:r>
+        <w:t xml:space="preserve">Figura </w:t>
+      </w:r>
+      <w:fldSimple w:instr=" SEQ Figura \* ARABIC ">
+        <w:r>
+          <w:rPr>
+            <w:noProof/>
+          </w:rPr>
+          <w:t>6</w:t>
+        </w:r>
+      </w:fldSimple>
+      <w:r>
+        <w:t>. Corrente no resistor shunt, tensão na bateria, tensão na saída do medidor de nível de tensão da bateria e tensão na saída do medidor de corrente.</w:t>
       </w:r>
     </w:p>
     <w:p>
@@ -2677,7 +4122,26 @@
         <w:rPr>
           <w:rFonts w:ascii="Arial" w:hAnsi="Arial" w:cs="Arial"/>
         </w:rPr>
-        <w:t>Contudo, a transição para o protótipo físico revelou desafios. Durante os testes iniciais no veículo (conduzidos com o motor de esterçamento da direção), o sistema apresentou comportamento não linear e ruidoso. O microcontrolador registrou leituras estourando o limite do ADC (constantes marcações acima de 1023) e alta instabilidade de sinal.</w:t>
+        <w:t xml:space="preserve">Contudo, a transição para o protótipo físico revelou desafios. Durante os testes iniciais no veículo (conduzidos com o motor de esterçamento da </w:t>
+      </w:r>
+      <w:r>
+        <w:rPr>
+          <w:rFonts w:ascii="Arial" w:hAnsi="Arial" w:cs="Arial"/>
+        </w:rPr>
+        <w:lastRenderedPageBreak/>
+        <w:t xml:space="preserve">direção), o sistema apresentou comportamento não linear e ruidoso. O microcontrolador registrou leituras </w:t>
+      </w:r>
+      <w:r>
+        <w:rPr>
+          <w:rFonts w:ascii="Arial" w:hAnsi="Arial" w:cs="Arial"/>
+        </w:rPr>
+        <w:t>ultrapassando</w:t>
+      </w:r>
+      <w:r>
+        <w:rPr>
+          <w:rFonts w:ascii="Arial" w:hAnsi="Arial" w:cs="Arial"/>
+        </w:rPr>
+        <w:t xml:space="preserve"> o limite do ADC (constantes marcações acima de 1023) e alta instabilidade de sinal.</w:t>
       </w:r>
     </w:p>
     <w:p>
@@ -2711,7 +4175,21 @@
         <w:rPr>
           <w:rFonts w:ascii="Arial" w:hAnsi="Arial" w:cs="Arial"/>
         </w:rPr>
-        <w:t xml:space="preserve">A suspeita técnica primária foi a queima ou dano físico aos CIs OPA350. Para validar essa hipótese, os chips foram testados individualmente na configuração de circuito </w:t>
+        <w:t xml:space="preserve">A suspeita técnica primária foi a queima ou dano físico aos </w:t>
+      </w:r>
+      <w:proofErr w:type="spellStart"/>
+      <w:r>
+        <w:rPr>
+          <w:rFonts w:ascii="Arial" w:hAnsi="Arial" w:cs="Arial"/>
+        </w:rPr>
+        <w:t>CIs</w:t>
+      </w:r>
+      <w:proofErr w:type="spellEnd"/>
+      <w:r>
+        <w:rPr>
+          <w:rFonts w:ascii="Arial" w:hAnsi="Arial" w:cs="Arial"/>
+        </w:rPr>
+        <w:t xml:space="preserve"> OPA350. Para validar essa hipótese, os chips foram testados individualmente na configuração de circuito </w:t>
       </w:r>
       <w:r>
         <w:rPr>
@@ -2765,10 +4243,11 @@
           <w:numId w:val="1"/>
         </w:numPr>
       </w:pPr>
-      <w:r>
-        <w:lastRenderedPageBreak/>
+      <w:bookmarkStart w:id="38" w:name="_Toc224942102"/>
+      <w:r>
         <w:t>Conclusão e Trabalhos Futuros</w:t>
       </w:r>
+      <w:bookmarkEnd w:id="38"/>
     </w:p>
     <w:p>
       <w:pPr>
@@ -2800,6 +4279,7 @@
         </w:rPr>
         <w:t xml:space="preserve"> em </w:t>
       </w:r>
+      <w:proofErr w:type="spellStart"/>
       <w:r>
         <w:rPr>
           <w:rFonts w:ascii="Arial" w:hAnsi="Arial" w:cs="Arial"/>
@@ -2808,6 +4288,7 @@
         </w:rPr>
         <w:t>low-side</w:t>
       </w:r>
+      <w:proofErr w:type="spellEnd"/>
       <w:r>
         <w:rPr>
           <w:rFonts w:ascii="Arial" w:hAnsi="Arial" w:cs="Arial"/>
@@ -2822,41 +4303,24 @@
         <w:ind w:firstLine="360"/>
         <w:jc w:val="both"/>
         <w:rPr>
-          <w:rFonts w:ascii="Arial" w:hAnsi="Arial" w:cs="Arial"/>
-        </w:rPr>
-      </w:pPr>
-      <w:r>
-        <w:rPr>
-          <w:rFonts w:ascii="Arial" w:hAnsi="Arial" w:cs="Arial"/>
-        </w:rPr>
-        <w:t xml:space="preserve">Como o escopo da pesquisa foi aprovado para continuidade através do edital remunerado PIBIC/FAPEMIG, os trabalhos futuros (com início imediato após o encerramento deste ciclo em 28/02/2026) aproveitarão as lições aprendidas. A nova abordagem manterá a utilização do </w:t>
-      </w:r>
-      <w:r>
-        <w:rPr>
-          <w:rFonts w:ascii="Arial" w:hAnsi="Arial" w:cs="Arial"/>
-          <w:i/>
-          <w:iCs/>
-        </w:rPr>
-        <w:t>shunt</w:t>
-      </w:r>
-      <w:r>
-        <w:rPr>
-          <w:rFonts w:ascii="Arial" w:hAnsi="Arial" w:cs="Arial"/>
-        </w:rPr>
-        <w:t xml:space="preserve"> de 300A e dos CIs OPA350, mas integrará optoacopladores lineares analógicos (como o modelo HCNR200) para garantir a isolação galvânica completa entre o circuito de potência e o microcontrolador, trazendo a estabilidade de sinal necessária para a estimação do consumo.</w:t>
-      </w:r>
-    </w:p>
-    <w:p>
-      <w:pPr>
-        <w:pStyle w:val="NormalWeb"/>
-        <w:spacing w:line="360" w:lineRule="auto"/>
-        <w:jc w:val="both"/>
-        <w:rPr>
           <w:rFonts w:ascii="Arial" w:eastAsiaTheme="minorHAnsi" w:hAnsi="Arial" w:cs="Arial"/>
           <w:kern w:val="2"/>
           <w:lang w:eastAsia="en-US"/>
         </w:rPr>
       </w:pPr>
+      <w:r>
+        <w:rPr>
+          <w:rFonts w:ascii="Arial" w:hAnsi="Arial" w:cs="Arial"/>
+        </w:rPr>
+        <w:t xml:space="preserve">Como o escopo da pesquisa foi aprovado para continuidade através do edital remunerado PIBIC/FAPEMIG, os trabalhos futuros (com início imediato após o encerramento deste ciclo em 28/02/2026) aproveitarão as lições </w:t>
+      </w:r>
+      <w:r>
+        <w:rPr>
+          <w:rFonts w:ascii="Arial" w:hAnsi="Arial" w:cs="Arial"/>
+        </w:rPr>
+        <w:lastRenderedPageBreak/>
+        <w:t>aprendidas. A nova abordagem manterá a utilização do shunt de 300A, mas substituirá os amplificadores operacionais pelo circuito integrado INA226, um monitor dedicado de tensão e corrente de alta precisão. Para garantir a isolação galvânica completa entre a etapa de potência e o microcontrolador — solucionando os problemas de saturação e ruído de terra identificados —, será empregado um isolador digital nas linhas de comunicação (barramento I2C) do sensor. Essa evolução arquitetônica trará a robustez e a estabilidade de sinal necessárias para a estimação precisa do consumo energético do veículo.</w:t>
+      </w:r>
     </w:p>
     <w:p>
       <w:pPr>
@@ -2906,12 +4370,12 @@
           <w:numId w:val="1"/>
         </w:numPr>
       </w:pPr>
-      <w:bookmarkStart w:id="35" w:name="_Toc200029215"/>
+      <w:bookmarkStart w:id="39" w:name="_Toc224942103"/>
       <w:r>
         <w:lastRenderedPageBreak/>
         <w:t>Referências</w:t>
       </w:r>
-      <w:bookmarkEnd w:id="35"/>
+      <w:bookmarkEnd w:id="39"/>
     </w:p>
     <w:p>
       <w:pPr>
@@ -2933,7 +4397,35 @@
         <w:rPr>
           <w:rFonts w:ascii="Arial" w:hAnsi="Arial" w:cs="Arial"/>
         </w:rPr>
-        <w:t xml:space="preserve"> CARVALHO, Carlos Henrique Ribeiro de; GUEDES, Erivelton Pires. Balanço da primeira década de ação pela segurança no trânsito no Brasil e perspectivas para a segunda década. Brasília, DF: Ipea, nov. 2023. (Dirur: Nota Técnica, 42).</w:t>
+        <w:t xml:space="preserve"> CARVALHO, Carlos Henrique Ribeiro de; GUEDES, </w:t>
+      </w:r>
+      <w:proofErr w:type="spellStart"/>
+      <w:r>
+        <w:rPr>
+          <w:rFonts w:ascii="Arial" w:hAnsi="Arial" w:cs="Arial"/>
+        </w:rPr>
+        <w:t>Erivelton</w:t>
+      </w:r>
+      <w:proofErr w:type="spellEnd"/>
+      <w:r>
+        <w:rPr>
+          <w:rFonts w:ascii="Arial" w:hAnsi="Arial" w:cs="Arial"/>
+        </w:rPr>
+        <w:t xml:space="preserve"> Pires. Balanço da primeira década de ação pela segurança no trânsito no Brasil e perspectivas para a segunda década. Brasília, DF: Ipea, nov. 2023. (</w:t>
+      </w:r>
+      <w:proofErr w:type="spellStart"/>
+      <w:r>
+        <w:rPr>
+          <w:rFonts w:ascii="Arial" w:hAnsi="Arial" w:cs="Arial"/>
+        </w:rPr>
+        <w:t>Dirur</w:t>
+      </w:r>
+      <w:proofErr w:type="spellEnd"/>
+      <w:r>
+        <w:rPr>
+          <w:rFonts w:ascii="Arial" w:hAnsi="Arial" w:cs="Arial"/>
+        </w:rPr>
+        <w:t>: Nota Técnica, 42).</w:t>
       </w:r>
     </w:p>
     <w:p>
@@ -2956,9 +4448,51 @@
         <w:rPr>
           <w:rFonts w:ascii="Arial" w:hAnsi="Arial" w:cs="Arial"/>
         </w:rPr>
-        <w:t xml:space="preserve"> NATIONAL HIGHWAY TRAFFIC SAFETY ADMINISTRATION. Automated Vehicles for Safety. Disponível em: </w:t>
-      </w:r>
-      <w:hyperlink r:id="rId8" w:tgtFrame="_blank" w:history="1">
+        <w:t xml:space="preserve"> NATIONAL HIGHWAY TRAFFIC SAFETY ADMINISTRATION. </w:t>
+      </w:r>
+      <w:proofErr w:type="spellStart"/>
+      <w:r>
+        <w:rPr>
+          <w:rFonts w:ascii="Arial" w:hAnsi="Arial" w:cs="Arial"/>
+        </w:rPr>
+        <w:t>Automated</w:t>
+      </w:r>
+      <w:proofErr w:type="spellEnd"/>
+      <w:r>
+        <w:rPr>
+          <w:rFonts w:ascii="Arial" w:hAnsi="Arial" w:cs="Arial"/>
+        </w:rPr>
+        <w:t xml:space="preserve"> </w:t>
+      </w:r>
+      <w:proofErr w:type="spellStart"/>
+      <w:r>
+        <w:rPr>
+          <w:rFonts w:ascii="Arial" w:hAnsi="Arial" w:cs="Arial"/>
+        </w:rPr>
+        <w:t>Vehicles</w:t>
+      </w:r>
+      <w:proofErr w:type="spellEnd"/>
+      <w:r>
+        <w:rPr>
+          <w:rFonts w:ascii="Arial" w:hAnsi="Arial" w:cs="Arial"/>
+        </w:rPr>
+        <w:t xml:space="preserve"> for </w:t>
+      </w:r>
+      <w:proofErr w:type="spellStart"/>
+      <w:r>
+        <w:rPr>
+          <w:rFonts w:ascii="Arial" w:hAnsi="Arial" w:cs="Arial"/>
+        </w:rPr>
+        <w:t>Safety</w:t>
+      </w:r>
+      <w:proofErr w:type="spellEnd"/>
+      <w:r>
+        <w:rPr>
+          <w:rFonts w:ascii="Arial" w:hAnsi="Arial" w:cs="Arial"/>
+        </w:rPr>
+        <w:t xml:space="preserve">. Disponível em: </w:t>
+      </w:r>
+      <w:hyperlink r:id="rId14" w:tgtFrame="_blank" w:history="1">
         <w:r>
           <w:rPr>
             <w:rStyle w:val="Hyperlink"/>
@@ -2994,9 +4528,149 @@
         <w:rPr>
           <w:rFonts w:ascii="Arial" w:hAnsi="Arial" w:cs="Arial"/>
         </w:rPr>
-        <w:t xml:space="preserve"> Garg, P.; Bansal, D.; Khan, S.; Bhattacharya, S. (2022). “Development of Energy Measurement System for Electrical Vehicle Battery Using Arduino”. Disponível em: </w:t>
-      </w:r>
-      <w:hyperlink r:id="rId9" w:tgtFrame="_blank" w:history="1">
+        <w:t xml:space="preserve"> </w:t>
+      </w:r>
+      <w:proofErr w:type="spellStart"/>
+      <w:r>
+        <w:rPr>
+          <w:rFonts w:ascii="Arial" w:hAnsi="Arial" w:cs="Arial"/>
+        </w:rPr>
+        <w:t>Garg</w:t>
+      </w:r>
+      <w:proofErr w:type="spellEnd"/>
+      <w:r>
+        <w:rPr>
+          <w:rFonts w:ascii="Arial" w:hAnsi="Arial" w:cs="Arial"/>
+        </w:rPr>
+        <w:t xml:space="preserve">, P.; </w:t>
+      </w:r>
+      <w:proofErr w:type="spellStart"/>
+      <w:r>
+        <w:rPr>
+          <w:rFonts w:ascii="Arial" w:hAnsi="Arial" w:cs="Arial"/>
+        </w:rPr>
+        <w:t>Bansal</w:t>
+      </w:r>
+      <w:proofErr w:type="spellEnd"/>
+      <w:r>
+        <w:rPr>
+          <w:rFonts w:ascii="Arial" w:hAnsi="Arial" w:cs="Arial"/>
+        </w:rPr>
+        <w:t xml:space="preserve">, D.; Khan, S.; </w:t>
+      </w:r>
+      <w:proofErr w:type="spellStart"/>
+      <w:r>
+        <w:rPr>
+          <w:rFonts w:ascii="Arial" w:hAnsi="Arial" w:cs="Arial"/>
+        </w:rPr>
+        <w:t>Bhattacharya</w:t>
+      </w:r>
+      <w:proofErr w:type="spellEnd"/>
+      <w:r>
+        <w:rPr>
+          <w:rFonts w:ascii="Arial" w:hAnsi="Arial" w:cs="Arial"/>
+        </w:rPr>
+        <w:t>, S. (2022). “</w:t>
+      </w:r>
+      <w:proofErr w:type="spellStart"/>
+      <w:r>
+        <w:rPr>
+          <w:rFonts w:ascii="Arial" w:hAnsi="Arial" w:cs="Arial"/>
+        </w:rPr>
+        <w:t>Development</w:t>
+      </w:r>
+      <w:proofErr w:type="spellEnd"/>
+      <w:r>
+        <w:rPr>
+          <w:rFonts w:ascii="Arial" w:hAnsi="Arial" w:cs="Arial"/>
+        </w:rPr>
+        <w:t xml:space="preserve"> </w:t>
+      </w:r>
+      <w:proofErr w:type="spellStart"/>
+      <w:r>
+        <w:rPr>
+          <w:rFonts w:ascii="Arial" w:hAnsi="Arial" w:cs="Arial"/>
+        </w:rPr>
+        <w:t>of</w:t>
+      </w:r>
+      <w:proofErr w:type="spellEnd"/>
+      <w:r>
+        <w:rPr>
+          <w:rFonts w:ascii="Arial" w:hAnsi="Arial" w:cs="Arial"/>
+        </w:rPr>
+        <w:t xml:space="preserve"> Energy </w:t>
+      </w:r>
+      <w:proofErr w:type="spellStart"/>
+      <w:r>
+        <w:rPr>
+          <w:rFonts w:ascii="Arial" w:hAnsi="Arial" w:cs="Arial"/>
+        </w:rPr>
+        <w:t>Measurement</w:t>
+      </w:r>
+      <w:proofErr w:type="spellEnd"/>
+      <w:r>
+        <w:rPr>
+          <w:rFonts w:ascii="Arial" w:hAnsi="Arial" w:cs="Arial"/>
+        </w:rPr>
+        <w:t xml:space="preserve"> System for </w:t>
+      </w:r>
+      <w:proofErr w:type="spellStart"/>
+      <w:r>
+        <w:rPr>
+          <w:rFonts w:ascii="Arial" w:hAnsi="Arial" w:cs="Arial"/>
+        </w:rPr>
+        <w:t>Electrical</w:t>
+      </w:r>
+      <w:proofErr w:type="spellEnd"/>
+      <w:r>
+        <w:rPr>
+          <w:rFonts w:ascii="Arial" w:hAnsi="Arial" w:cs="Arial"/>
+        </w:rPr>
+        <w:t xml:space="preserve"> </w:t>
+      </w:r>
+      <w:proofErr w:type="spellStart"/>
+      <w:r>
+        <w:rPr>
+          <w:rFonts w:ascii="Arial" w:hAnsi="Arial" w:cs="Arial"/>
+        </w:rPr>
+        <w:t>Vehicle</w:t>
+      </w:r>
+      <w:proofErr w:type="spellEnd"/>
+      <w:r>
+        <w:rPr>
+          <w:rFonts w:ascii="Arial" w:hAnsi="Arial" w:cs="Arial"/>
+        </w:rPr>
+        <w:t xml:space="preserve"> </w:t>
+      </w:r>
+      <w:proofErr w:type="spellStart"/>
+      <w:r>
+        <w:rPr>
+          <w:rFonts w:ascii="Arial" w:hAnsi="Arial" w:cs="Arial"/>
+        </w:rPr>
+        <w:t>Battery</w:t>
+      </w:r>
+      <w:proofErr w:type="spellEnd"/>
+      <w:r>
+        <w:rPr>
+          <w:rFonts w:ascii="Arial" w:hAnsi="Arial" w:cs="Arial"/>
+        </w:rPr>
+        <w:t xml:space="preserve"> </w:t>
+      </w:r>
+      <w:proofErr w:type="spellStart"/>
+      <w:r>
+        <w:rPr>
+          <w:rFonts w:ascii="Arial" w:hAnsi="Arial" w:cs="Arial"/>
+        </w:rPr>
+        <w:t>Using</w:t>
+      </w:r>
+      <w:proofErr w:type="spellEnd"/>
+      <w:r>
+        <w:rPr>
+          <w:rFonts w:ascii="Arial" w:hAnsi="Arial" w:cs="Arial"/>
+        </w:rPr>
+        <w:t xml:space="preserve"> Arduino”. Disponível em: </w:t>
+      </w:r>
+      <w:hyperlink r:id="rId15" w:tgtFrame="_blank" w:history="1">
         <w:r>
           <w:rPr>
             <w:rStyle w:val="Hyperlink"/>
@@ -3026,9 +4700,121 @@
         <w:rPr>
           <w:rFonts w:ascii="Arial" w:hAnsi="Arial" w:cs="Arial"/>
         </w:rPr>
-        <w:t xml:space="preserve"> Echavarría, S.; Mejía-Gutiérrez, R. e Montoya, A. (2020). “Development of an IoT Platform for Monitoring Electric Vehicle Behaviour”. Disponível em: </w:t>
-      </w:r>
-      <w:hyperlink r:id="rId10" w:tgtFrame="_blank" w:history="1">
+        <w:t xml:space="preserve"> </w:t>
+      </w:r>
+      <w:proofErr w:type="spellStart"/>
+      <w:r>
+        <w:rPr>
+          <w:rFonts w:ascii="Arial" w:hAnsi="Arial" w:cs="Arial"/>
+        </w:rPr>
+        <w:t>Echavarría</w:t>
+      </w:r>
+      <w:proofErr w:type="spellEnd"/>
+      <w:r>
+        <w:rPr>
+          <w:rFonts w:ascii="Arial" w:hAnsi="Arial" w:cs="Arial"/>
+        </w:rPr>
+        <w:t>, S.; Mejía-Gutiérrez, R. e Montoya, A. (2020). “</w:t>
+      </w:r>
+      <w:proofErr w:type="spellStart"/>
+      <w:r>
+        <w:rPr>
+          <w:rFonts w:ascii="Arial" w:hAnsi="Arial" w:cs="Arial"/>
+        </w:rPr>
+        <w:t>Development</w:t>
+      </w:r>
+      <w:proofErr w:type="spellEnd"/>
+      <w:r>
+        <w:rPr>
+          <w:rFonts w:ascii="Arial" w:hAnsi="Arial" w:cs="Arial"/>
+        </w:rPr>
+        <w:t xml:space="preserve"> </w:t>
+      </w:r>
+      <w:proofErr w:type="spellStart"/>
+      <w:r>
+        <w:rPr>
+          <w:rFonts w:ascii="Arial" w:hAnsi="Arial" w:cs="Arial"/>
+        </w:rPr>
+        <w:t>of</w:t>
+      </w:r>
+      <w:proofErr w:type="spellEnd"/>
+      <w:r>
+        <w:rPr>
+          <w:rFonts w:ascii="Arial" w:hAnsi="Arial" w:cs="Arial"/>
+        </w:rPr>
+        <w:t xml:space="preserve"> </w:t>
+      </w:r>
+      <w:proofErr w:type="spellStart"/>
+      <w:r>
+        <w:rPr>
+          <w:rFonts w:ascii="Arial" w:hAnsi="Arial" w:cs="Arial"/>
+        </w:rPr>
+        <w:t>an</w:t>
+      </w:r>
+      <w:proofErr w:type="spellEnd"/>
+      <w:r>
+        <w:rPr>
+          <w:rFonts w:ascii="Arial" w:hAnsi="Arial" w:cs="Arial"/>
+        </w:rPr>
+        <w:t xml:space="preserve"> </w:t>
+      </w:r>
+      <w:proofErr w:type="spellStart"/>
+      <w:r>
+        <w:rPr>
+          <w:rFonts w:ascii="Arial" w:hAnsi="Arial" w:cs="Arial"/>
+        </w:rPr>
+        <w:t>IoT</w:t>
+      </w:r>
+      <w:proofErr w:type="spellEnd"/>
+      <w:r>
+        <w:rPr>
+          <w:rFonts w:ascii="Arial" w:hAnsi="Arial" w:cs="Arial"/>
+        </w:rPr>
+        <w:t xml:space="preserve"> Platform for </w:t>
+      </w:r>
+      <w:proofErr w:type="spellStart"/>
+      <w:r>
+        <w:rPr>
+          <w:rFonts w:ascii="Arial" w:hAnsi="Arial" w:cs="Arial"/>
+        </w:rPr>
+        <w:t>Monitoring</w:t>
+      </w:r>
+      <w:proofErr w:type="spellEnd"/>
+      <w:r>
+        <w:rPr>
+          <w:rFonts w:ascii="Arial" w:hAnsi="Arial" w:cs="Arial"/>
+        </w:rPr>
+        <w:t xml:space="preserve"> Electric </w:t>
+      </w:r>
+      <w:proofErr w:type="spellStart"/>
+      <w:r>
+        <w:rPr>
+          <w:rFonts w:ascii="Arial" w:hAnsi="Arial" w:cs="Arial"/>
+        </w:rPr>
+        <w:t>Vehicle</w:t>
+      </w:r>
+      <w:proofErr w:type="spellEnd"/>
+      <w:r>
+        <w:rPr>
+          <w:rFonts w:ascii="Arial" w:hAnsi="Arial" w:cs="Arial"/>
+        </w:rPr>
+        <w:t xml:space="preserve"> </w:t>
+      </w:r>
+      <w:proofErr w:type="spellStart"/>
+      <w:r>
+        <w:rPr>
+          <w:rFonts w:ascii="Arial" w:hAnsi="Arial" w:cs="Arial"/>
+        </w:rPr>
+        <w:t>Behaviour</w:t>
+      </w:r>
+      <w:proofErr w:type="spellEnd"/>
+      <w:r>
+        <w:rPr>
+          <w:rFonts w:ascii="Arial" w:hAnsi="Arial" w:cs="Arial"/>
+        </w:rPr>
+        <w:t xml:space="preserve">”. Disponível em: </w:t>
+      </w:r>
+      <w:hyperlink r:id="rId16" w:tgtFrame="_blank" w:history="1">
         <w:r>
           <w:rPr>
             <w:rStyle w:val="Hyperlink"/>
@@ -3058,9 +4844,219 @@
         <w:rPr>
           <w:rFonts w:ascii="Arial" w:hAnsi="Arial" w:cs="Arial"/>
         </w:rPr>
-        <w:t xml:space="preserve"> Achariyaviriya, W.; Wongsapai, W.; Janpoom, K.; Katongtung, T.; Mona, Y.; Tippayawong, N. e Suttakul, P. (2023). “Estimating Energy Consumption of Battery Electric Vehicles Using Vehicle Sensor Data and Machine Learning Approaches”. Disponível em: </w:t>
-      </w:r>
-      <w:hyperlink r:id="rId11" w:tgtFrame="_blank" w:history="1">
+        <w:t xml:space="preserve"> </w:t>
+      </w:r>
+      <w:proofErr w:type="spellStart"/>
+      <w:r>
+        <w:rPr>
+          <w:rFonts w:ascii="Arial" w:hAnsi="Arial" w:cs="Arial"/>
+        </w:rPr>
+        <w:t>Achariyaviriya</w:t>
+      </w:r>
+      <w:proofErr w:type="spellEnd"/>
+      <w:r>
+        <w:rPr>
+          <w:rFonts w:ascii="Arial" w:hAnsi="Arial" w:cs="Arial"/>
+        </w:rPr>
+        <w:t xml:space="preserve">, W.; </w:t>
+      </w:r>
+      <w:proofErr w:type="spellStart"/>
+      <w:r>
+        <w:rPr>
+          <w:rFonts w:ascii="Arial" w:hAnsi="Arial" w:cs="Arial"/>
+        </w:rPr>
+        <w:t>Wongsapai</w:t>
+      </w:r>
+      <w:proofErr w:type="spellEnd"/>
+      <w:r>
+        <w:rPr>
+          <w:rFonts w:ascii="Arial" w:hAnsi="Arial" w:cs="Arial"/>
+        </w:rPr>
+        <w:t xml:space="preserve">, W.; </w:t>
+      </w:r>
+      <w:proofErr w:type="spellStart"/>
+      <w:r>
+        <w:rPr>
+          <w:rFonts w:ascii="Arial" w:hAnsi="Arial" w:cs="Arial"/>
+        </w:rPr>
+        <w:t>Janpoom</w:t>
+      </w:r>
+      <w:proofErr w:type="spellEnd"/>
+      <w:r>
+        <w:rPr>
+          <w:rFonts w:ascii="Arial" w:hAnsi="Arial" w:cs="Arial"/>
+        </w:rPr>
+        <w:t xml:space="preserve">, K.; </w:t>
+      </w:r>
+      <w:proofErr w:type="spellStart"/>
+      <w:r>
+        <w:rPr>
+          <w:rFonts w:ascii="Arial" w:hAnsi="Arial" w:cs="Arial"/>
+        </w:rPr>
+        <w:t>Katongtung</w:t>
+      </w:r>
+      <w:proofErr w:type="spellEnd"/>
+      <w:r>
+        <w:rPr>
+          <w:rFonts w:ascii="Arial" w:hAnsi="Arial" w:cs="Arial"/>
+        </w:rPr>
+        <w:t xml:space="preserve">, T.; Mona, Y.; </w:t>
+      </w:r>
+      <w:proofErr w:type="spellStart"/>
+      <w:r>
+        <w:rPr>
+          <w:rFonts w:ascii="Arial" w:hAnsi="Arial" w:cs="Arial"/>
+        </w:rPr>
+        <w:t>Tippayawong</w:t>
+      </w:r>
+      <w:proofErr w:type="spellEnd"/>
+      <w:r>
+        <w:rPr>
+          <w:rFonts w:ascii="Arial" w:hAnsi="Arial" w:cs="Arial"/>
+        </w:rPr>
+        <w:t xml:space="preserve">, N. e </w:t>
+      </w:r>
+      <w:proofErr w:type="spellStart"/>
+      <w:r>
+        <w:rPr>
+          <w:rFonts w:ascii="Arial" w:hAnsi="Arial" w:cs="Arial"/>
+        </w:rPr>
+        <w:t>Suttakul</w:t>
+      </w:r>
+      <w:proofErr w:type="spellEnd"/>
+      <w:r>
+        <w:rPr>
+          <w:rFonts w:ascii="Arial" w:hAnsi="Arial" w:cs="Arial"/>
+        </w:rPr>
+        <w:t>, P. (2023). “</w:t>
+      </w:r>
+      <w:proofErr w:type="spellStart"/>
+      <w:r>
+        <w:rPr>
+          <w:rFonts w:ascii="Arial" w:hAnsi="Arial" w:cs="Arial"/>
+        </w:rPr>
+        <w:t>Estimating</w:t>
+      </w:r>
+      <w:proofErr w:type="spellEnd"/>
+      <w:r>
+        <w:rPr>
+          <w:rFonts w:ascii="Arial" w:hAnsi="Arial" w:cs="Arial"/>
+        </w:rPr>
+        <w:t xml:space="preserve"> Energy </w:t>
+      </w:r>
+      <w:proofErr w:type="spellStart"/>
+      <w:r>
+        <w:rPr>
+          <w:rFonts w:ascii="Arial" w:hAnsi="Arial" w:cs="Arial"/>
+        </w:rPr>
+        <w:t>Consumption</w:t>
+      </w:r>
+      <w:proofErr w:type="spellEnd"/>
+      <w:r>
+        <w:rPr>
+          <w:rFonts w:ascii="Arial" w:hAnsi="Arial" w:cs="Arial"/>
+        </w:rPr>
+        <w:t xml:space="preserve"> </w:t>
+      </w:r>
+      <w:proofErr w:type="spellStart"/>
+      <w:r>
+        <w:rPr>
+          <w:rFonts w:ascii="Arial" w:hAnsi="Arial" w:cs="Arial"/>
+        </w:rPr>
+        <w:t>of</w:t>
+      </w:r>
+      <w:proofErr w:type="spellEnd"/>
+      <w:r>
+        <w:rPr>
+          <w:rFonts w:ascii="Arial" w:hAnsi="Arial" w:cs="Arial"/>
+        </w:rPr>
+        <w:t xml:space="preserve"> </w:t>
+      </w:r>
+      <w:proofErr w:type="spellStart"/>
+      <w:r>
+        <w:rPr>
+          <w:rFonts w:ascii="Arial" w:hAnsi="Arial" w:cs="Arial"/>
+        </w:rPr>
+        <w:t>Battery</w:t>
+      </w:r>
+      <w:proofErr w:type="spellEnd"/>
+      <w:r>
+        <w:rPr>
+          <w:rFonts w:ascii="Arial" w:hAnsi="Arial" w:cs="Arial"/>
+        </w:rPr>
+        <w:t xml:space="preserve"> Electric </w:t>
+      </w:r>
+      <w:proofErr w:type="spellStart"/>
+      <w:r>
+        <w:rPr>
+          <w:rFonts w:ascii="Arial" w:hAnsi="Arial" w:cs="Arial"/>
+        </w:rPr>
+        <w:t>Vehicles</w:t>
+      </w:r>
+      <w:proofErr w:type="spellEnd"/>
+      <w:r>
+        <w:rPr>
+          <w:rFonts w:ascii="Arial" w:hAnsi="Arial" w:cs="Arial"/>
+        </w:rPr>
+        <w:t xml:space="preserve"> </w:t>
+      </w:r>
+      <w:proofErr w:type="spellStart"/>
+      <w:r>
+        <w:rPr>
+          <w:rFonts w:ascii="Arial" w:hAnsi="Arial" w:cs="Arial"/>
+        </w:rPr>
+        <w:t>Using</w:t>
+      </w:r>
+      <w:proofErr w:type="spellEnd"/>
+      <w:r>
+        <w:rPr>
+          <w:rFonts w:ascii="Arial" w:hAnsi="Arial" w:cs="Arial"/>
+        </w:rPr>
+        <w:t xml:space="preserve"> </w:t>
+      </w:r>
+      <w:proofErr w:type="spellStart"/>
+      <w:r>
+        <w:rPr>
+          <w:rFonts w:ascii="Arial" w:hAnsi="Arial" w:cs="Arial"/>
+        </w:rPr>
+        <w:t>Vehicle</w:t>
+      </w:r>
+      <w:proofErr w:type="spellEnd"/>
+      <w:r>
+        <w:rPr>
+          <w:rFonts w:ascii="Arial" w:hAnsi="Arial" w:cs="Arial"/>
+        </w:rPr>
+        <w:t xml:space="preserve"> Sensor Data </w:t>
+      </w:r>
+      <w:proofErr w:type="spellStart"/>
+      <w:r>
+        <w:rPr>
+          <w:rFonts w:ascii="Arial" w:hAnsi="Arial" w:cs="Arial"/>
+        </w:rPr>
+        <w:t>and</w:t>
+      </w:r>
+      <w:proofErr w:type="spellEnd"/>
+      <w:r>
+        <w:rPr>
+          <w:rFonts w:ascii="Arial" w:hAnsi="Arial" w:cs="Arial"/>
+        </w:rPr>
+        <w:t xml:space="preserve"> </w:t>
+      </w:r>
+      <w:proofErr w:type="spellStart"/>
+      <w:r>
+        <w:rPr>
+          <w:rFonts w:ascii="Arial" w:hAnsi="Arial" w:cs="Arial"/>
+        </w:rPr>
+        <w:t>Machine</w:t>
+      </w:r>
+      <w:proofErr w:type="spellEnd"/>
+      <w:r>
+        <w:rPr>
+          <w:rFonts w:ascii="Arial" w:hAnsi="Arial" w:cs="Arial"/>
+        </w:rPr>
+        <w:t xml:space="preserve"> Learning Approaches”. Disponível em: </w:t>
+      </w:r>
+      <w:hyperlink r:id="rId17" w:tgtFrame="_blank" w:history="1">
         <w:r>
           <w:rPr>
             <w:rStyle w:val="Hyperlink"/>
@@ -3092,7 +5088,7 @@
       </w:r>
     </w:p>
     <w:sectPr>
-      <w:footerReference w:type="default" r:id="rId12"/>
+      <w:footerReference w:type="default" r:id="rId18"/>
       <w:type w:val="continuous"/>
       <w:pgSz w:w="11906" w:h="16838"/>
       <w:pgMar w:top="1418" w:right="1701" w:bottom="1418" w:left="1701" w:header="709" w:footer="709" w:gutter="0"/>
@@ -3104,7 +5100,7 @@
 </file>
 
 <file path=word/endnotes.xml><?xml version="1.0" encoding="utf-8"?>
-<w:endnotes xmlns:ve="http://schemas.openxmlformats.org/markup-compatibility/2006" xmlns:o="urn:schemas-microsoft-com:office:office" xmlns:r="http://schemas.openxmlformats.org/officeDocument/2006/relationships" xmlns:m="http://schemas.openxmlformats.org/officeDocument/2006/math" xmlns:v="urn:schemas-microsoft-com:vml" xmlns:wp="http://schemas.openxmlformats.org/drawingml/2006/wordprocessingDrawing" xmlns:w10="urn:schemas-microsoft-com:office:word" xmlns:w="http://schemas.openxmlformats.org/wordprocessingml/2006/main" xmlns:wne="http://schemas.microsoft.com/office/word/2006/wordml">
+<w:endnotes xmlns:wpc="http://schemas.microsoft.com/office/word/2010/wordprocessingCanvas" xmlns:cx="http://schemas.microsoft.com/office/drawing/2014/chartex" xmlns:cx1="http://schemas.microsoft.com/office/drawing/2015/9/8/chartex" xmlns:cx2="http://schemas.microsoft.com/office/drawing/2015/10/21/chartex" xmlns:cx3="http://schemas.microsoft.com/office/drawing/2016/5/9/chartex" xmlns:cx4="http://schemas.microsoft.com/office/drawing/2016/5/10/chartex" xmlns:cx5="http://schemas.microsoft.com/office/drawing/2016/5/11/chartex" xmlns:cx6="http://schemas.microsoft.com/office/drawing/2016/5/12/chartex" xmlns:cx7="http://schemas.microsoft.com/office/drawing/2016/5/13/chartex" xmlns:cx8="http://schemas.microsoft.com/office/drawing/2016/5/14/chartex" xmlns:mc="http://schemas.openxmlformats.org/markup-compatibility/2006" xmlns:aink="http://schemas.microsoft.com/office/drawing/2016/ink" xmlns:am3d="http://schemas.microsoft.com/office/drawing/2017/model3d" xmlns:o="urn:schemas-microsoft-com:office:office" xmlns:r="http://schemas.openxmlformats.org/officeDocument/2006/relationships" xmlns:m="http://schemas.openxmlformats.org/officeDocument/2006/math" xmlns:v="urn:schemas-microsoft-com:vml" xmlns:wp14="http://schemas.microsoft.com/office/word/2010/wordprocessingDrawing" xmlns:wp="http://schemas.openxmlformats.org/drawingml/2006/wordprocessingDrawing" xmlns:w10="urn:schemas-microsoft-com:office:word" xmlns:w="http://schemas.openxmlformats.org/wordprocessingml/2006/main" xmlns:w14="http://schemas.microsoft.com/office/word/2010/wordml" xmlns:w15="http://schemas.microsoft.com/office/word/2012/wordml" xmlns:w16cex="http://schemas.microsoft.com/office/word/2018/wordml/cex" xmlns:w16cid="http://schemas.microsoft.com/office/word/2016/wordml/cid" xmlns:w16="http://schemas.microsoft.com/office/word/2018/wordml" xmlns:w16sdtdh="http://schemas.microsoft.com/office/word/2020/wordml/sdtdatahash" xmlns:w16se="http://schemas.microsoft.com/office/word/2015/wordml/symex" xmlns:wpg="http://schemas.microsoft.com/office/word/2010/wordprocessingGroup" xmlns:wpi="http://schemas.microsoft.com/office/word/2010/wordprocessingInk" xmlns:wne="http://schemas.microsoft.com/office/word/2006/wordml" xmlns:wps="http://schemas.microsoft.com/office/word/2010/wordprocessingShape" mc:Ignorable="w14 w15 w16se w16cid w16 w16cex w16sdtdh wp14">
   <w:endnote w:type="separator" w:id="-1">
     <w:p>
       <w:pPr>
@@ -3129,7 +5125,7 @@
 </file>
 
 <file path=word/footer1.xml><?xml version="1.0" encoding="utf-8"?>
-<w:ftr xmlns:ve="http://schemas.openxmlformats.org/markup-compatibility/2006" xmlns:o="urn:schemas-microsoft-com:office:office" xmlns:r="http://schemas.openxmlformats.org/officeDocument/2006/relationships" xmlns:m="http://schemas.openxmlformats.org/officeDocument/2006/math" xmlns:v="urn:schemas-microsoft-com:vml" xmlns:wp="http://schemas.openxmlformats.org/drawingml/2006/wordprocessingDrawing" xmlns:w10="urn:schemas-microsoft-com:office:word" xmlns:w="http://schemas.openxmlformats.org/wordprocessingml/2006/main" xmlns:wne="http://schemas.microsoft.com/office/word/2006/wordml">
+<w:ftr xmlns:wpc="http://schemas.microsoft.com/office/word/2010/wordprocessingCanvas" xmlns:cx="http://schemas.microsoft.com/office/drawing/2014/chartex" xmlns:cx1="http://schemas.microsoft.com/office/drawing/2015/9/8/chartex" xmlns:cx2="http://schemas.microsoft.com/office/drawing/2015/10/21/chartex" xmlns:cx3="http://schemas.microsoft.com/office/drawing/2016/5/9/chartex" xmlns:cx4="http://schemas.microsoft.com/office/drawing/2016/5/10/chartex" xmlns:cx5="http://schemas.microsoft.com/office/drawing/2016/5/11/chartex" xmlns:cx6="http://schemas.microsoft.com/office/drawing/2016/5/12/chartex" xmlns:cx7="http://schemas.microsoft.com/office/drawing/2016/5/13/chartex" xmlns:cx8="http://schemas.microsoft.com/office/drawing/2016/5/14/chartex" xmlns:mc="http://schemas.openxmlformats.org/markup-compatibility/2006" xmlns:aink="http://schemas.microsoft.com/office/drawing/2016/ink" xmlns:am3d="http://schemas.microsoft.com/office/drawing/2017/model3d" xmlns:o="urn:schemas-microsoft-com:office:office" xmlns:r="http://schemas.openxmlformats.org/officeDocument/2006/relationships" xmlns:m="http://schemas.openxmlformats.org/officeDocument/2006/math" xmlns:v="urn:schemas-microsoft-com:vml" xmlns:wp14="http://schemas.microsoft.com/office/word/2010/wordprocessingDrawing" xmlns:wp="http://schemas.openxmlformats.org/drawingml/2006/wordprocessingDrawing" xmlns:w10="urn:schemas-microsoft-com:office:word" xmlns:w="http://schemas.openxmlformats.org/wordprocessingml/2006/main" xmlns:w14="http://schemas.microsoft.com/office/word/2010/wordml" xmlns:w15="http://schemas.microsoft.com/office/word/2012/wordml" xmlns:w16cex="http://schemas.microsoft.com/office/word/2018/wordml/cex" xmlns:w16cid="http://schemas.microsoft.com/office/word/2016/wordml/cid" xmlns:w16="http://schemas.microsoft.com/office/word/2018/wordml" xmlns:w16sdtdh="http://schemas.microsoft.com/office/word/2020/wordml/sdtdatahash" xmlns:w16se="http://schemas.microsoft.com/office/word/2015/wordml/symex" xmlns:wpg="http://schemas.microsoft.com/office/word/2010/wordprocessingGroup" xmlns:wpi="http://schemas.microsoft.com/office/word/2010/wordprocessingInk" xmlns:wne="http://schemas.microsoft.com/office/word/2006/wordml" xmlns:wps="http://schemas.microsoft.com/office/word/2010/wordprocessingShape" mc:Ignorable="w14 w15 w16se w16cid w16 w16cex w16sdtdh wp14">
   <w:sdt>
     <w:sdtPr>
       <w:id w:val="701744015"/>
@@ -3175,7 +5171,7 @@
 </file>
 
 <file path=word/footnotes.xml><?xml version="1.0" encoding="utf-8"?>
-<w:footnotes xmlns:ve="http://schemas.openxmlformats.org/markup-compatibility/2006" xmlns:o="urn:schemas-microsoft-com:office:office" xmlns:r="http://schemas.openxmlformats.org/officeDocument/2006/relationships" xmlns:m="http://schemas.openxmlformats.org/officeDocument/2006/math" xmlns:v="urn:schemas-microsoft-com:vml" xmlns:wp="http://schemas.openxmlformats.org/drawingml/2006/wordprocessingDrawing" xmlns:w10="urn:schemas-microsoft-com:office:word" xmlns:w="http://schemas.openxmlformats.org/wordprocessingml/2006/main" xmlns:wne="http://schemas.microsoft.com/office/word/2006/wordml">
+<w:footnotes xmlns:wpc="http://schemas.microsoft.com/office/word/2010/wordprocessingCanvas" xmlns:cx="http://schemas.microsoft.com/office/drawing/2014/chartex" xmlns:cx1="http://schemas.microsoft.com/office/drawing/2015/9/8/chartex" xmlns:cx2="http://schemas.microsoft.com/office/drawing/2015/10/21/chartex" xmlns:cx3="http://schemas.microsoft.com/office/drawing/2016/5/9/chartex" xmlns:cx4="http://schemas.microsoft.com/office/drawing/2016/5/10/chartex" xmlns:cx5="http://schemas.microsoft.com/office/drawing/2016/5/11/chartex" xmlns:cx6="http://schemas.microsoft.com/office/drawing/2016/5/12/chartex" xmlns:cx7="http://schemas.microsoft.com/office/drawing/2016/5/13/chartex" xmlns:cx8="http://schemas.microsoft.com/office/drawing/2016/5/14/chartex" xmlns:mc="http://schemas.openxmlformats.org/markup-compatibility/2006" xmlns:aink="http://schemas.microsoft.com/office/drawing/2016/ink" xmlns:am3d="http://schemas.microsoft.com/office/drawing/2017/model3d" xmlns:o="urn:schemas-microsoft-com:office:office" xmlns:r="http://schemas.openxmlformats.org/officeDocument/2006/relationships" xmlns:m="http://schemas.openxmlformats.org/officeDocument/2006/math" xmlns:v="urn:schemas-microsoft-com:vml" xmlns:wp14="http://schemas.microsoft.com/office/word/2010/wordprocessingDrawing" xmlns:wp="http://schemas.openxmlformats.org/drawingml/2006/wordprocessingDrawing" xmlns:w10="urn:schemas-microsoft-com:office:word" xmlns:w="http://schemas.openxmlformats.org/wordprocessingml/2006/main" xmlns:w14="http://schemas.microsoft.com/office/word/2010/wordml" xmlns:w15="http://schemas.microsoft.com/office/word/2012/wordml" xmlns:w16cex="http://schemas.microsoft.com/office/word/2018/wordml/cex" xmlns:w16cid="http://schemas.microsoft.com/office/word/2016/wordml/cid" xmlns:w16="http://schemas.microsoft.com/office/word/2018/wordml" xmlns:w16sdtdh="http://schemas.microsoft.com/office/word/2020/wordml/sdtdatahash" xmlns:w16se="http://schemas.microsoft.com/office/word/2015/wordml/symex" xmlns:wpg="http://schemas.microsoft.com/office/word/2010/wordprocessingGroup" xmlns:wpi="http://schemas.microsoft.com/office/word/2010/wordprocessingInk" xmlns:wne="http://schemas.microsoft.com/office/word/2006/wordml" xmlns:wps="http://schemas.microsoft.com/office/word/2010/wordprocessingShape" mc:Ignorable="w14 w15 w16se w16cid w16 w16cex w16sdtdh wp14">
   <w:footnote w:type="separator" w:id="-1">
     <w:p>
       <w:pPr>
@@ -3200,8 +5196,8 @@
 </file>
 
 <file path=word/numbering.xml><?xml version="1.0" encoding="utf-8"?>
-<w:numbering xmlns:ve="http://schemas.openxmlformats.org/markup-compatibility/2006" xmlns:o="urn:schemas-microsoft-com:office:office" xmlns:r="http://schemas.openxmlformats.org/officeDocument/2006/relationships" xmlns:m="http://schemas.openxmlformats.org/officeDocument/2006/math" xmlns:v="urn:schemas-microsoft-com:vml" xmlns:wp="http://schemas.openxmlformats.org/drawingml/2006/wordprocessingDrawing" xmlns:w10="urn:schemas-microsoft-com:office:word" xmlns:w="http://schemas.openxmlformats.org/wordprocessingml/2006/main" xmlns:wne="http://schemas.microsoft.com/office/word/2006/wordml">
-  <w:abstractNum w:abstractNumId="0">
+<w:numbering xmlns:wpc="http://schemas.microsoft.com/office/word/2010/wordprocessingCanvas" xmlns:cx="http://schemas.microsoft.com/office/drawing/2014/chartex" xmlns:cx1="http://schemas.microsoft.com/office/drawing/2015/9/8/chartex" xmlns:cx2="http://schemas.microsoft.com/office/drawing/2015/10/21/chartex" xmlns:cx3="http://schemas.microsoft.com/office/drawing/2016/5/9/chartex" xmlns:cx4="http://schemas.microsoft.com/office/drawing/2016/5/10/chartex" xmlns:cx5="http://schemas.microsoft.com/office/drawing/2016/5/11/chartex" xmlns:cx6="http://schemas.microsoft.com/office/drawing/2016/5/12/chartex" xmlns:cx7="http://schemas.microsoft.com/office/drawing/2016/5/13/chartex" xmlns:cx8="http://schemas.microsoft.com/office/drawing/2016/5/14/chartex" xmlns:mc="http://schemas.openxmlformats.org/markup-compatibility/2006" xmlns:aink="http://schemas.microsoft.com/office/drawing/2016/ink" xmlns:am3d="http://schemas.microsoft.com/office/drawing/2017/model3d" xmlns:o="urn:schemas-microsoft-com:office:office" xmlns:r="http://schemas.openxmlformats.org/officeDocument/2006/relationships" xmlns:m="http://schemas.openxmlformats.org/officeDocument/2006/math" xmlns:v="urn:schemas-microsoft-com:vml" xmlns:wp14="http://schemas.microsoft.com/office/word/2010/wordprocessingDrawing" xmlns:wp="http://schemas.openxmlformats.org/drawingml/2006/wordprocessingDrawing" xmlns:w10="urn:schemas-microsoft-com:office:word" xmlns:w="http://schemas.openxmlformats.org/wordprocessingml/2006/main" xmlns:w14="http://schemas.microsoft.com/office/word/2010/wordml" xmlns:w15="http://schemas.microsoft.com/office/word/2012/wordml" xmlns:w16cex="http://schemas.microsoft.com/office/word/2018/wordml/cex" xmlns:w16cid="http://schemas.microsoft.com/office/word/2016/wordml/cid" xmlns:w16="http://schemas.microsoft.com/office/word/2018/wordml" xmlns:w16sdtdh="http://schemas.microsoft.com/office/word/2020/wordml/sdtdatahash" xmlns:w16se="http://schemas.microsoft.com/office/word/2015/wordml/symex" xmlns:wpg="http://schemas.microsoft.com/office/word/2010/wordprocessingGroup" xmlns:wpi="http://schemas.microsoft.com/office/word/2010/wordprocessingInk" xmlns:wne="http://schemas.microsoft.com/office/word/2006/wordml" xmlns:wps="http://schemas.microsoft.com/office/word/2010/wordprocessingShape" mc:Ignorable="w14 w15 w16se w16cid w16 w16cex w16sdtdh wp14">
+  <w:abstractNum w:abstractNumId="0" w15:restartNumberingAfterBreak="0">
     <w:nsid w:val="19A32A03"/>
     <w:multiLevelType w:val="hybridMultilevel"/>
     <w:tmpl w:val="EBDAC5C8"/>
@@ -3287,7 +5283,7 @@
       </w:pPr>
     </w:lvl>
   </w:abstractNum>
-  <w:abstractNum w:abstractNumId="1">
+  <w:abstractNum w:abstractNumId="1" w15:restartNumberingAfterBreak="0">
     <w:nsid w:val="34167606"/>
     <w:multiLevelType w:val="multilevel"/>
     <w:tmpl w:val="D05E49EE"/>
@@ -3374,7 +5370,7 @@
       </w:pPr>
     </w:lvl>
   </w:abstractNum>
-  <w:abstractNum w:abstractNumId="2">
+  <w:abstractNum w:abstractNumId="2" w15:restartNumberingAfterBreak="0">
     <w:nsid w:val="585E4D7F"/>
     <w:multiLevelType w:val="hybridMultilevel"/>
     <w:tmpl w:val="AC18B33A"/>
@@ -3487,7 +5483,7 @@
       </w:rPr>
     </w:lvl>
   </w:abstractNum>
-  <w:abstractNum w:abstractNumId="3">
+  <w:abstractNum w:abstractNumId="3" w15:restartNumberingAfterBreak="0">
     <w:nsid w:val="5D142245"/>
     <w:multiLevelType w:val="multilevel"/>
     <w:tmpl w:val="F90021AA"/>
@@ -3636,7 +5632,7 @@
       </w:rPr>
     </w:lvl>
   </w:abstractNum>
-  <w:abstractNum w:abstractNumId="4">
+  <w:abstractNum w:abstractNumId="4" w15:restartNumberingAfterBreak="0">
     <w:nsid w:val="7F6C1632"/>
     <w:multiLevelType w:val="multilevel"/>
     <w:tmpl w:val="5F466994"/>
@@ -3804,7 +5800,7 @@
 </file>
 
 <file path=word/styles.xml><?xml version="1.0" encoding="utf-8"?>
-<w:styles xmlns:r="http://schemas.openxmlformats.org/officeDocument/2006/relationships" xmlns:w="http://schemas.openxmlformats.org/wordprocessingml/2006/main">
+<w:styles xmlns:mc="http://schemas.openxmlformats.org/markup-compatibility/2006" xmlns:r="http://schemas.openxmlformats.org/officeDocument/2006/relationships" xmlns:w="http://schemas.openxmlformats.org/wordprocessingml/2006/main" xmlns:w14="http://schemas.microsoft.com/office/word/2010/wordml" xmlns:w15="http://schemas.microsoft.com/office/word/2012/wordml" xmlns:w16cex="http://schemas.microsoft.com/office/word/2018/wordml/cex" xmlns:w16cid="http://schemas.microsoft.com/office/word/2016/wordml/cid" xmlns:w16="http://schemas.microsoft.com/office/word/2018/wordml" xmlns:w16sdtdh="http://schemas.microsoft.com/office/word/2020/wordml/sdtdatahash" xmlns:w16se="http://schemas.microsoft.com/office/word/2015/wordml/symex" mc:Ignorable="w14 w15 w16se w16cid w16 w16cex w16sdtdh">
   <w:docDefaults>
     <w:rPrDefault>
       <w:rPr>
@@ -3820,144 +5816,383 @@
       </w:pPr>
     </w:pPrDefault>
   </w:docDefaults>
-  <w:latentStyles w:defLockedState="0" w:defUIPriority="99" w:defSemiHidden="1" w:defUnhideWhenUsed="1" w:defQFormat="0" w:count="267">
-    <w:lsdException w:name="Normal" w:semiHidden="0" w:uiPriority="0" w:unhideWhenUsed="0" w:qFormat="1"/>
-    <w:lsdException w:name="heading 1" w:semiHidden="0" w:uiPriority="9" w:unhideWhenUsed="0" w:qFormat="1"/>
-    <w:lsdException w:name="heading 2" w:uiPriority="9" w:qFormat="1"/>
-    <w:lsdException w:name="heading 3" w:uiPriority="9" w:qFormat="1"/>
-    <w:lsdException w:name="heading 4" w:uiPriority="9" w:qFormat="1"/>
-    <w:lsdException w:name="heading 5" w:uiPriority="9" w:qFormat="1"/>
-    <w:lsdException w:name="heading 6" w:uiPriority="9" w:qFormat="1"/>
-    <w:lsdException w:name="heading 7" w:uiPriority="9" w:qFormat="1"/>
-    <w:lsdException w:name="heading 8" w:uiPriority="9" w:qFormat="1"/>
-    <w:lsdException w:name="heading 9" w:uiPriority="9" w:qFormat="1"/>
-    <w:lsdException w:name="toc 1" w:uiPriority="39"/>
-    <w:lsdException w:name="toc 2" w:uiPriority="39"/>
-    <w:lsdException w:name="toc 3" w:uiPriority="39"/>
-    <w:lsdException w:name="toc 4" w:uiPriority="39"/>
-    <w:lsdException w:name="toc 5" w:uiPriority="39"/>
-    <w:lsdException w:name="toc 6" w:uiPriority="39"/>
-    <w:lsdException w:name="toc 7" w:uiPriority="39"/>
-    <w:lsdException w:name="toc 8" w:uiPriority="39"/>
-    <w:lsdException w:name="toc 9" w:uiPriority="39"/>
-    <w:lsdException w:name="caption" w:uiPriority="35" w:qFormat="1"/>
-    <w:lsdException w:name="Title" w:semiHidden="0" w:uiPriority="10" w:unhideWhenUsed="0" w:qFormat="1"/>
-    <w:lsdException w:name="Default Paragraph Font" w:uiPriority="1"/>
-    <w:lsdException w:name="Subtitle" w:semiHidden="0" w:uiPriority="11" w:unhideWhenUsed="0" w:qFormat="1"/>
-    <w:lsdException w:name="Strong" w:semiHidden="0" w:uiPriority="22" w:unhideWhenUsed="0" w:qFormat="1"/>
-    <w:lsdException w:name="Emphasis" w:semiHidden="0" w:uiPriority="20" w:unhideWhenUsed="0" w:qFormat="1"/>
-    <w:lsdException w:name="Table Grid" w:semiHidden="0" w:uiPriority="39" w:unhideWhenUsed="0"/>
-    <w:lsdException w:name="Placeholder Text" w:unhideWhenUsed="0"/>
-    <w:lsdException w:name="No Spacing" w:semiHidden="0" w:uiPriority="1" w:unhideWhenUsed="0" w:qFormat="1"/>
-    <w:lsdException w:name="Light Shading" w:semiHidden="0" w:uiPriority="60" w:unhideWhenUsed="0"/>
-    <w:lsdException w:name="Light List" w:semiHidden="0" w:uiPriority="61" w:unhideWhenUsed="0"/>
-    <w:lsdException w:name="Light Grid" w:semiHidden="0" w:uiPriority="62" w:unhideWhenUsed="0"/>
-    <w:lsdException w:name="Medium Shading 1" w:semiHidden="0" w:uiPriority="63" w:unhideWhenUsed="0"/>
-    <w:lsdException w:name="Medium Shading 2" w:semiHidden="0" w:uiPriority="64" w:unhideWhenUsed="0"/>
-    <w:lsdException w:name="Medium List 1" w:semiHidden="0" w:uiPriority="65" w:unhideWhenUsed="0"/>
-    <w:lsdException w:name="Medium List 2" w:semiHidden="0" w:uiPriority="66" w:unhideWhenUsed="0"/>
-    <w:lsdException w:name="Medium Grid 1" w:semiHidden="0" w:uiPriority="67" w:unhideWhenUsed="0"/>
-    <w:lsdException w:name="Medium Grid 2" w:semiHidden="0" w:uiPriority="68" w:unhideWhenUsed="0"/>
-    <w:lsdException w:name="Medium Grid 3" w:semiHidden="0" w:uiPriority="69" w:unhideWhenUsed="0"/>
-    <w:lsdException w:name="Dark List" w:semiHidden="0" w:uiPriority="70" w:unhideWhenUsed="0"/>
-    <w:lsdException w:name="Colorful Shading" w:semiHidden="0" w:uiPriority="71" w:unhideWhenUsed="0"/>
-    <w:lsdException w:name="Colorful List" w:semiHidden="0" w:uiPriority="72" w:unhideWhenUsed="0"/>
-    <w:lsdException w:name="Colorful Grid" w:semiHidden="0" w:uiPriority="73" w:unhideWhenUsed="0"/>
-    <w:lsdException w:name="Light Shading Accent 1" w:semiHidden="0" w:uiPriority="60" w:unhideWhenUsed="0"/>
-    <w:lsdException w:name="Light List Accent 1" w:semiHidden="0" w:uiPriority="61" w:unhideWhenUsed="0"/>
-    <w:lsdException w:name="Light Grid Accent 1" w:semiHidden="0" w:uiPriority="62" w:unhideWhenUsed="0"/>
-    <w:lsdException w:name="Medium Shading 1 Accent 1" w:semiHidden="0" w:uiPriority="63" w:unhideWhenUsed="0"/>
-    <w:lsdException w:name="Medium Shading 2 Accent 1" w:semiHidden="0" w:uiPriority="64" w:unhideWhenUsed="0"/>
-    <w:lsdException w:name="Medium List 1 Accent 1" w:semiHidden="0" w:uiPriority="65" w:unhideWhenUsed="0"/>
-    <w:lsdException w:name="Revision" w:unhideWhenUsed="0"/>
-    <w:lsdException w:name="List Paragraph" w:semiHidden="0" w:uiPriority="1" w:unhideWhenUsed="0" w:qFormat="1"/>
-    <w:lsdException w:name="Quote" w:semiHidden="0" w:uiPriority="29" w:unhideWhenUsed="0" w:qFormat="1"/>
-    <w:lsdException w:name="Intense Quote" w:semiHidden="0" w:uiPriority="30" w:unhideWhenUsed="0" w:qFormat="1"/>
-    <w:lsdException w:name="Medium List 2 Accent 1" w:semiHidden="0" w:uiPriority="66" w:unhideWhenUsed="0"/>
-    <w:lsdException w:name="Medium Grid 1 Accent 1" w:semiHidden="0" w:uiPriority="67" w:unhideWhenUsed="0"/>
-    <w:lsdException w:name="Medium Grid 2 Accent 1" w:semiHidden="0" w:uiPriority="68" w:unhideWhenUsed="0"/>
-    <w:lsdException w:name="Medium Grid 3 Accent 1" w:semiHidden="0" w:uiPriority="69" w:unhideWhenUsed="0"/>
-    <w:lsdException w:name="Dark List Accent 1" w:semiHidden="0" w:uiPriority="70" w:unhideWhenUsed="0"/>
-    <w:lsdException w:name="Colorful Shading Accent 1" w:semiHidden="0" w:uiPriority="71" w:unhideWhenUsed="0"/>
-    <w:lsdException w:name="Colorful List Accent 1" w:semiHidden="0" w:uiPriority="72" w:unhideWhenUsed="0"/>
-    <w:lsdException w:name="Colorful Grid Accent 1" w:semiHidden="0" w:uiPriority="73" w:unhideWhenUsed="0"/>
-    <w:lsdException w:name="Light Shading Accent 2" w:semiHidden="0" w:uiPriority="60" w:unhideWhenUsed="0"/>
-    <w:lsdException w:name="Light List Accent 2" w:semiHidden="0" w:uiPriority="61" w:unhideWhenUsed="0"/>
-    <w:lsdException w:name="Light Grid Accent 2" w:semiHidden="0" w:uiPriority="62" w:unhideWhenUsed="0"/>
-    <w:lsdException w:name="Medium Shading 1 Accent 2" w:semiHidden="0" w:uiPriority="63" w:unhideWhenUsed="0"/>
-    <w:lsdException w:name="Medium Shading 2 Accent 2" w:semiHidden="0" w:uiPriority="64" w:unhideWhenUsed="0"/>
-    <w:lsdException w:name="Medium List 1 Accent 2" w:semiHidden="0" w:uiPriority="65" w:unhideWhenUsed="0"/>
-    <w:lsdException w:name="Medium List 2 Accent 2" w:semiHidden="0" w:uiPriority="66" w:unhideWhenUsed="0"/>
-    <w:lsdException w:name="Medium Grid 1 Accent 2" w:semiHidden="0" w:uiPriority="67" w:unhideWhenUsed="0"/>
-    <w:lsdException w:name="Medium Grid 2 Accent 2" w:semiHidden="0" w:uiPriority="68" w:unhideWhenUsed="0"/>
-    <w:lsdException w:name="Medium Grid 3 Accent 2" w:semiHidden="0" w:uiPriority="69" w:unhideWhenUsed="0"/>
-    <w:lsdException w:name="Dark List Accent 2" w:semiHidden="0" w:uiPriority="70" w:unhideWhenUsed="0"/>
-    <w:lsdException w:name="Colorful Shading Accent 2" w:semiHidden="0" w:uiPriority="71" w:unhideWhenUsed="0"/>
-    <w:lsdException w:name="Colorful List Accent 2" w:semiHidden="0" w:uiPriority="72" w:unhideWhenUsed="0"/>
-    <w:lsdException w:name="Colorful Grid Accent 2" w:semiHidden="0" w:uiPriority="73" w:unhideWhenUsed="0"/>
-    <w:lsdException w:name="Light Shading Accent 3" w:semiHidden="0" w:uiPriority="60" w:unhideWhenUsed="0"/>
-    <w:lsdException w:name="Light List Accent 3" w:semiHidden="0" w:uiPriority="61" w:unhideWhenUsed="0"/>
-    <w:lsdException w:name="Light Grid Accent 3" w:semiHidden="0" w:uiPriority="62" w:unhideWhenUsed="0"/>
-    <w:lsdException w:name="Medium Shading 1 Accent 3" w:semiHidden="0" w:uiPriority="63" w:unhideWhenUsed="0"/>
-    <w:lsdException w:name="Medium Shading 2 Accent 3" w:semiHidden="0" w:uiPriority="64" w:unhideWhenUsed="0"/>
-    <w:lsdException w:name="Medium List 1 Accent 3" w:semiHidden="0" w:uiPriority="65" w:unhideWhenUsed="0"/>
-    <w:lsdException w:name="Medium List 2 Accent 3" w:semiHidden="0" w:uiPriority="66" w:unhideWhenUsed="0"/>
-    <w:lsdException w:name="Medium Grid 1 Accent 3" w:semiHidden="0" w:uiPriority="67" w:unhideWhenUsed="0"/>
-    <w:lsdException w:name="Medium Grid 2 Accent 3" w:semiHidden="0" w:uiPriority="68" w:unhideWhenUsed="0"/>
-    <w:lsdException w:name="Medium Grid 3 Accent 3" w:semiHidden="0" w:uiPriority="69" w:unhideWhenUsed="0"/>
-    <w:lsdException w:name="Dark List Accent 3" w:semiHidden="0" w:uiPriority="70" w:unhideWhenUsed="0"/>
-    <w:lsdException w:name="Colorful Shading Accent 3" w:semiHidden="0" w:uiPriority="71" w:unhideWhenUsed="0"/>
-    <w:lsdException w:name="Colorful List Accent 3" w:semiHidden="0" w:uiPriority="72" w:unhideWhenUsed="0"/>
-    <w:lsdException w:name="Colorful Grid Accent 3" w:semiHidden="0" w:uiPriority="73" w:unhideWhenUsed="0"/>
-    <w:lsdException w:name="Light Shading Accent 4" w:semiHidden="0" w:uiPriority="60" w:unhideWhenUsed="0"/>
-    <w:lsdException w:name="Light List Accent 4" w:semiHidden="0" w:uiPriority="61" w:unhideWhenUsed="0"/>
-    <w:lsdException w:name="Light Grid Accent 4" w:semiHidden="0" w:uiPriority="62" w:unhideWhenUsed="0"/>
-    <w:lsdException w:name="Medium Shading 1 Accent 4" w:semiHidden="0" w:uiPriority="63" w:unhideWhenUsed="0"/>
-    <w:lsdException w:name="Medium Shading 2 Accent 4" w:semiHidden="0" w:uiPriority="64" w:unhideWhenUsed="0"/>
-    <w:lsdException w:name="Medium List 1 Accent 4" w:semiHidden="0" w:uiPriority="65" w:unhideWhenUsed="0"/>
-    <w:lsdException w:name="Medium List 2 Accent 4" w:semiHidden="0" w:uiPriority="66" w:unhideWhenUsed="0"/>
-    <w:lsdException w:name="Medium Grid 1 Accent 4" w:semiHidden="0" w:uiPriority="67" w:unhideWhenUsed="0"/>
-    <w:lsdException w:name="Medium Grid 2 Accent 4" w:semiHidden="0" w:uiPriority="68" w:unhideWhenUsed="0"/>
-    <w:lsdException w:name="Medium Grid 3 Accent 4" w:semiHidden="0" w:uiPriority="69" w:unhideWhenUsed="0"/>
-    <w:lsdException w:name="Dark List Accent 4" w:semiHidden="0" w:uiPriority="70" w:unhideWhenUsed="0"/>
-    <w:lsdException w:name="Colorful Shading Accent 4" w:semiHidden="0" w:uiPriority="71" w:unhideWhenUsed="0"/>
-    <w:lsdException w:name="Colorful List Accent 4" w:semiHidden="0" w:uiPriority="72" w:unhideWhenUsed="0"/>
-    <w:lsdException w:name="Colorful Grid Accent 4" w:semiHidden="0" w:uiPriority="73" w:unhideWhenUsed="0"/>
-    <w:lsdException w:name="Light Shading Accent 5" w:semiHidden="0" w:uiPriority="60" w:unhideWhenUsed="0"/>
-    <w:lsdException w:name="Light List Accent 5" w:semiHidden="0" w:uiPriority="61" w:unhideWhenUsed="0"/>
-    <w:lsdException w:name="Light Grid Accent 5" w:semiHidden="0" w:uiPriority="62" w:unhideWhenUsed="0"/>
-    <w:lsdException w:name="Medium Shading 1 Accent 5" w:semiHidden="0" w:uiPriority="63" w:unhideWhenUsed="0"/>
-    <w:lsdException w:name="Medium Shading 2 Accent 5" w:semiHidden="0" w:uiPriority="64" w:unhideWhenUsed="0"/>
-    <w:lsdException w:name="Medium List 1 Accent 5" w:semiHidden="0" w:uiPriority="65" w:unhideWhenUsed="0"/>
-    <w:lsdException w:name="Medium List 2 Accent 5" w:semiHidden="0" w:uiPriority="66" w:unhideWhenUsed="0"/>
-    <w:lsdException w:name="Medium Grid 1 Accent 5" w:semiHidden="0" w:uiPriority="67" w:unhideWhenUsed="0"/>
-    <w:lsdException w:name="Medium Grid 2 Accent 5" w:semiHidden="0" w:uiPriority="68" w:unhideWhenUsed="0"/>
-    <w:lsdException w:name="Medium Grid 3 Accent 5" w:semiHidden="0" w:uiPriority="69" w:unhideWhenUsed="0"/>
-    <w:lsdException w:name="Dark List Accent 5" w:semiHidden="0" w:uiPriority="70" w:unhideWhenUsed="0"/>
-    <w:lsdException w:name="Colorful Shading Accent 5" w:semiHidden="0" w:uiPriority="71" w:unhideWhenUsed="0"/>
-    <w:lsdException w:name="Colorful List Accent 5" w:semiHidden="0" w:uiPriority="72" w:unhideWhenUsed="0"/>
-    <w:lsdException w:name="Colorful Grid Accent 5" w:semiHidden="0" w:uiPriority="73" w:unhideWhenUsed="0"/>
-    <w:lsdException w:name="Light Shading Accent 6" w:semiHidden="0" w:uiPriority="60" w:unhideWhenUsed="0"/>
-    <w:lsdException w:name="Light List Accent 6" w:semiHidden="0" w:uiPriority="61" w:unhideWhenUsed="0"/>
-    <w:lsdException w:name="Light Grid Accent 6" w:semiHidden="0" w:uiPriority="62" w:unhideWhenUsed="0"/>
-    <w:lsdException w:name="Medium Shading 1 Accent 6" w:semiHidden="0" w:uiPriority="63" w:unhideWhenUsed="0"/>
-    <w:lsdException w:name="Medium Shading 2 Accent 6" w:semiHidden="0" w:uiPriority="64" w:unhideWhenUsed="0"/>
-    <w:lsdException w:name="Medium List 1 Accent 6" w:semiHidden="0" w:uiPriority="65" w:unhideWhenUsed="0"/>
-    <w:lsdException w:name="Medium List 2 Accent 6" w:semiHidden="0" w:uiPriority="66" w:unhideWhenUsed="0"/>
-    <w:lsdException w:name="Medium Grid 1 Accent 6" w:semiHidden="0" w:uiPriority="67" w:unhideWhenUsed="0"/>
-    <w:lsdException w:name="Medium Grid 2 Accent 6" w:semiHidden="0" w:uiPriority="68" w:unhideWhenUsed="0"/>
-    <w:lsdException w:name="Medium Grid 3 Accent 6" w:semiHidden="0" w:uiPriority="69" w:unhideWhenUsed="0"/>
-    <w:lsdException w:name="Dark List Accent 6" w:semiHidden="0" w:uiPriority="70" w:unhideWhenUsed="0"/>
-    <w:lsdException w:name="Colorful Shading Accent 6" w:semiHidden="0" w:uiPriority="71" w:unhideWhenUsed="0"/>
-    <w:lsdException w:name="Colorful List Accent 6" w:semiHidden="0" w:uiPriority="72" w:unhideWhenUsed="0"/>
-    <w:lsdException w:name="Colorful Grid Accent 6" w:semiHidden="0" w:uiPriority="73" w:unhideWhenUsed="0"/>
-    <w:lsdException w:name="Subtle Emphasis" w:semiHidden="0" w:uiPriority="19" w:unhideWhenUsed="0" w:qFormat="1"/>
-    <w:lsdException w:name="Intense Emphasis" w:semiHidden="0" w:uiPriority="21" w:unhideWhenUsed="0" w:qFormat="1"/>
-    <w:lsdException w:name="Subtle Reference" w:semiHidden="0" w:uiPriority="31" w:unhideWhenUsed="0" w:qFormat="1"/>
-    <w:lsdException w:name="Intense Reference" w:semiHidden="0" w:uiPriority="32" w:unhideWhenUsed="0" w:qFormat="1"/>
-    <w:lsdException w:name="Book Title" w:semiHidden="0" w:uiPriority="33" w:unhideWhenUsed="0" w:qFormat="1"/>
-    <w:lsdException w:name="Bibliography" w:uiPriority="37"/>
-    <w:lsdException w:name="TOC Heading" w:uiPriority="39" w:qFormat="1"/>
+  <w:latentStyles w:defLockedState="0" w:defUIPriority="99" w:defSemiHidden="0" w:defUnhideWhenUsed="0" w:defQFormat="0" w:count="376">
+    <w:lsdException w:name="Normal" w:uiPriority="0" w:qFormat="1"/>
+    <w:lsdException w:name="heading 1" w:uiPriority="9" w:qFormat="1"/>
+    <w:lsdException w:name="heading 2" w:semiHidden="1" w:uiPriority="9" w:unhideWhenUsed="1" w:qFormat="1"/>
+    <w:lsdException w:name="heading 3" w:semiHidden="1" w:uiPriority="9" w:unhideWhenUsed="1" w:qFormat="1"/>
+    <w:lsdException w:name="heading 4" w:semiHidden="1" w:uiPriority="9" w:unhideWhenUsed="1" w:qFormat="1"/>
+    <w:lsdException w:name="heading 5" w:semiHidden="1" w:uiPriority="9" w:unhideWhenUsed="1" w:qFormat="1"/>
+    <w:lsdException w:name="heading 6" w:semiHidden="1" w:uiPriority="9" w:unhideWhenUsed="1" w:qFormat="1"/>
+    <w:lsdException w:name="heading 7" w:semiHidden="1" w:uiPriority="9" w:unhideWhenUsed="1" w:qFormat="1"/>
+    <w:lsdException w:name="heading 8" w:semiHidden="1" w:uiPriority="9" w:unhideWhenUsed="1" w:qFormat="1"/>
+    <w:lsdException w:name="heading 9" w:semiHidden="1" w:uiPriority="9" w:unhideWhenUsed="1" w:qFormat="1"/>
+    <w:lsdException w:name="index 1" w:semiHidden="1" w:unhideWhenUsed="1"/>
+    <w:lsdException w:name="index 2" w:semiHidden="1" w:unhideWhenUsed="1"/>
+    <w:lsdException w:name="index 3" w:semiHidden="1" w:unhideWhenUsed="1"/>
+    <w:lsdException w:name="index 4" w:semiHidden="1" w:unhideWhenUsed="1"/>
+    <w:lsdException w:name="index 5" w:semiHidden="1" w:unhideWhenUsed="1"/>
+    <w:lsdException w:name="index 6" w:semiHidden="1" w:unhideWhenUsed="1"/>
+    <w:lsdException w:name="index 7" w:semiHidden="1" w:unhideWhenUsed="1"/>
+    <w:lsdException w:name="index 8" w:semiHidden="1" w:unhideWhenUsed="1"/>
+    <w:lsdException w:name="index 9" w:semiHidden="1" w:unhideWhenUsed="1"/>
+    <w:lsdException w:name="toc 1" w:semiHidden="1" w:uiPriority="39" w:unhideWhenUsed="1"/>
+    <w:lsdException w:name="toc 2" w:semiHidden="1" w:uiPriority="39" w:unhideWhenUsed="1"/>
+    <w:lsdException w:name="toc 3" w:semiHidden="1" w:uiPriority="39" w:unhideWhenUsed="1"/>
+    <w:lsdException w:name="toc 4" w:semiHidden="1" w:uiPriority="39" w:unhideWhenUsed="1"/>
+    <w:lsdException w:name="toc 5" w:semiHidden="1" w:uiPriority="39" w:unhideWhenUsed="1"/>
+    <w:lsdException w:name="toc 6" w:semiHidden="1" w:uiPriority="39" w:unhideWhenUsed="1"/>
+    <w:lsdException w:name="toc 7" w:semiHidden="1" w:uiPriority="39" w:unhideWhenUsed="1"/>
+    <w:lsdException w:name="toc 8" w:semiHidden="1" w:uiPriority="39" w:unhideWhenUsed="1"/>
+    <w:lsdException w:name="toc 9" w:semiHidden="1" w:uiPriority="39" w:unhideWhenUsed="1"/>
+    <w:lsdException w:name="Normal Indent" w:semiHidden="1" w:unhideWhenUsed="1"/>
+    <w:lsdException w:name="footnote text" w:semiHidden="1" w:unhideWhenUsed="1"/>
+    <w:lsdException w:name="annotation text" w:semiHidden="1" w:unhideWhenUsed="1"/>
+    <w:lsdException w:name="header" w:semiHidden="1" w:unhideWhenUsed="1"/>
+    <w:lsdException w:name="footer" w:semiHidden="1" w:unhideWhenUsed="1"/>
+    <w:lsdException w:name="index heading" w:semiHidden="1" w:unhideWhenUsed="1"/>
+    <w:lsdException w:name="caption" w:semiHidden="1" w:uiPriority="35" w:unhideWhenUsed="1" w:qFormat="1"/>
+    <w:lsdException w:name="table of figures" w:semiHidden="1" w:unhideWhenUsed="1"/>
+    <w:lsdException w:name="envelope address" w:semiHidden="1" w:unhideWhenUsed="1"/>
+    <w:lsdException w:name="envelope return" w:semiHidden="1" w:unhideWhenUsed="1"/>
+    <w:lsdException w:name="footnote reference" w:semiHidden="1" w:unhideWhenUsed="1"/>
+    <w:lsdException w:name="annotation reference" w:semiHidden="1" w:unhideWhenUsed="1"/>
+    <w:lsdException w:name="line number" w:semiHidden="1" w:unhideWhenUsed="1"/>
+    <w:lsdException w:name="page number" w:semiHidden="1" w:unhideWhenUsed="1"/>
+    <w:lsdException w:name="endnote reference" w:semiHidden="1" w:unhideWhenUsed="1"/>
+    <w:lsdException w:name="endnote text" w:semiHidden="1" w:unhideWhenUsed="1"/>
+    <w:lsdException w:name="table of authorities" w:semiHidden="1" w:unhideWhenUsed="1"/>
+    <w:lsdException w:name="macro" w:semiHidden="1" w:unhideWhenUsed="1"/>
+    <w:lsdException w:name="toa heading" w:semiHidden="1" w:unhideWhenUsed="1"/>
+    <w:lsdException w:name="List" w:semiHidden="1" w:unhideWhenUsed="1"/>
+    <w:lsdException w:name="List Bullet" w:semiHidden="1" w:unhideWhenUsed="1"/>
+    <w:lsdException w:name="List Number" w:semiHidden="1" w:unhideWhenUsed="1"/>
+    <w:lsdException w:name="List 2" w:semiHidden="1" w:unhideWhenUsed="1"/>
+    <w:lsdException w:name="List 3" w:semiHidden="1" w:unhideWhenUsed="1"/>
+    <w:lsdException w:name="List 4" w:semiHidden="1" w:unhideWhenUsed="1"/>
+    <w:lsdException w:name="List 5" w:semiHidden="1" w:unhideWhenUsed="1"/>
+    <w:lsdException w:name="List Bullet 2" w:semiHidden="1" w:unhideWhenUsed="1"/>
+    <w:lsdException w:name="List Bullet 3" w:semiHidden="1" w:unhideWhenUsed="1"/>
+    <w:lsdException w:name="List Bullet 4" w:semiHidden="1" w:unhideWhenUsed="1"/>
+    <w:lsdException w:name="List Bullet 5" w:semiHidden="1" w:unhideWhenUsed="1"/>
+    <w:lsdException w:name="List Number 2" w:semiHidden="1" w:unhideWhenUsed="1"/>
+    <w:lsdException w:name="List Number 3" w:semiHidden="1" w:unhideWhenUsed="1"/>
+    <w:lsdException w:name="List Number 4" w:semiHidden="1" w:unhideWhenUsed="1"/>
+    <w:lsdException w:name="List Number 5" w:semiHidden="1" w:unhideWhenUsed="1"/>
+    <w:lsdException w:name="Title" w:uiPriority="10" w:qFormat="1"/>
+    <w:lsdException w:name="Closing" w:semiHidden="1" w:unhideWhenUsed="1"/>
+    <w:lsdException w:name="Signature" w:semiHidden="1" w:unhideWhenUsed="1"/>
+    <w:lsdException w:name="Default Paragraph Font" w:semiHidden="1" w:uiPriority="1" w:unhideWhenUsed="1"/>
+    <w:lsdException w:name="Body Text" w:semiHidden="1" w:unhideWhenUsed="1"/>
+    <w:lsdException w:name="Body Text Indent" w:semiHidden="1" w:unhideWhenUsed="1"/>
+    <w:lsdException w:name="List Continue" w:semiHidden="1" w:unhideWhenUsed="1"/>
+    <w:lsdException w:name="List Continue 2" w:semiHidden="1" w:unhideWhenUsed="1"/>
+    <w:lsdException w:name="List Continue 3" w:semiHidden="1" w:unhideWhenUsed="1"/>
+    <w:lsdException w:name="List Continue 4" w:semiHidden="1" w:unhideWhenUsed="1"/>
+    <w:lsdException w:name="List Continue 5" w:semiHidden="1" w:unhideWhenUsed="1"/>
+    <w:lsdException w:name="Message Header" w:semiHidden="1" w:unhideWhenUsed="1"/>
+    <w:lsdException w:name="Subtitle" w:uiPriority="11" w:qFormat="1"/>
+    <w:lsdException w:name="Salutation" w:semiHidden="1" w:unhideWhenUsed="1"/>
+    <w:lsdException w:name="Date" w:semiHidden="1" w:unhideWhenUsed="1"/>
+    <w:lsdException w:name="Body Text First Indent" w:semiHidden="1" w:unhideWhenUsed="1"/>
+    <w:lsdException w:name="Body Text First Indent 2" w:semiHidden="1" w:unhideWhenUsed="1"/>
+    <w:lsdException w:name="Note Heading" w:semiHidden="1" w:unhideWhenUsed="1"/>
+    <w:lsdException w:name="Body Text 2" w:semiHidden="1" w:unhideWhenUsed="1"/>
+    <w:lsdException w:name="Body Text 3" w:semiHidden="1" w:unhideWhenUsed="1"/>
+    <w:lsdException w:name="Body Text Indent 2" w:semiHidden="1" w:unhideWhenUsed="1"/>
+    <w:lsdException w:name="Body Text Indent 3" w:semiHidden="1" w:unhideWhenUsed="1"/>
+    <w:lsdException w:name="Block Text" w:semiHidden="1" w:unhideWhenUsed="1"/>
+    <w:lsdException w:name="Hyperlink" w:semiHidden="1" w:unhideWhenUsed="1"/>
+    <w:lsdException w:name="FollowedHyperlink" w:semiHidden="1" w:unhideWhenUsed="1"/>
+    <w:lsdException w:name="Strong" w:uiPriority="22" w:qFormat="1"/>
+    <w:lsdException w:name="Emphasis" w:uiPriority="20" w:qFormat="1"/>
+    <w:lsdException w:name="Document Map" w:semiHidden="1" w:unhideWhenUsed="1"/>
+    <w:lsdException w:name="Plain Text" w:semiHidden="1" w:unhideWhenUsed="1"/>
+    <w:lsdException w:name="E-mail Signature" w:semiHidden="1" w:unhideWhenUsed="1"/>
+    <w:lsdException w:name="HTML Top of Form" w:semiHidden="1" w:unhideWhenUsed="1"/>
+    <w:lsdException w:name="HTML Bottom of Form" w:semiHidden="1" w:unhideWhenUsed="1"/>
+    <w:lsdException w:name="Normal (Web)" w:semiHidden="1" w:unhideWhenUsed="1"/>
+    <w:lsdException w:name="HTML Acronym" w:semiHidden="1" w:unhideWhenUsed="1"/>
+    <w:lsdException w:name="HTML Address" w:semiHidden="1" w:unhideWhenUsed="1"/>
+    <w:lsdException w:name="HTML Cite" w:semiHidden="1" w:unhideWhenUsed="1"/>
+    <w:lsdException w:name="HTML Code" w:semiHidden="1" w:unhideWhenUsed="1"/>
+    <w:lsdException w:name="HTML Definition" w:semiHidden="1" w:unhideWhenUsed="1"/>
+    <w:lsdException w:name="HTML Keyboard" w:semiHidden="1" w:unhideWhenUsed="1"/>
+    <w:lsdException w:name="HTML Preformatted" w:semiHidden="1" w:unhideWhenUsed="1"/>
+    <w:lsdException w:name="HTML Sample" w:semiHidden="1" w:unhideWhenUsed="1"/>
+    <w:lsdException w:name="HTML Typewriter" w:semiHidden="1" w:unhideWhenUsed="1"/>
+    <w:lsdException w:name="HTML Variable" w:semiHidden="1" w:unhideWhenUsed="1"/>
+    <w:lsdException w:name="Normal Table" w:semiHidden="1" w:unhideWhenUsed="1"/>
+    <w:lsdException w:name="annotation subject" w:semiHidden="1" w:unhideWhenUsed="1"/>
+    <w:lsdException w:name="No List" w:semiHidden="1" w:unhideWhenUsed="1"/>
+    <w:lsdException w:name="Outline List 1" w:semiHidden="1" w:unhideWhenUsed="1"/>
+    <w:lsdException w:name="Outline List 2" w:semiHidden="1" w:unhideWhenUsed="1"/>
+    <w:lsdException w:name="Outline List 3" w:semiHidden="1" w:unhideWhenUsed="1"/>
+    <w:lsdException w:name="Table Simple 1" w:semiHidden="1" w:unhideWhenUsed="1"/>
+    <w:lsdException w:name="Table Simple 2" w:semiHidden="1" w:unhideWhenUsed="1"/>
+    <w:lsdException w:name="Table Simple 3" w:semiHidden="1" w:unhideWhenUsed="1"/>
+    <w:lsdException w:name="Table Classic 1" w:semiHidden="1" w:unhideWhenUsed="1"/>
+    <w:lsdException w:name="Table Classic 2" w:semiHidden="1" w:unhideWhenUsed="1"/>
+    <w:lsdException w:name="Table Classic 3" w:semiHidden="1" w:unhideWhenUsed="1"/>
+    <w:lsdException w:name="Table Classic 4" w:semiHidden="1" w:unhideWhenUsed="1"/>
+    <w:lsdException w:name="Table Colorful 1" w:semiHidden="1" w:unhideWhenUsed="1"/>
+    <w:lsdException w:name="Table Colorful 2" w:semiHidden="1" w:unhideWhenUsed="1"/>
+    <w:lsdException w:name="Table Colorful 3" w:semiHidden="1" w:unhideWhenUsed="1"/>
+    <w:lsdException w:name="Table Columns 1" w:semiHidden="1" w:unhideWhenUsed="1"/>
+    <w:lsdException w:name="Table Columns 2" w:semiHidden="1" w:unhideWhenUsed="1"/>
+    <w:lsdException w:name="Table Columns 3" w:semiHidden="1" w:unhideWhenUsed="1"/>
+    <w:lsdException w:name="Table Columns 4" w:semiHidden="1" w:unhideWhenUsed="1"/>
+    <w:lsdException w:name="Table Columns 5" w:semiHidden="1" w:unhideWhenUsed="1"/>
+    <w:lsdException w:name="Table Grid 1" w:semiHidden="1" w:unhideWhenUsed="1"/>
+    <w:lsdException w:name="Table Grid 2" w:semiHidden="1" w:unhideWhenUsed="1"/>
+    <w:lsdException w:name="Table Grid 3" w:semiHidden="1" w:unhideWhenUsed="1"/>
+    <w:lsdException w:name="Table Grid 4" w:semiHidden="1" w:unhideWhenUsed="1"/>
+    <w:lsdException w:name="Table Grid 5" w:semiHidden="1" w:unhideWhenUsed="1"/>
+    <w:lsdException w:name="Table Grid 6" w:semiHidden="1" w:unhideWhenUsed="1"/>
+    <w:lsdException w:name="Table Grid 7" w:semiHidden="1" w:unhideWhenUsed="1"/>
+    <w:lsdException w:name="Table Grid 8" w:semiHidden="1" w:unhideWhenUsed="1"/>
+    <w:lsdException w:name="Table List 1" w:semiHidden="1" w:unhideWhenUsed="1"/>
+    <w:lsdException w:name="Table List 2" w:semiHidden="1" w:unhideWhenUsed="1"/>
+    <w:lsdException w:name="Table List 3" w:semiHidden="1" w:unhideWhenUsed="1"/>
+    <w:lsdException w:name="Table List 4" w:semiHidden="1" w:unhideWhenUsed="1"/>
+    <w:lsdException w:name="Table List 5" w:semiHidden="1" w:unhideWhenUsed="1"/>
+    <w:lsdException w:name="Table List 6" w:semiHidden="1" w:unhideWhenUsed="1"/>
+    <w:lsdException w:name="Table List 7" w:semiHidden="1" w:unhideWhenUsed="1"/>
+    <w:lsdException w:name="Table List 8" w:semiHidden="1" w:unhideWhenUsed="1"/>
+    <w:lsdException w:name="Table 3D effects 1" w:semiHidden="1" w:unhideWhenUsed="1"/>
+    <w:lsdException w:name="Table 3D effects 2" w:semiHidden="1" w:unhideWhenUsed="1"/>
+    <w:lsdException w:name="Table 3D effects 3" w:semiHidden="1" w:unhideWhenUsed="1"/>
+    <w:lsdException w:name="Table Contemporary" w:semiHidden="1" w:unhideWhenUsed="1"/>
+    <w:lsdException w:name="Table Elegant" w:semiHidden="1" w:unhideWhenUsed="1"/>
+    <w:lsdException w:name="Table Professional" w:semiHidden="1" w:unhideWhenUsed="1"/>
+    <w:lsdException w:name="Table Subtle 1" w:semiHidden="1" w:unhideWhenUsed="1"/>
+    <w:lsdException w:name="Table Subtle 2" w:semiHidden="1" w:unhideWhenUsed="1"/>
+    <w:lsdException w:name="Table Web 1" w:semiHidden="1" w:unhideWhenUsed="1"/>
+    <w:lsdException w:name="Table Web 2" w:semiHidden="1" w:unhideWhenUsed="1"/>
+    <w:lsdException w:name="Table Web 3" w:semiHidden="1" w:unhideWhenUsed="1"/>
+    <w:lsdException w:name="Balloon Text" w:semiHidden="1" w:unhideWhenUsed="1"/>
+    <w:lsdException w:name="Table Grid" w:semiHidden="1" w:uiPriority="39" w:unhideWhenUsed="1"/>
+    <w:lsdException w:name="Table Theme" w:semiHidden="1" w:unhideWhenUsed="1"/>
+    <w:lsdException w:name="Placeholder Text" w:semiHidden="1"/>
+    <w:lsdException w:name="No Spacing" w:uiPriority="1" w:qFormat="1"/>
+    <w:lsdException w:name="Light Shading" w:uiPriority="60"/>
+    <w:lsdException w:name="Light List" w:uiPriority="61"/>
+    <w:lsdException w:name="Light Grid" w:uiPriority="62"/>
+    <w:lsdException w:name="Medium Shading 1" w:uiPriority="63"/>
+    <w:lsdException w:name="Medium Shading 2" w:uiPriority="64"/>
+    <w:lsdException w:name="Medium List 1" w:uiPriority="65"/>
+    <w:lsdException w:name="Medium List 2" w:uiPriority="66"/>
+    <w:lsdException w:name="Medium Grid 1" w:uiPriority="67"/>
+    <w:lsdException w:name="Medium Grid 2" w:uiPriority="68"/>
+    <w:lsdException w:name="Medium Grid 3" w:uiPriority="69"/>
+    <w:lsdException w:name="Dark List" w:uiPriority="70"/>
+    <w:lsdException w:name="Colorful Shading" w:uiPriority="71"/>
+    <w:lsdException w:name="Colorful List" w:uiPriority="72"/>
+    <w:lsdException w:name="Colorful Grid" w:uiPriority="73"/>
+    <w:lsdException w:name="Light Shading Accent 1" w:uiPriority="60"/>
+    <w:lsdException w:name="Light List Accent 1" w:uiPriority="61"/>
+    <w:lsdException w:name="Light Grid Accent 1" w:uiPriority="62"/>
+    <w:lsdException w:name="Medium Shading 1 Accent 1" w:uiPriority="63"/>
+    <w:lsdException w:name="Medium Shading 2 Accent 1" w:uiPriority="64"/>
+    <w:lsdException w:name="Medium List 1 Accent 1" w:uiPriority="65"/>
+    <w:lsdException w:name="Revision" w:semiHidden="1"/>
+    <w:lsdException w:name="List Paragraph" w:uiPriority="1" w:qFormat="1"/>
+    <w:lsdException w:name="Quote" w:uiPriority="29" w:qFormat="1"/>
+    <w:lsdException w:name="Intense Quote" w:uiPriority="30" w:qFormat="1"/>
+    <w:lsdException w:name="Medium List 2 Accent 1" w:uiPriority="66"/>
+    <w:lsdException w:name="Medium Grid 1 Accent 1" w:uiPriority="67"/>
+    <w:lsdException w:name="Medium Grid 2 Accent 1" w:uiPriority="68"/>
+    <w:lsdException w:name="Medium Grid 3 Accent 1" w:uiPriority="69"/>
+    <w:lsdException w:name="Dark List Accent 1" w:uiPriority="70"/>
+    <w:lsdException w:name="Colorful Shading Accent 1" w:uiPriority="71"/>
+    <w:lsdException w:name="Colorful List Accent 1" w:uiPriority="72"/>
+    <w:lsdException w:name="Colorful Grid Accent 1" w:uiPriority="73"/>
+    <w:lsdException w:name="Light Shading Accent 2" w:uiPriority="60"/>
+    <w:lsdException w:name="Light List Accent 2" w:uiPriority="61"/>
+    <w:lsdException w:name="Light Grid Accent 2" w:uiPriority="62"/>
+    <w:lsdException w:name="Medium Shading 1 Accent 2" w:uiPriority="63"/>
+    <w:lsdException w:name="Medium Shading 2 Accent 2" w:uiPriority="64"/>
+    <w:lsdException w:name="Medium List 1 Accent 2" w:uiPriority="65"/>
+    <w:lsdException w:name="Medium List 2 Accent 2" w:uiPriority="66"/>
+    <w:lsdException w:name="Medium Grid 1 Accent 2" w:uiPriority="67"/>
+    <w:lsdException w:name="Medium Grid 2 Accent 2" w:uiPriority="68"/>
+    <w:lsdException w:name="Medium Grid 3 Accent 2" w:uiPriority="69"/>
+    <w:lsdException w:name="Dark List Accent 2" w:uiPriority="70"/>
+    <w:lsdException w:name="Colorful Shading Accent 2" w:uiPriority="71"/>
+    <w:lsdException w:name="Colorful List Accent 2" w:uiPriority="72"/>
+    <w:lsdException w:name="Colorful Grid Accent 2" w:uiPriority="73"/>
+    <w:lsdException w:name="Light Shading Accent 3" w:uiPriority="60"/>
+    <w:lsdException w:name="Light List Accent 3" w:uiPriority="61"/>
+    <w:lsdException w:name="Light Grid Accent 3" w:uiPriority="62"/>
+    <w:lsdException w:name="Medium Shading 1 Accent 3" w:uiPriority="63"/>
+    <w:lsdException w:name="Medium Shading 2 Accent 3" w:uiPriority="64"/>
+    <w:lsdException w:name="Medium List 1 Accent 3" w:uiPriority="65"/>
+    <w:lsdException w:name="Medium List 2 Accent 3" w:uiPriority="66"/>
+    <w:lsdException w:name="Medium Grid 1 Accent 3" w:uiPriority="67"/>
+    <w:lsdException w:name="Medium Grid 2 Accent 3" w:uiPriority="68"/>
+    <w:lsdException w:name="Medium Grid 3 Accent 3" w:uiPriority="69"/>
+    <w:lsdException w:name="Dark List Accent 3" w:uiPriority="70"/>
+    <w:lsdException w:name="Colorful Shading Accent 3" w:uiPriority="71"/>
+    <w:lsdException w:name="Colorful List Accent 3" w:uiPriority="72"/>
+    <w:lsdException w:name="Colorful Grid Accent 3" w:uiPriority="73"/>
+    <w:lsdException w:name="Light Shading Accent 4" w:uiPriority="60"/>
+    <w:lsdException w:name="Light List Accent 4" w:uiPriority="61"/>
+    <w:lsdException w:name="Light Grid Accent 4" w:uiPriority="62"/>
+    <w:lsdException w:name="Medium Shading 1 Accent 4" w:uiPriority="63"/>
+    <w:lsdException w:name="Medium Shading 2 Accent 4" w:uiPriority="64"/>
+    <w:lsdException w:name="Medium List 1 Accent 4" w:uiPriority="65"/>
+    <w:lsdException w:name="Medium List 2 Accent 4" w:uiPriority="66"/>
+    <w:lsdException w:name="Medium Grid 1 Accent 4" w:uiPriority="67"/>
+    <w:lsdException w:name="Medium Grid 2 Accent 4" w:uiPriority="68"/>
+    <w:lsdException w:name="Medium Grid 3 Accent 4" w:uiPriority="69"/>
+    <w:lsdException w:name="Dark List Accent 4" w:uiPriority="70"/>
+    <w:lsdException w:name="Colorful Shading Accent 4" w:uiPriority="71"/>
+    <w:lsdException w:name="Colorful List Accent 4" w:uiPriority="72"/>
+    <w:lsdException w:name="Colorful Grid Accent 4" w:uiPriority="73"/>
+    <w:lsdException w:name="Light Shading Accent 5" w:uiPriority="60"/>
+    <w:lsdException w:name="Light List Accent 5" w:uiPriority="61"/>
+    <w:lsdException w:name="Light Grid Accent 5" w:uiPriority="62"/>
+    <w:lsdException w:name="Medium Shading 1 Accent 5" w:uiPriority="63"/>
+    <w:lsdException w:name="Medium Shading 2 Accent 5" w:uiPriority="64"/>
+    <w:lsdException w:name="Medium List 1 Accent 5" w:uiPriority="65"/>
+    <w:lsdException w:name="Medium List 2 Accent 5" w:uiPriority="66"/>
+    <w:lsdException w:name="Medium Grid 1 Accent 5" w:uiPriority="67"/>
+    <w:lsdException w:name="Medium Grid 2 Accent 5" w:uiPriority="68"/>
+    <w:lsdException w:name="Medium Grid 3 Accent 5" w:uiPriority="69"/>
+    <w:lsdException w:name="Dark List Accent 5" w:uiPriority="70"/>
+    <w:lsdException w:name="Colorful Shading Accent 5" w:uiPriority="71"/>
+    <w:lsdException w:name="Colorful List Accent 5" w:uiPriority="72"/>
+    <w:lsdException w:name="Colorful Grid Accent 5" w:uiPriority="73"/>
+    <w:lsdException w:name="Light Shading Accent 6" w:uiPriority="60"/>
+    <w:lsdException w:name="Light List Accent 6" w:uiPriority="61"/>
+    <w:lsdException w:name="Light Grid Accent 6" w:uiPriority="62"/>
+    <w:lsdException w:name="Medium Shading 1 Accent 6" w:uiPriority="63"/>
+    <w:lsdException w:name="Medium Shading 2 Accent 6" w:uiPriority="64"/>
+    <w:lsdException w:name="Medium List 1 Accent 6" w:uiPriority="65"/>
+    <w:lsdException w:name="Medium List 2 Accent 6" w:uiPriority="66"/>
+    <w:lsdException w:name="Medium Grid 1 Accent 6" w:uiPriority="67"/>
+    <w:lsdException w:name="Medium Grid 2 Accent 6" w:uiPriority="68"/>
+    <w:lsdException w:name="Medium Grid 3 Accent 6" w:uiPriority="69"/>
+    <w:lsdException w:name="Dark List Accent 6" w:uiPriority="70"/>
+    <w:lsdException w:name="Colorful Shading Accent 6" w:uiPriority="71"/>
+    <w:lsdException w:name="Colorful List Accent 6" w:uiPriority="72"/>
+    <w:lsdException w:name="Colorful Grid Accent 6" w:uiPriority="73"/>
+    <w:lsdException w:name="Subtle Emphasis" w:uiPriority="19" w:qFormat="1"/>
+    <w:lsdException w:name="Intense Emphasis" w:uiPriority="21" w:qFormat="1"/>
+    <w:lsdException w:name="Subtle Reference" w:uiPriority="31" w:qFormat="1"/>
+    <w:lsdException w:name="Intense Reference" w:uiPriority="32" w:qFormat="1"/>
+    <w:lsdException w:name="Book Title" w:uiPriority="33" w:qFormat="1"/>
+    <w:lsdException w:name="Bibliography" w:semiHidden="1" w:uiPriority="37" w:unhideWhenUsed="1"/>
+    <w:lsdException w:name="TOC Heading" w:semiHidden="1" w:uiPriority="39" w:unhideWhenUsed="1" w:qFormat="1"/>
+    <w:lsdException w:name="Plain Table 1" w:uiPriority="41"/>
+    <w:lsdException w:name="Plain Table 2" w:uiPriority="42"/>
+    <w:lsdException w:name="Plain Table 3" w:uiPriority="43"/>
+    <w:lsdException w:name="Plain Table 4" w:uiPriority="44"/>
+    <w:lsdException w:name="Plain Table 5" w:uiPriority="45"/>
+    <w:lsdException w:name="Grid Table Light" w:uiPriority="40"/>
+    <w:lsdException w:name="Grid Table 1 Light" w:uiPriority="46"/>
+    <w:lsdException w:name="Grid Table 2" w:uiPriority="47"/>
+    <w:lsdException w:name="Grid Table 3" w:uiPriority="48"/>
+    <w:lsdException w:name="Grid Table 4" w:uiPriority="49"/>
+    <w:lsdException w:name="Grid Table 5 Dark" w:uiPriority="50"/>
+    <w:lsdException w:name="Grid Table 6 Colorful" w:uiPriority="51"/>
+    <w:lsdException w:name="Grid Table 7 Colorful" w:uiPriority="52"/>
+    <w:lsdException w:name="Grid Table 1 Light Accent 1" w:uiPriority="46"/>
+    <w:lsdException w:name="Grid Table 2 Accent 1" w:uiPriority="47"/>
+    <w:lsdException w:name="Grid Table 3 Accent 1" w:uiPriority="48"/>
+    <w:lsdException w:name="Grid Table 4 Accent 1" w:uiPriority="49"/>
+    <w:lsdException w:name="Grid Table 5 Dark Accent 1" w:uiPriority="50"/>
+    <w:lsdException w:name="Grid Table 6 Colorful Accent 1" w:uiPriority="51"/>
+    <w:lsdException w:name="Grid Table 7 Colorful Accent 1" w:uiPriority="52"/>
+    <w:lsdException w:name="Grid Table 1 Light Accent 2" w:uiPriority="46"/>
+    <w:lsdException w:name="Grid Table 2 Accent 2" w:uiPriority="47"/>
+    <w:lsdException w:name="Grid Table 3 Accent 2" w:uiPriority="48"/>
+    <w:lsdException w:name="Grid Table 4 Accent 2" w:uiPriority="49"/>
+    <w:lsdException w:name="Grid Table 5 Dark Accent 2" w:uiPriority="50"/>
+    <w:lsdException w:name="Grid Table 6 Colorful Accent 2" w:uiPriority="51"/>
+    <w:lsdException w:name="Grid Table 7 Colorful Accent 2" w:uiPriority="52"/>
+    <w:lsdException w:name="Grid Table 1 Light Accent 3" w:uiPriority="46"/>
+    <w:lsdException w:name="Grid Table 2 Accent 3" w:uiPriority="47"/>
+    <w:lsdException w:name="Grid Table 3 Accent 3" w:uiPriority="48"/>
+    <w:lsdException w:name="Grid Table 4 Accent 3" w:uiPriority="49"/>
+    <w:lsdException w:name="Grid Table 5 Dark Accent 3" w:uiPriority="50"/>
+    <w:lsdException w:name="Grid Table 6 Colorful Accent 3" w:uiPriority="51"/>
+    <w:lsdException w:name="Grid Table 7 Colorful Accent 3" w:uiPriority="52"/>
+    <w:lsdException w:name="Grid Table 1 Light Accent 4" w:uiPriority="46"/>
+    <w:lsdException w:name="Grid Table 2 Accent 4" w:uiPriority="47"/>
+    <w:lsdException w:name="Grid Table 3 Accent 4" w:uiPriority="48"/>
+    <w:lsdException w:name="Grid Table 4 Accent 4" w:uiPriority="49"/>
+    <w:lsdException w:name="Grid Table 5 Dark Accent 4" w:uiPriority="50"/>
+    <w:lsdException w:name="Grid Table 6 Colorful Accent 4" w:uiPriority="51"/>
+    <w:lsdException w:name="Grid Table 7 Colorful Accent 4" w:uiPriority="52"/>
+    <w:lsdException w:name="Grid Table 1 Light Accent 5" w:uiPriority="46"/>
+    <w:lsdException w:name="Grid Table 2 Accent 5" w:uiPriority="47"/>
+    <w:lsdException w:name="Grid Table 3 Accent 5" w:uiPriority="48"/>
+    <w:lsdException w:name="Grid Table 4 Accent 5" w:uiPriority="49"/>
+    <w:lsdException w:name="Grid Table 5 Dark Accent 5" w:uiPriority="50"/>
+    <w:lsdException w:name="Grid Table 6 Colorful Accent 5" w:uiPriority="51"/>
+    <w:lsdException w:name="Grid Table 7 Colorful Accent 5" w:uiPriority="52"/>
+    <w:lsdException w:name="Grid Table 1 Light Accent 6" w:uiPriority="46"/>
+    <w:lsdException w:name="Grid Table 2 Accent 6" w:uiPriority="47"/>
+    <w:lsdException w:name="Grid Table 3 Accent 6" w:uiPriority="48"/>
+    <w:lsdException w:name="Grid Table 4 Accent 6" w:uiPriority="49"/>
+    <w:lsdException w:name="Grid Table 5 Dark Accent 6" w:uiPriority="50"/>
+    <w:lsdException w:name="Grid Table 6 Colorful Accent 6" w:uiPriority="51"/>
+    <w:lsdException w:name="Grid Table 7 Colorful Accent 6" w:uiPriority="52"/>
+    <w:lsdException w:name="List Table 1 Light" w:uiPriority="46"/>
+    <w:lsdException w:name="List Table 2" w:uiPriority="47"/>
+    <w:lsdException w:name="List Table 3" w:uiPriority="48"/>
+    <w:lsdException w:name="List Table 4" w:uiPriority="49"/>
+    <w:lsdException w:name="List Table 5 Dark" w:uiPriority="50"/>
+    <w:lsdException w:name="List Table 6 Colorful" w:uiPriority="51"/>
+    <w:lsdException w:name="List Table 7 Colorful" w:uiPriority="52"/>
+    <w:lsdException w:name="List Table 1 Light Accent 1" w:uiPriority="46"/>
+    <w:lsdException w:name="List Table 2 Accent 1" w:uiPriority="47"/>
+    <w:lsdException w:name="List Table 3 Accent 1" w:uiPriority="48"/>
+    <w:lsdException w:name="List Table 4 Accent 1" w:uiPriority="49"/>
+    <w:lsdException w:name="List Table 5 Dark Accent 1" w:uiPriority="50"/>
+    <w:lsdException w:name="List Table 6 Colorful Accent 1" w:uiPriority="51"/>
+    <w:lsdException w:name="List Table 7 Colorful Accent 1" w:uiPriority="52"/>
+    <w:lsdException w:name="List Table 1 Light Accent 2" w:uiPriority="46"/>
+    <w:lsdException w:name="List Table 2 Accent 2" w:uiPriority="47"/>
+    <w:lsdException w:name="List Table 3 Accent 2" w:uiPriority="48"/>
+    <w:lsdException w:name="List Table 4 Accent 2" w:uiPriority="49"/>
+    <w:lsdException w:name="List Table 5 Dark Accent 2" w:uiPriority="50"/>
+    <w:lsdException w:name="List Table 6 Colorful Accent 2" w:uiPriority="51"/>
+    <w:lsdException w:name="List Table 7 Colorful Accent 2" w:uiPriority="52"/>
+    <w:lsdException w:name="List Table 1 Light Accent 3" w:uiPriority="46"/>
+    <w:lsdException w:name="List Table 2 Accent 3" w:uiPriority="47"/>
+    <w:lsdException w:name="List Table 3 Accent 3" w:uiPriority="48"/>
+    <w:lsdException w:name="List Table 4 Accent 3" w:uiPriority="49"/>
+    <w:lsdException w:name="List Table 5 Dark Accent 3" w:uiPriority="50"/>
+    <w:lsdException w:name="List Table 6 Colorful Accent 3" w:uiPriority="51"/>
+    <w:lsdException w:name="List Table 7 Colorful Accent 3" w:uiPriority="52"/>
+    <w:lsdException w:name="List Table 1 Light Accent 4" w:uiPriority="46"/>
+    <w:lsdException w:name="List Table 2 Accent 4" w:uiPriority="47"/>
+    <w:lsdException w:name="List Table 3 Accent 4" w:uiPriority="48"/>
+    <w:lsdException w:name="List Table 4 Accent 4" w:uiPriority="49"/>
+    <w:lsdException w:name="List Table 5 Dark Accent 4" w:uiPriority="50"/>
+    <w:lsdException w:name="List Table 6 Colorful Accent 4" w:uiPriority="51"/>
+    <w:lsdException w:name="List Table 7 Colorful Accent 4" w:uiPriority="52"/>
+    <w:lsdException w:name="List Table 1 Light Accent 5" w:uiPriority="46"/>
+    <w:lsdException w:name="List Table 2 Accent 5" w:uiPriority="47"/>
+    <w:lsdException w:name="List Table 3 Accent 5" w:uiPriority="48"/>
+    <w:lsdException w:name="List Table 4 Accent 5" w:uiPriority="49"/>
+    <w:lsdException w:name="List Table 5 Dark Accent 5" w:uiPriority="50"/>
+    <w:lsdException w:name="List Table 6 Colorful Accent 5" w:uiPriority="51"/>
+    <w:lsdException w:name="List Table 7 Colorful Accent 5" w:uiPriority="52"/>
+    <w:lsdException w:name="List Table 1 Light Accent 6" w:uiPriority="46"/>
+    <w:lsdException w:name="List Table 2 Accent 6" w:uiPriority="47"/>
+    <w:lsdException w:name="List Table 3 Accent 6" w:uiPriority="48"/>
+    <w:lsdException w:name="List Table 4 Accent 6" w:uiPriority="49"/>
+    <w:lsdException w:name="List Table 5 Dark Accent 6" w:uiPriority="50"/>
+    <w:lsdException w:name="List Table 6 Colorful Accent 6" w:uiPriority="51"/>
+    <w:lsdException w:name="List Table 7 Colorful Accent 6" w:uiPriority="52"/>
+    <w:lsdException w:name="Mention" w:semiHidden="1" w:unhideWhenUsed="1"/>
+    <w:lsdException w:name="Smart Hyperlink" w:semiHidden="1" w:unhideWhenUsed="1"/>
+    <w:lsdException w:name="Hashtag" w:semiHidden="1" w:unhideWhenUsed="1"/>
+    <w:lsdException w:name="Unresolved Mention" w:semiHidden="1" w:unhideWhenUsed="1"/>
+    <w:lsdException w:name="Smart Link" w:semiHidden="1" w:unhideWhenUsed="1"/>
   </w:latentStyles>
   <w:style w:type="paragraph" w:default="1" w:styleId="Normal">
     <w:name w:val="Normal"/>
@@ -4027,7 +6262,6 @@
     <w:uiPriority w:val="99"/>
     <w:semiHidden/>
     <w:unhideWhenUsed/>
-    <w:qFormat/>
     <w:tblPr>
       <w:tblInd w:w="0" w:type="dxa"/>
       <w:tblCellMar>
@@ -4319,7 +6553,6 @@
       <w:szCs w:val="24"/>
     </w:rPr>
     <w:tblPr>
-      <w:tblInd w:w="0" w:type="dxa"/>
       <w:tblBorders>
         <w:top w:val="single" w:sz="4" w:space="0" w:color="auto"/>
         <w:left w:val="single" w:sz="4" w:space="0" w:color="auto"/>
@@ -4328,12 +6561,6 @@
         <w:insideH w:val="single" w:sz="4" w:space="0" w:color="auto"/>
         <w:insideV w:val="single" w:sz="4" w:space="0" w:color="auto"/>
       </w:tblBorders>
-      <w:tblCellMar>
-        <w:top w:w="0" w:type="dxa"/>
-        <w:left w:w="108" w:type="dxa"/>
-        <w:bottom w:w="0" w:type="dxa"/>
-        <w:right w:w="108" w:type="dxa"/>
-      </w:tblCellMar>
     </w:tblPr>
   </w:style>
   <w:style w:type="character" w:customStyle="1" w:styleId="citation-15">
@@ -4417,321 +6644,6 @@
     </w:rPr>
   </w:style>
 </w:styles>
-</file>
-
-<file path=word/glossary/document.xml><?xml version="1.0" encoding="utf-8"?>
-<w:glossaryDocument xmlns:ve="http://schemas.openxmlformats.org/markup-compatibility/2006" xmlns:o="urn:schemas-microsoft-com:office:office" xmlns:r="http://schemas.openxmlformats.org/officeDocument/2006/relationships" xmlns:m="http://schemas.openxmlformats.org/officeDocument/2006/math" xmlns:v="urn:schemas-microsoft-com:vml" xmlns:wp="http://schemas.openxmlformats.org/drawingml/2006/wordprocessingDrawing" xmlns:w10="urn:schemas-microsoft-com:office:word" xmlns:w="http://schemas.openxmlformats.org/wordprocessingml/2006/main" xmlns:wne="http://schemas.microsoft.com/office/word/2006/wordml">
-  <w:docParts/>
-</w:glossaryDocument>
-</file>
-
-<file path=word/glossary/fontTable.xml><?xml version="1.0" encoding="utf-8"?>
-<w:fonts xmlns:r="http://schemas.openxmlformats.org/officeDocument/2006/relationships" xmlns:w="http://schemas.openxmlformats.org/wordprocessingml/2006/main">
-  <w:font w:name="Symbol">
-    <w:panose1 w:val="05050102010706020507"/>
-    <w:charset w:val="02"/>
-    <w:family w:val="roman"/>
-    <w:pitch w:val="variable"/>
-    <w:sig w:usb0="00000000" w:usb1="10000000" w:usb2="00000000" w:usb3="00000000" w:csb0="80000000" w:csb1="00000000"/>
-  </w:font>
-  <w:font w:name="Times New Roman">
-    <w:panose1 w:val="02020603050405020304"/>
-    <w:charset w:val="00"/>
-    <w:family w:val="roman"/>
-    <w:pitch w:val="variable"/>
-    <w:sig w:usb0="E0002EFF" w:usb1="C000785B" w:usb2="00000009" w:usb3="00000000" w:csb0="000001FF" w:csb1="00000000"/>
-  </w:font>
-  <w:font w:name="Courier New">
-    <w:panose1 w:val="02070309020205020404"/>
-    <w:charset w:val="00"/>
-    <w:family w:val="modern"/>
-    <w:pitch w:val="fixed"/>
-    <w:sig w:usb0="E0002EFF" w:usb1="C0007843" w:usb2="00000009" w:usb3="00000000" w:csb0="000001FF" w:csb1="00000000"/>
-  </w:font>
-  <w:font w:name="Wingdings">
-    <w:panose1 w:val="05000000000000000000"/>
-    <w:charset w:val="02"/>
-    <w:family w:val="auto"/>
-    <w:pitch w:val="variable"/>
-    <w:sig w:usb0="00000000" w:usb1="10000000" w:usb2="00000000" w:usb3="00000000" w:csb0="80000000" w:csb1="00000000"/>
-  </w:font>
-  <w:font w:name="Calibri">
-    <w:panose1 w:val="020F0502020204030204"/>
-    <w:charset w:val="00"/>
-    <w:family w:val="swiss"/>
-    <w:pitch w:val="variable"/>
-    <w:sig w:usb0="E4002EFF" w:usb1="C200247B" w:usb2="00000009" w:usb3="00000000" w:csb0="000001FF" w:csb1="00000000"/>
-  </w:font>
-  <w:font w:name="Arial">
-    <w:panose1 w:val="020B0604020202020204"/>
-    <w:charset w:val="00"/>
-    <w:family w:val="swiss"/>
-    <w:pitch w:val="variable"/>
-    <w:sig w:usb0="E0002EFF" w:usb1="C000785B" w:usb2="00000009" w:usb3="00000000" w:csb0="000001FF" w:csb1="00000000"/>
-  </w:font>
-  <w:font w:name="Tahoma">
-    <w:panose1 w:val="020B0604030504040204"/>
-    <w:charset w:val="00"/>
-    <w:family w:val="swiss"/>
-    <w:pitch w:val="variable"/>
-    <w:sig w:usb0="E1002EFF" w:usb1="C000605B" w:usb2="00000029" w:usb3="00000000" w:csb0="000101FF" w:csb1="00000000"/>
-  </w:font>
-  <w:font w:name="Cambria">
-    <w:panose1 w:val="02040503050406030204"/>
-    <w:charset w:val="00"/>
-    <w:family w:val="roman"/>
-    <w:pitch w:val="variable"/>
-    <w:sig w:usb0="E00006FF" w:usb1="420024FF" w:usb2="02000000" w:usb3="00000000" w:csb0="0000019F" w:csb1="00000000"/>
-  </w:font>
-  <w:font w:name="Cambria Math">
-    <w:panose1 w:val="02040503050406030204"/>
-    <w:charset w:val="00"/>
-    <w:family w:val="roman"/>
-    <w:pitch w:val="variable"/>
-    <w:sig w:usb0="E00006FF" w:usb1="420024FF" w:usb2="02000000" w:usb3="00000000" w:csb0="0000019F" w:csb1="00000000"/>
-  </w:font>
-</w:fonts>
-</file>
-
-<file path=word/glossary/settings.xml><?xml version="1.0" encoding="utf-8"?>
-<w:settings xmlns:o="urn:schemas-microsoft-com:office:office" xmlns:r="http://schemas.openxmlformats.org/officeDocument/2006/relationships" xmlns:m="http://schemas.openxmlformats.org/officeDocument/2006/math" xmlns:v="urn:schemas-microsoft-com:vml" xmlns:w10="urn:schemas-microsoft-com:office:word" xmlns:w="http://schemas.openxmlformats.org/wordprocessingml/2006/main" xmlns:sl="http://schemas.openxmlformats.org/schemaLibrary/2006/main">
-  <w:view w:val="normal"/>
-  <w:defaultTabStop w:val="708"/>
-  <w:hyphenationZone w:val="425"/>
-  <w:characterSpacingControl w:val="doNotCompress"/>
-  <w:compat>
-    <w:useFELayout/>
-  </w:compat>
-  <w:rsids>
-    <w:rsidRoot w:val="008833D6"/>
-    <w:rsid w:val="005F74D5"/>
-    <w:rsid w:val="008833D6"/>
-  </w:rsids>
-  <m:mathPr>
-    <m:mathFont m:val="Cambria Math"/>
-    <m:brkBin m:val="before"/>
-    <m:brkBinSub m:val="--"/>
-    <m:smallFrac m:val="off"/>
-    <m:dispDef/>
-    <m:lMargin m:val="0"/>
-    <m:rMargin m:val="0"/>
-    <m:defJc m:val="centerGroup"/>
-    <m:wrapIndent m:val="1440"/>
-    <m:intLim m:val="subSup"/>
-    <m:naryLim m:val="undOvr"/>
-  </m:mathPr>
-  <w:themeFontLang w:val="pt-BR"/>
-  <w:clrSchemeMapping w:bg1="light1" w:t1="dark1" w:bg2="light2" w:t2="dark2" w:accent1="accent1" w:accent2="accent2" w:accent3="accent3" w:accent4="accent4" w:accent5="accent5" w:accent6="accent6" w:hyperlink="hyperlink" w:followedHyperlink="followedHyperlink"/>
-  <w:decimalSymbol w:val=","/>
-  <w:listSeparator w:val=";"/>
-</w:settings>
-</file>
-
-<file path=word/glossary/styles.xml><?xml version="1.0" encoding="utf-8"?>
-<w:styles xmlns:r="http://schemas.openxmlformats.org/officeDocument/2006/relationships" xmlns:w="http://schemas.openxmlformats.org/wordprocessingml/2006/main">
-  <w:docDefaults>
-    <w:rPrDefault>
-      <w:rPr>
-        <w:rFonts w:asciiTheme="minorHAnsi" w:eastAsiaTheme="minorEastAsia" w:hAnsiTheme="minorHAnsi" w:cstheme="minorBidi"/>
-        <w:sz w:val="22"/>
-        <w:szCs w:val="22"/>
-        <w:lang w:val="pt-BR" w:eastAsia="pt-BR" w:bidi="ar-SA"/>
-      </w:rPr>
-    </w:rPrDefault>
-    <w:pPrDefault>
-      <w:pPr>
-        <w:spacing w:after="200" w:line="276" w:lineRule="auto"/>
-      </w:pPr>
-    </w:pPrDefault>
-  </w:docDefaults>
-  <w:latentStyles w:defLockedState="0" w:defUIPriority="99" w:defSemiHidden="1" w:defUnhideWhenUsed="1" w:defQFormat="0" w:count="267">
-    <w:lsdException w:name="Normal" w:semiHidden="0" w:uiPriority="0" w:unhideWhenUsed="0" w:qFormat="1"/>
-    <w:lsdException w:name="heading 1" w:semiHidden="0" w:uiPriority="9" w:unhideWhenUsed="0" w:qFormat="1"/>
-    <w:lsdException w:name="heading 2" w:uiPriority="9" w:qFormat="1"/>
-    <w:lsdException w:name="heading 3" w:uiPriority="9" w:qFormat="1"/>
-    <w:lsdException w:name="heading 4" w:uiPriority="9" w:qFormat="1"/>
-    <w:lsdException w:name="heading 5" w:uiPriority="9" w:qFormat="1"/>
-    <w:lsdException w:name="heading 6" w:uiPriority="9" w:qFormat="1"/>
-    <w:lsdException w:name="heading 7" w:uiPriority="9" w:qFormat="1"/>
-    <w:lsdException w:name="heading 8" w:uiPriority="9" w:qFormat="1"/>
-    <w:lsdException w:name="heading 9" w:uiPriority="9" w:qFormat="1"/>
-    <w:lsdException w:name="toc 1" w:uiPriority="39"/>
-    <w:lsdException w:name="toc 2" w:uiPriority="39"/>
-    <w:lsdException w:name="toc 3" w:uiPriority="39"/>
-    <w:lsdException w:name="toc 4" w:uiPriority="39"/>
-    <w:lsdException w:name="toc 5" w:uiPriority="39"/>
-    <w:lsdException w:name="toc 6" w:uiPriority="39"/>
-    <w:lsdException w:name="toc 7" w:uiPriority="39"/>
-    <w:lsdException w:name="toc 8" w:uiPriority="39"/>
-    <w:lsdException w:name="toc 9" w:uiPriority="39"/>
-    <w:lsdException w:name="caption" w:uiPriority="35" w:qFormat="1"/>
-    <w:lsdException w:name="Title" w:semiHidden="0" w:uiPriority="10" w:unhideWhenUsed="0" w:qFormat="1"/>
-    <w:lsdException w:name="Default Paragraph Font" w:uiPriority="1"/>
-    <w:lsdException w:name="Subtitle" w:semiHidden="0" w:uiPriority="11" w:unhideWhenUsed="0" w:qFormat="1"/>
-    <w:lsdException w:name="Strong" w:semiHidden="0" w:uiPriority="22" w:unhideWhenUsed="0" w:qFormat="1"/>
-    <w:lsdException w:name="Emphasis" w:semiHidden="0" w:uiPriority="20" w:unhideWhenUsed="0" w:qFormat="1"/>
-    <w:lsdException w:name="Table Grid" w:semiHidden="0" w:uiPriority="59" w:unhideWhenUsed="0"/>
-    <w:lsdException w:name="Placeholder Text" w:unhideWhenUsed="0"/>
-    <w:lsdException w:name="No Spacing" w:semiHidden="0" w:uiPriority="1" w:unhideWhenUsed="0" w:qFormat="1"/>
-    <w:lsdException w:name="Light Shading" w:semiHidden="0" w:uiPriority="60" w:unhideWhenUsed="0"/>
-    <w:lsdException w:name="Light List" w:semiHidden="0" w:uiPriority="61" w:unhideWhenUsed="0"/>
-    <w:lsdException w:name="Light Grid" w:semiHidden="0" w:uiPriority="62" w:unhideWhenUsed="0"/>
-    <w:lsdException w:name="Medium Shading 1" w:semiHidden="0" w:uiPriority="63" w:unhideWhenUsed="0"/>
-    <w:lsdException w:name="Medium Shading 2" w:semiHidden="0" w:uiPriority="64" w:unhideWhenUsed="0"/>
-    <w:lsdException w:name="Medium List 1" w:semiHidden="0" w:uiPriority="65" w:unhideWhenUsed="0"/>
-    <w:lsdException w:name="Medium List 2" w:semiHidden="0" w:uiPriority="66" w:unhideWhenUsed="0"/>
-    <w:lsdException w:name="Medium Grid 1" w:semiHidden="0" w:uiPriority="67" w:unhideWhenUsed="0"/>
-    <w:lsdException w:name="Medium Grid 2" w:semiHidden="0" w:uiPriority="68" w:unhideWhenUsed="0"/>
-    <w:lsdException w:name="Medium Grid 3" w:semiHidden="0" w:uiPriority="69" w:unhideWhenUsed="0"/>
-    <w:lsdException w:name="Dark List" w:semiHidden="0" w:uiPriority="70" w:unhideWhenUsed="0"/>
-    <w:lsdException w:name="Colorful Shading" w:semiHidden="0" w:uiPriority="71" w:unhideWhenUsed="0"/>
-    <w:lsdException w:name="Colorful List" w:semiHidden="0" w:uiPriority="72" w:unhideWhenUsed="0"/>
-    <w:lsdException w:name="Colorful Grid" w:semiHidden="0" w:uiPriority="73" w:unhideWhenUsed="0"/>
-    <w:lsdException w:name="Light Shading Accent 1" w:semiHidden="0" w:uiPriority="60" w:unhideWhenUsed="0"/>
-    <w:lsdException w:name="Light List Accent 1" w:semiHidden="0" w:uiPriority="61" w:unhideWhenUsed="0"/>
-    <w:lsdException w:name="Light Grid Accent 1" w:semiHidden="0" w:uiPriority="62" w:unhideWhenUsed="0"/>
-    <w:lsdException w:name="Medium Shading 1 Accent 1" w:semiHidden="0" w:uiPriority="63" w:unhideWhenUsed="0"/>
-    <w:lsdException w:name="Medium Shading 2 Accent 1" w:semiHidden="0" w:uiPriority="64" w:unhideWhenUsed="0"/>
-    <w:lsdException w:name="Medium List 1 Accent 1" w:semiHidden="0" w:uiPriority="65" w:unhideWhenUsed="0"/>
-    <w:lsdException w:name="Revision" w:unhideWhenUsed="0"/>
-    <w:lsdException w:name="List Paragraph" w:semiHidden="0" w:uiPriority="34" w:unhideWhenUsed="0" w:qFormat="1"/>
-    <w:lsdException w:name="Quote" w:semiHidden="0" w:uiPriority="29" w:unhideWhenUsed="0" w:qFormat="1"/>
-    <w:lsdException w:name="Intense Quote" w:semiHidden="0" w:uiPriority="30" w:unhideWhenUsed="0" w:qFormat="1"/>
-    <w:lsdException w:name="Medium List 2 Accent 1" w:semiHidden="0" w:uiPriority="66" w:unhideWhenUsed="0"/>
-    <w:lsdException w:name="Medium Grid 1 Accent 1" w:semiHidden="0" w:uiPriority="67" w:unhideWhenUsed="0"/>
-    <w:lsdException w:name="Medium Grid 2 Accent 1" w:semiHidden="0" w:uiPriority="68" w:unhideWhenUsed="0"/>
-    <w:lsdException w:name="Medium Grid 3 Accent 1" w:semiHidden="0" w:uiPriority="69" w:unhideWhenUsed="0"/>
-    <w:lsdException w:name="Dark List Accent 1" w:semiHidden="0" w:uiPriority="70" w:unhideWhenUsed="0"/>
-    <w:lsdException w:name="Colorful Shading Accent 1" w:semiHidden="0" w:uiPriority="71" w:unhideWhenUsed="0"/>
-    <w:lsdException w:name="Colorful List Accent 1" w:semiHidden="0" w:uiPriority="72" w:unhideWhenUsed="0"/>
-    <w:lsdException w:name="Colorful Grid Accent 1" w:semiHidden="0" w:uiPriority="73" w:unhideWhenUsed="0"/>
-    <w:lsdException w:name="Light Shading Accent 2" w:semiHidden="0" w:uiPriority="60" w:unhideWhenUsed="0"/>
-    <w:lsdException w:name="Light List Accent 2" w:semiHidden="0" w:uiPriority="61" w:unhideWhenUsed="0"/>
-    <w:lsdException w:name="Light Grid Accent 2" w:semiHidden="0" w:uiPriority="62" w:unhideWhenUsed="0"/>
-    <w:lsdException w:name="Medium Shading 1 Accent 2" w:semiHidden="0" w:uiPriority="63" w:unhideWhenUsed="0"/>
-    <w:lsdException w:name="Medium Shading 2 Accent 2" w:semiHidden="0" w:uiPriority="64" w:unhideWhenUsed="0"/>
-    <w:lsdException w:name="Medium List 1 Accent 2" w:semiHidden="0" w:uiPriority="65" w:unhideWhenUsed="0"/>
-    <w:lsdException w:name="Medium List 2 Accent 2" w:semiHidden="0" w:uiPriority="66" w:unhideWhenUsed="0"/>
-    <w:lsdException w:name="Medium Grid 1 Accent 2" w:semiHidden="0" w:uiPriority="67" w:unhideWhenUsed="0"/>
-    <w:lsdException w:name="Medium Grid 2 Accent 2" w:semiHidden="0" w:uiPriority="68" w:unhideWhenUsed="0"/>
-    <w:lsdException w:name="Medium Grid 3 Accent 2" w:semiHidden="0" w:uiPriority="69" w:unhideWhenUsed="0"/>
-    <w:lsdException w:name="Dark List Accent 2" w:semiHidden="0" w:uiPriority="70" w:unhideWhenUsed="0"/>
-    <w:lsdException w:name="Colorful Shading Accent 2" w:semiHidden="0" w:uiPriority="71" w:unhideWhenUsed="0"/>
-    <w:lsdException w:name="Colorful List Accent 2" w:semiHidden="0" w:uiPriority="72" w:unhideWhenUsed="0"/>
-    <w:lsdException w:name="Colorful Grid Accent 2" w:semiHidden="0" w:uiPriority="73" w:unhideWhenUsed="0"/>
-    <w:lsdException w:name="Light Shading Accent 3" w:semiHidden="0" w:uiPriority="60" w:unhideWhenUsed="0"/>
-    <w:lsdException w:name="Light List Accent 3" w:semiHidden="0" w:uiPriority="61" w:unhideWhenUsed="0"/>
-    <w:lsdException w:name="Light Grid Accent 3" w:semiHidden="0" w:uiPriority="62" w:unhideWhenUsed="0"/>
-    <w:lsdException w:name="Medium Shading 1 Accent 3" w:semiHidden="0" w:uiPriority="63" w:unhideWhenUsed="0"/>
-    <w:lsdException w:name="Medium Shading 2 Accent 3" w:semiHidden="0" w:uiPriority="64" w:unhideWhenUsed="0"/>
-    <w:lsdException w:name="Medium List 1 Accent 3" w:semiHidden="0" w:uiPriority="65" w:unhideWhenUsed="0"/>
-    <w:lsdException w:name="Medium List 2 Accent 3" w:semiHidden="0" w:uiPriority="66" w:unhideWhenUsed="0"/>
-    <w:lsdException w:name="Medium Grid 1 Accent 3" w:semiHidden="0" w:uiPriority="67" w:unhideWhenUsed="0"/>
-    <w:lsdException w:name="Medium Grid 2 Accent 3" w:semiHidden="0" w:uiPriority="68" w:unhideWhenUsed="0"/>
-    <w:lsdException w:name="Medium Grid 3 Accent 3" w:semiHidden="0" w:uiPriority="69" w:unhideWhenUsed="0"/>
-    <w:lsdException w:name="Dark List Accent 3" w:semiHidden="0" w:uiPriority="70" w:unhideWhenUsed="0"/>
-    <w:lsdException w:name="Colorful Shading Accent 3" w:semiHidden="0" w:uiPriority="71" w:unhideWhenUsed="0"/>
-    <w:lsdException w:name="Colorful List Accent 3" w:semiHidden="0" w:uiPriority="72" w:unhideWhenUsed="0"/>
-    <w:lsdException w:name="Colorful Grid Accent 3" w:semiHidden="0" w:uiPriority="73" w:unhideWhenUsed="0"/>
-    <w:lsdException w:name="Light Shading Accent 4" w:semiHidden="0" w:uiPriority="60" w:unhideWhenUsed="0"/>
-    <w:lsdException w:name="Light List Accent 4" w:semiHidden="0" w:uiPriority="61" w:unhideWhenUsed="0"/>
-    <w:lsdException w:name="Light Grid Accent 4" w:semiHidden="0" w:uiPriority="62" w:unhideWhenUsed="0"/>
-    <w:lsdException w:name="Medium Shading 1 Accent 4" w:semiHidden="0" w:uiPriority="63" w:unhideWhenUsed="0"/>
-    <w:lsdException w:name="Medium Shading 2 Accent 4" w:semiHidden="0" w:uiPriority="64" w:unhideWhenUsed="0"/>
-    <w:lsdException w:name="Medium List 1 Accent 4" w:semiHidden="0" w:uiPriority="65" w:unhideWhenUsed="0"/>
-    <w:lsdException w:name="Medium List 2 Accent 4" w:semiHidden="0" w:uiPriority="66" w:unhideWhenUsed="0"/>
-    <w:lsdException w:name="Medium Grid 1 Accent 4" w:semiHidden="0" w:uiPriority="67" w:unhideWhenUsed="0"/>
-    <w:lsdException w:name="Medium Grid 2 Accent 4" w:semiHidden="0" w:uiPriority="68" w:unhideWhenUsed="0"/>
-    <w:lsdException w:name="Medium Grid 3 Accent 4" w:semiHidden="0" w:uiPriority="69" w:unhideWhenUsed="0"/>
-    <w:lsdException w:name="Dark List Accent 4" w:semiHidden="0" w:uiPriority="70" w:unhideWhenUsed="0"/>
-    <w:lsdException w:name="Colorful Shading Accent 4" w:semiHidden="0" w:uiPriority="71" w:unhideWhenUsed="0"/>
-    <w:lsdException w:name="Colorful List Accent 4" w:semiHidden="0" w:uiPriority="72" w:unhideWhenUsed="0"/>
-    <w:lsdException w:name="Colorful Grid Accent 4" w:semiHidden="0" w:uiPriority="73" w:unhideWhenUsed="0"/>
-    <w:lsdException w:name="Light Shading Accent 5" w:semiHidden="0" w:uiPriority="60" w:unhideWhenUsed="0"/>
-    <w:lsdException w:name="Light List Accent 5" w:semiHidden="0" w:uiPriority="61" w:unhideWhenUsed="0"/>
-    <w:lsdException w:name="Light Grid Accent 5" w:semiHidden="0" w:uiPriority="62" w:unhideWhenUsed="0"/>
-    <w:lsdException w:name="Medium Shading 1 Accent 5" w:semiHidden="0" w:uiPriority="63" w:unhideWhenUsed="0"/>
-    <w:lsdException w:name="Medium Shading 2 Accent 5" w:semiHidden="0" w:uiPriority="64" w:unhideWhenUsed="0"/>
-    <w:lsdException w:name="Medium List 1 Accent 5" w:semiHidden="0" w:uiPriority="65" w:unhideWhenUsed="0"/>
-    <w:lsdException w:name="Medium List 2 Accent 5" w:semiHidden="0" w:uiPriority="66" w:unhideWhenUsed="0"/>
-    <w:lsdException w:name="Medium Grid 1 Accent 5" w:semiHidden="0" w:uiPriority="67" w:unhideWhenUsed="0"/>
-    <w:lsdException w:name="Medium Grid 2 Accent 5" w:semiHidden="0" w:uiPriority="68" w:unhideWhenUsed="0"/>
-    <w:lsdException w:name="Medium Grid 3 Accent 5" w:semiHidden="0" w:uiPriority="69" w:unhideWhenUsed="0"/>
-    <w:lsdException w:name="Dark List Accent 5" w:semiHidden="0" w:uiPriority="70" w:unhideWhenUsed="0"/>
-    <w:lsdException w:name="Colorful Shading Accent 5" w:semiHidden="0" w:uiPriority="71" w:unhideWhenUsed="0"/>
-    <w:lsdException w:name="Colorful List Accent 5" w:semiHidden="0" w:uiPriority="72" w:unhideWhenUsed="0"/>
-    <w:lsdException w:name="Colorful Grid Accent 5" w:semiHidden="0" w:uiPriority="73" w:unhideWhenUsed="0"/>
-    <w:lsdException w:name="Light Shading Accent 6" w:semiHidden="0" w:uiPriority="60" w:unhideWhenUsed="0"/>
-    <w:lsdException w:name="Light List Accent 6" w:semiHidden="0" w:uiPriority="61" w:unhideWhenUsed="0"/>
-    <w:lsdException w:name="Light Grid Accent 6" w:semiHidden="0" w:uiPriority="62" w:unhideWhenUsed="0"/>
-    <w:lsdException w:name="Medium Shading 1 Accent 6" w:semiHidden="0" w:uiPriority="63" w:unhideWhenUsed="0"/>
-    <w:lsdException w:name="Medium Shading 2 Accent 6" w:semiHidden="0" w:uiPriority="64" w:unhideWhenUsed="0"/>
-    <w:lsdException w:name="Medium List 1 Accent 6" w:semiHidden="0" w:uiPriority="65" w:unhideWhenUsed="0"/>
-    <w:lsdException w:name="Medium List 2 Accent 6" w:semiHidden="0" w:uiPriority="66" w:unhideWhenUsed="0"/>
-    <w:lsdException w:name="Medium Grid 1 Accent 6" w:semiHidden="0" w:uiPriority="67" w:unhideWhenUsed="0"/>
-    <w:lsdException w:name="Medium Grid 2 Accent 6" w:semiHidden="0" w:uiPriority="68" w:unhideWhenUsed="0"/>
-    <w:lsdException w:name="Medium Grid 3 Accent 6" w:semiHidden="0" w:uiPriority="69" w:unhideWhenUsed="0"/>
-    <w:lsdException w:name="Dark List Accent 6" w:semiHidden="0" w:uiPriority="70" w:unhideWhenUsed="0"/>
-    <w:lsdException w:name="Colorful Shading Accent 6" w:semiHidden="0" w:uiPriority="71" w:unhideWhenUsed="0"/>
-    <w:lsdException w:name="Colorful List Accent 6" w:semiHidden="0" w:uiPriority="72" w:unhideWhenUsed="0"/>
-    <w:lsdException w:name="Colorful Grid Accent 6" w:semiHidden="0" w:uiPriority="73" w:unhideWhenUsed="0"/>
-    <w:lsdException w:name="Subtle Emphasis" w:semiHidden="0" w:uiPriority="19" w:unhideWhenUsed="0" w:qFormat="1"/>
-    <w:lsdException w:name="Intense Emphasis" w:semiHidden="0" w:uiPriority="21" w:unhideWhenUsed="0" w:qFormat="1"/>
-    <w:lsdException w:name="Subtle Reference" w:semiHidden="0" w:uiPriority="31" w:unhideWhenUsed="0" w:qFormat="1"/>
-    <w:lsdException w:name="Intense Reference" w:semiHidden="0" w:uiPriority="32" w:unhideWhenUsed="0" w:qFormat="1"/>
-    <w:lsdException w:name="Book Title" w:semiHidden="0" w:uiPriority="33" w:unhideWhenUsed="0" w:qFormat="1"/>
-    <w:lsdException w:name="Bibliography" w:uiPriority="37"/>
-    <w:lsdException w:name="TOC Heading" w:uiPriority="39" w:qFormat="1"/>
-  </w:latentStyles>
-  <w:style w:type="paragraph" w:default="1" w:styleId="Normal">
-    <w:name w:val="Normal"/>
-    <w:qFormat/>
-  </w:style>
-  <w:style w:type="character" w:default="1" w:styleId="Fontepargpadro">
-    <w:name w:val="Default Paragraph Font"/>
-    <w:uiPriority w:val="1"/>
-    <w:semiHidden/>
-    <w:unhideWhenUsed/>
-  </w:style>
-  <w:style w:type="table" w:default="1" w:styleId="Tabelanormal">
-    <w:name w:val="Normal Table"/>
-    <w:uiPriority w:val="99"/>
-    <w:semiHidden/>
-    <w:unhideWhenUsed/>
-    <w:qFormat/>
-    <w:tblPr>
-      <w:tblInd w:w="0" w:type="dxa"/>
-      <w:tblCellMar>
-        <w:top w:w="0" w:type="dxa"/>
-        <w:left w:w="108" w:type="dxa"/>
-        <w:bottom w:w="0" w:type="dxa"/>
-        <w:right w:w="108" w:type="dxa"/>
-      </w:tblCellMar>
-    </w:tblPr>
-  </w:style>
-  <w:style w:type="numbering" w:default="1" w:styleId="Semlista">
-    <w:name w:val="No List"/>
-    <w:uiPriority w:val="99"/>
-    <w:semiHidden/>
-    <w:unhideWhenUsed/>
-  </w:style>
-  <w:style w:type="character" w:styleId="TextodoEspaoReservado">
-    <w:name w:val="Placeholder Text"/>
-    <w:basedOn w:val="Fontepargpadro"/>
-    <w:uiPriority w:val="99"/>
-    <w:semiHidden/>
-    <w:rsid w:val="008833D6"/>
-    <w:rPr>
-      <w:color w:val="808080"/>
-    </w:rPr>
-  </w:style>
-</w:styles>
-</file>
-
-<file path=word/glossary/webSettings.xml><?xml version="1.0" encoding="utf-8"?>
-<w:webSettings xmlns:r="http://schemas.openxmlformats.org/officeDocument/2006/relationships" xmlns:w="http://schemas.openxmlformats.org/wordprocessingml/2006/main">
-  <w:optimizeForBrowser/>
-</w:webSettings>
 </file>
 
 <file path=word/theme/theme1.xml><?xml version="1.0" encoding="utf-8"?>

</xml_diff>